<commit_message>
docs(handoff): document business caps (30 profesionales, 50 centros, etc.)
Add to the handoff Word doc a consolidated "Reglas de negocio
(caps y umbrales)" table listing every magic number with its
file:line location and what it controls:

- 30 profesionales / 50 centros total displayable (api/providers.js)
- 15 top especialidades nacionales
- 20 chips otros médicos en provincia, 10 en centro
- 4 especialidades visibles por centro
- concurrencia de los CLI scripts
- TTLs de cache CDN

Also explain the rationale: ASISA's backend can return huge lists,
caps keep pages indexable and force the user to refine. The tab
labels reflect the capped count to not mislead about navegable depth.

Co-Authored-By: Claude Opus 4.7 <noreply@anthropic.com>
</commit_message>
<xml_diff>
--- a/docs/traspaso-conocimiento.docx
+++ b/docs/traspaso-conocimiento.docx
@@ -3528,6 +3528,270 @@
       </w:r>
     </w:p>
     <w:p>
+      <w:r>
+        <w:rPr>
+          <w:b/>
+          <w:i w:val="0"/>
+        </w:rPr>
+        <w:t>Reglas de negocio del listado paginado (caps):</w:t>
+      </w:r>
+    </w:p>
+    <w:tbl>
+      <w:tblPr>
+        <w:tblStyle w:val="LightGrid-Accent1"/>
+        <w:tblW w:type="auto" w:w="0"/>
+        <w:tblLook w:firstColumn="1" w:firstRow="1" w:lastColumn="0" w:lastRow="0" w:noHBand="0" w:noVBand="1" w:val="04A0"/>
+      </w:tblPr>
+      <w:tblGrid>
+        <w:gridCol w:w="2160"/>
+        <w:gridCol w:w="2160"/>
+        <w:gridCol w:w="2160"/>
+        <w:gridCol w:w="2160"/>
+      </w:tblGrid>
+      <w:tr>
+        <w:tc>
+          <w:tcPr>
+            <w:tcW w:type="dxa" w:w="2592"/>
+          </w:tcPr>
+          <w:p>
+            <w:r>
+              <w:rPr>
+                <w:b/>
+              </w:rPr>
+              <w:t>Parámetro</w:t>
+            </w:r>
+          </w:p>
+        </w:tc>
+        <w:tc>
+          <w:tcPr>
+            <w:tcW w:type="dxa" w:w="1008"/>
+          </w:tcPr>
+          <w:p>
+            <w:r>
+              <w:rPr>
+                <w:b/>
+              </w:rPr>
+              <w:t>Valor</w:t>
+            </w:r>
+          </w:p>
+        </w:tc>
+        <w:tc>
+          <w:tcPr>
+            <w:tcW w:type="dxa" w:w="2016"/>
+          </w:tcPr>
+          <w:p>
+            <w:r>
+              <w:rPr>
+                <w:b/>
+              </w:rPr>
+              <w:t>Definido en</w:t>
+            </w:r>
+          </w:p>
+        </w:tc>
+        <w:tc>
+          <w:tcPr>
+            <w:tcW w:type="dxa" w:w="3744"/>
+          </w:tcPr>
+          <w:p>
+            <w:r>
+              <w:rPr>
+                <w:b/>
+              </w:rPr>
+              <w:t>Por qué</w:t>
+            </w:r>
+          </w:p>
+        </w:tc>
+      </w:tr>
+      <w:tr>
+        <w:tc>
+          <w:tcPr>
+            <w:tcW w:type="dxa" w:w="2592"/>
+          </w:tcPr>
+          <w:p>
+            <w:r>
+              <w:t>DEFAULT_LIMIT</w:t>
+            </w:r>
+          </w:p>
+        </w:tc>
+        <w:tc>
+          <w:tcPr>
+            <w:tcW w:type="dxa" w:w="1008"/>
+          </w:tcPr>
+          <w:p>
+            <w:r>
+              <w:t>10</w:t>
+            </w:r>
+          </w:p>
+        </w:tc>
+        <w:tc>
+          <w:tcPr>
+            <w:tcW w:type="dxa" w:w="2016"/>
+          </w:tcPr>
+          <w:p>
+            <w:r>
+              <w:t>api/providers.js:4</w:t>
+            </w:r>
+          </w:p>
+        </w:tc>
+        <w:tc>
+          <w:tcPr>
+            <w:tcW w:type="dxa" w:w="3744"/>
+          </w:tcPr>
+          <w:p>
+            <w:r>
+              <w:t>Tamaño de página por defecto cuando el bloque no pasa limit explícito.</w:t>
+            </w:r>
+          </w:p>
+        </w:tc>
+      </w:tr>
+      <w:tr>
+        <w:tc>
+          <w:tcPr>
+            <w:tcW w:type="dxa" w:w="2592"/>
+          </w:tcPr>
+          <w:p>
+            <w:r>
+              <w:t>MAX_LIMIT</w:t>
+            </w:r>
+          </w:p>
+        </w:tc>
+        <w:tc>
+          <w:tcPr>
+            <w:tcW w:type="dxa" w:w="1008"/>
+          </w:tcPr>
+          <w:p>
+            <w:r>
+              <w:t>50</w:t>
+            </w:r>
+          </w:p>
+        </w:tc>
+        <w:tc>
+          <w:tcPr>
+            <w:tcW w:type="dxa" w:w="2016"/>
+          </w:tcPr>
+          <w:p>
+            <w:r>
+              <w:t>api/providers.js:5</w:t>
+            </w:r>
+          </w:p>
+        </w:tc>
+        <w:tc>
+          <w:tcPr>
+            <w:tcW w:type="dxa" w:w="3744"/>
+          </w:tcPr>
+          <w:p>
+            <w:r>
+              <w:t>Tope al limit que un cliente puede pedir en una sola request (evita XHR enormes).</w:t>
+            </w:r>
+          </w:p>
+        </w:tc>
+      </w:tr>
+      <w:tr>
+        <w:tc>
+          <w:tcPr>
+            <w:tcW w:type="dxa" w:w="2592"/>
+          </w:tcPr>
+          <w:p>
+            <w:r>
+              <w:t>MAX_TOTAL_BY_TAB.professionals</w:t>
+            </w:r>
+          </w:p>
+        </w:tc>
+        <w:tc>
+          <w:tcPr>
+            <w:tcW w:type="dxa" w:w="1008"/>
+          </w:tcPr>
+          <w:p>
+            <w:r>
+              <w:t>30</w:t>
+            </w:r>
+          </w:p>
+        </w:tc>
+        <w:tc>
+          <w:tcPr>
+            <w:tcW w:type="dxa" w:w="2016"/>
+          </w:tcPr>
+          <w:p>
+            <w:r>
+              <w:t>api/providers.js:6</w:t>
+            </w:r>
+          </w:p>
+        </w:tc>
+        <w:tc>
+          <w:tcPr>
+            <w:tcW w:type="dxa" w:w="3744"/>
+          </w:tcPr>
+          <w:p>
+            <w:r>
+              <w:t>TOTAL de profesionales mostrables en el cuadro (≈ 3 páginas de 10). El backend trunca la lista a 30 antes de paginar — el resto NO es alcanzable navegando.</w:t>
+            </w:r>
+          </w:p>
+        </w:tc>
+      </w:tr>
+      <w:tr>
+        <w:tc>
+          <w:tcPr>
+            <w:tcW w:type="dxa" w:w="2592"/>
+          </w:tcPr>
+          <w:p>
+            <w:r>
+              <w:t>MAX_TOTAL_BY_TAB.centers</w:t>
+            </w:r>
+          </w:p>
+        </w:tc>
+        <w:tc>
+          <w:tcPr>
+            <w:tcW w:type="dxa" w:w="1008"/>
+          </w:tcPr>
+          <w:p>
+            <w:r>
+              <w:t>50</w:t>
+            </w:r>
+          </w:p>
+        </w:tc>
+        <w:tc>
+          <w:tcPr>
+            <w:tcW w:type="dxa" w:w="2016"/>
+          </w:tcPr>
+          <w:p>
+            <w:r>
+              <w:t>api/providers.js:6</w:t>
+            </w:r>
+          </w:p>
+        </w:tc>
+        <w:tc>
+          <w:tcPr>
+            <w:tcW w:type="dxa" w:w="3744"/>
+          </w:tcPr>
+          <w:p>
+            <w:r>
+              <w:t>TOTAL de centros mostrables (≈ 5 páginas de 10).</w:t>
+            </w:r>
+          </w:p>
+        </w:tc>
+      </w:tr>
+    </w:tbl>
+    <w:p>
+      <w:r>
+        <w:t>Justificación: el backend de ASISA puede devolver listados muy largos (cientos de médicos por provincia+especialidad). Mostrarlos todos haría la página injustificadamente larga y mal indexable. La regla de producto acuerda topes razonables (30 profesionales, 50 centros) y obliga al usuario a refinar por provincia/especialidad/centro para encontrar lo que busca. La etiqueta del tab refleja el conteo CAPADO (e.g. "Profesionales (30)") para no engañar sobre lo navegable.</w:t>
+      </w:r>
+    </w:p>
+    <w:p>
+      <w:r>
+        <w:t>Implicación en pagination: con tab=professionals y limit=10, totalPages será como máximo 3 (30/10). Con tab=centers, como máximo 5 (50/10). El bloque renderiza paginación con elipsis si hace falta, pero en la práctica nunca pasa de 5 páginas.</w:t>
+      </w:r>
+    </w:p>
+    <w:p>
+      <w:r>
+        <w:t>Si en el futuro hay que cambiar estos caps (p.ej. para SEO o por petición de marketing), es un cambio de UNA línea en api/providers.js. El frontend no asume nada del cap: respeta totalPages que viene en la respuesta.</w:t>
+      </w:r>
+    </w:p>
+    <w:p>
+      <w:r>
+        <w:t>Otros usos del endpoint: el bloque cuadro-medico-otros-medicos pide limit=50&amp;tab=professionals para extraer hasta 50 chips. Como MAX_LIMIT=50, no hay que tocar caps. Si se necesitara más, primero hay que subir MAX_LIMIT.</w:t>
+      </w:r>
+    </w:p>
+    <w:p>
       <w:pPr>
         <w:pStyle w:val="Heading4"/>
       </w:pPr>
@@ -5119,6 +5383,674 @@
         <w:t>hero: stub vacío (no implementado).</w:t>
       </w:r>
     </w:p>
+    <w:p>
+      <w:pPr>
+        <w:pStyle w:val="Heading4"/>
+      </w:pPr>
+      <w:r>
+        <w:t>Reglas de negocio consolidadas (caps y umbrales)</w:t>
+      </w:r>
+    </w:p>
+    <w:p>
+      <w:r>
+        <w:t>Esta tabla consolida todos los "magic numbers" del proyecto. Son acuerdos de producto o topes técnicos que el equipo nuevo debe conocer: tocar uno puede cambiar visiblemente la experiencia del usuario o la cobertura SEO.</w:t>
+      </w:r>
+    </w:p>
+    <w:tbl>
+      <w:tblPr>
+        <w:tblStyle w:val="LightGrid-Accent1"/>
+        <w:tblW w:type="auto" w:w="0"/>
+        <w:tblLook w:firstColumn="1" w:firstRow="1" w:lastColumn="0" w:lastRow="0" w:noHBand="0" w:noVBand="1" w:val="04A0"/>
+      </w:tblPr>
+      <w:tblGrid>
+        <w:gridCol w:w="2160"/>
+        <w:gridCol w:w="2160"/>
+        <w:gridCol w:w="2160"/>
+        <w:gridCol w:w="2160"/>
+      </w:tblGrid>
+      <w:tr>
+        <w:tc>
+          <w:tcPr>
+            <w:tcW w:type="dxa" w:w="2304"/>
+          </w:tcPr>
+          <w:p>
+            <w:r>
+              <w:rPr>
+                <w:b/>
+              </w:rPr>
+              <w:t>Cap / umbral</w:t>
+            </w:r>
+          </w:p>
+        </w:tc>
+        <w:tc>
+          <w:tcPr>
+            <w:tcW w:type="dxa" w:w="1296"/>
+          </w:tcPr>
+          <w:p>
+            <w:r>
+              <w:rPr>
+                <w:b/>
+              </w:rPr>
+              <w:t>Valor</w:t>
+            </w:r>
+          </w:p>
+        </w:tc>
+        <w:tc>
+          <w:tcPr>
+            <w:tcW w:type="dxa" w:w="2880"/>
+          </w:tcPr>
+          <w:p>
+            <w:r>
+              <w:rPr>
+                <w:b/>
+              </w:rPr>
+              <w:t>Definido en</w:t>
+            </w:r>
+          </w:p>
+        </w:tc>
+        <w:tc>
+          <w:tcPr>
+            <w:tcW w:type="dxa" w:w="2880"/>
+          </w:tcPr>
+          <w:p>
+            <w:r>
+              <w:rPr>
+                <w:b/>
+              </w:rPr>
+              <w:t>Qué controla</w:t>
+            </w:r>
+          </w:p>
+        </w:tc>
+      </w:tr>
+      <w:tr>
+        <w:tc>
+          <w:tcPr>
+            <w:tcW w:type="dxa" w:w="2304"/>
+          </w:tcPr>
+          <w:p>
+            <w:r>
+              <w:t>Tamaño de página por defecto</w:t>
+            </w:r>
+          </w:p>
+        </w:tc>
+        <w:tc>
+          <w:tcPr>
+            <w:tcW w:type="dxa" w:w="1296"/>
+          </w:tcPr>
+          <w:p>
+            <w:r>
+              <w:t>10</w:t>
+            </w:r>
+          </w:p>
+        </w:tc>
+        <w:tc>
+          <w:tcPr>
+            <w:tcW w:type="dxa" w:w="2880"/>
+          </w:tcPr>
+          <w:p>
+            <w:r>
+              <w:t>api/providers.js:4 (DEFAULT_LIMIT)</w:t>
+            </w:r>
+          </w:p>
+        </w:tc>
+        <w:tc>
+          <w:tcPr>
+            <w:tcW w:type="dxa" w:w="2880"/>
+          </w:tcPr>
+          <w:p>
+            <w:r>
+              <w:t>Resultados por página cuando el bloque no pasa limit.</w:t>
+            </w:r>
+          </w:p>
+        </w:tc>
+      </w:tr>
+      <w:tr>
+        <w:tc>
+          <w:tcPr>
+            <w:tcW w:type="dxa" w:w="2304"/>
+          </w:tcPr>
+          <w:p>
+            <w:r>
+              <w:t>Tamaño máximo de página</w:t>
+            </w:r>
+          </w:p>
+        </w:tc>
+        <w:tc>
+          <w:tcPr>
+            <w:tcW w:type="dxa" w:w="1296"/>
+          </w:tcPr>
+          <w:p>
+            <w:r>
+              <w:t>50</w:t>
+            </w:r>
+          </w:p>
+        </w:tc>
+        <w:tc>
+          <w:tcPr>
+            <w:tcW w:type="dxa" w:w="2880"/>
+          </w:tcPr>
+          <w:p>
+            <w:r>
+              <w:t>api/providers.js:5 (MAX_LIMIT)</w:t>
+            </w:r>
+          </w:p>
+        </w:tc>
+        <w:tc>
+          <w:tcPr>
+            <w:tcW w:type="dxa" w:w="2880"/>
+          </w:tcPr>
+          <w:p>
+            <w:r>
+              <w:t>Tope al limit por request. Si un cliente pide más, se trunca a 50.</w:t>
+            </w:r>
+          </w:p>
+        </w:tc>
+      </w:tr>
+      <w:tr>
+        <w:tc>
+          <w:tcPr>
+            <w:tcW w:type="dxa" w:w="2304"/>
+          </w:tcPr>
+          <w:p>
+            <w:r>
+              <w:t>Total profesionales mostrables</w:t>
+            </w:r>
+          </w:p>
+        </w:tc>
+        <w:tc>
+          <w:tcPr>
+            <w:tcW w:type="dxa" w:w="1296"/>
+          </w:tcPr>
+          <w:p>
+            <w:r>
+              <w:t>30</w:t>
+            </w:r>
+          </w:p>
+        </w:tc>
+        <w:tc>
+          <w:tcPr>
+            <w:tcW w:type="dxa" w:w="2880"/>
+          </w:tcPr>
+          <w:p>
+            <w:r>
+              <w:t>api/providers.js:6 (MAX_TOTAL_BY_TAB.professionals)</w:t>
+            </w:r>
+          </w:p>
+        </w:tc>
+        <w:tc>
+          <w:tcPr>
+            <w:tcW w:type="dxa" w:w="2880"/>
+          </w:tcPr>
+          <w:p>
+            <w:r>
+              <w:t>Tope total del listado en el tab "Profesionales" (≈ 3 páginas de 10). El backend trunca la lista antes de paginar; el resto NO es alcanzable.</w:t>
+            </w:r>
+          </w:p>
+        </w:tc>
+      </w:tr>
+      <w:tr>
+        <w:tc>
+          <w:tcPr>
+            <w:tcW w:type="dxa" w:w="2304"/>
+          </w:tcPr>
+          <w:p>
+            <w:r>
+              <w:t>Total centros mostrables</w:t>
+            </w:r>
+          </w:p>
+        </w:tc>
+        <w:tc>
+          <w:tcPr>
+            <w:tcW w:type="dxa" w:w="1296"/>
+          </w:tcPr>
+          <w:p>
+            <w:r>
+              <w:t>50</w:t>
+            </w:r>
+          </w:p>
+        </w:tc>
+        <w:tc>
+          <w:tcPr>
+            <w:tcW w:type="dxa" w:w="2880"/>
+          </w:tcPr>
+          <w:p>
+            <w:r>
+              <w:t>api/providers.js:6 (MAX_TOTAL_BY_TAB.centers)</w:t>
+            </w:r>
+          </w:p>
+        </w:tc>
+        <w:tc>
+          <w:tcPr>
+            <w:tcW w:type="dxa" w:w="2880"/>
+          </w:tcPr>
+          <w:p>
+            <w:r>
+              <w:t>Tope total en el tab "Centros médicos" (≈ 5 páginas de 10).</w:t>
+            </w:r>
+          </w:p>
+        </w:tc>
+      </w:tr>
+      <w:tr>
+        <w:tc>
+          <w:tcPr>
+            <w:tcW w:type="dxa" w:w="2304"/>
+          </w:tcPr>
+          <w:p>
+            <w:r>
+              <w:t>Top especialidades nacionales</w:t>
+            </w:r>
+          </w:p>
+        </w:tc>
+        <w:tc>
+          <w:tcPr>
+            <w:tcW w:type="dxa" w:w="1296"/>
+          </w:tcPr>
+          <w:p>
+            <w:r>
+              <w:t>15</w:t>
+            </w:r>
+          </w:p>
+        </w:tc>
+        <w:tc>
+          <w:tcPr>
+            <w:tcW w:type="dxa" w:w="2880"/>
+          </w:tcPr>
+          <w:p>
+            <w:r>
+              <w:t>blocks/cuadro-medico-otras-especialidades/cuadro-medico-otras-especialidades.js:41</w:t>
+            </w:r>
+          </w:p>
+        </w:tc>
+        <w:tc>
+          <w:tcPr>
+            <w:tcW w:type="dxa" w:w="2880"/>
+          </w:tcPr>
+          <w:p>
+            <w:r>
+              <w:t>Especialidades mostradas como chips en /cuadro-medico/e/&lt;spec&gt; (filtra kind !== "service" antes).</w:t>
+            </w:r>
+          </w:p>
+        </w:tc>
+      </w:tr>
+      <w:tr>
+        <w:tc>
+          <w:tcPr>
+            <w:tcW w:type="dxa" w:w="2304"/>
+          </w:tcPr>
+          <w:p>
+            <w:r>
+              <w:t>Otros médicos en provincia (chips)</w:t>
+            </w:r>
+          </w:p>
+        </w:tc>
+        <w:tc>
+          <w:tcPr>
+            <w:tcW w:type="dxa" w:w="1296"/>
+          </w:tcPr>
+          <w:p>
+            <w:r>
+              <w:t>20</w:t>
+            </w:r>
+          </w:p>
+        </w:tc>
+        <w:tc>
+          <w:tcPr>
+            <w:tcW w:type="dxa" w:w="2880"/>
+          </w:tcPr>
+          <w:p>
+            <w:r>
+              <w:t>blocks/cuadro-medico-otros-medicos/cuadro-medico-otros-medicos.js:78</w:t>
+            </w:r>
+          </w:p>
+        </w:tc>
+        <w:tc>
+          <w:tcPr>
+            <w:tcW w:type="dxa" w:w="2880"/>
+          </w:tcPr>
+          <w:p>
+            <w:r>
+              <w:t>Chips máximos en la lista "Otros médicos de {spec} en {provincia}" bajo la ficha de doctor.</w:t>
+            </w:r>
+          </w:p>
+        </w:tc>
+      </w:tr>
+      <w:tr>
+        <w:tc>
+          <w:tcPr>
+            <w:tcW w:type="dxa" w:w="2304"/>
+          </w:tcPr>
+          <w:p>
+            <w:r>
+              <w:t>Otros médicos en centro (chips)</w:t>
+            </w:r>
+          </w:p>
+        </w:tc>
+        <w:tc>
+          <w:tcPr>
+            <w:tcW w:type="dxa" w:w="1296"/>
+          </w:tcPr>
+          <w:p>
+            <w:r>
+              <w:t>10</w:t>
+            </w:r>
+          </w:p>
+        </w:tc>
+        <w:tc>
+          <w:tcPr>
+            <w:tcW w:type="dxa" w:w="2880"/>
+          </w:tcPr>
+          <w:p>
+            <w:r>
+              <w:t>blocks/cuadro-medico-otros-medicos/cuadro-medico-otros-medicos.js:79</w:t>
+            </w:r>
+          </w:p>
+        </w:tc>
+        <w:tc>
+          <w:tcPr>
+            <w:tcW w:type="dxa" w:w="2880"/>
+          </w:tcPr>
+          <w:p>
+            <w:r>
+              <w:t>Chips máximos en "Otros médicos de {spec} en {centro}" — solo aparece si el doctor tiene parentDescription.</w:t>
+            </w:r>
+          </w:p>
+        </w:tc>
+      </w:tr>
+      <w:tr>
+        <w:tc>
+          <w:tcPr>
+            <w:tcW w:type="dxa" w:w="2304"/>
+          </w:tcPr>
+          <w:p>
+            <w:r>
+              <w:t>Otros centros con mismas especialidades</w:t>
+            </w:r>
+          </w:p>
+        </w:tc>
+        <w:tc>
+          <w:tcPr>
+            <w:tcW w:type="dxa" w:w="1296"/>
+          </w:tcPr>
+          <w:p>
+            <w:r>
+              <w:t>— (configurable)</w:t>
+            </w:r>
+          </w:p>
+        </w:tc>
+        <w:tc>
+          <w:tcPr>
+            <w:tcW w:type="dxa" w:w="2880"/>
+          </w:tcPr>
+          <w:p>
+            <w:r>
+              <w:t>api/centro.js:141</w:t>
+            </w:r>
+          </w:p>
+        </w:tc>
+        <w:tc>
+          <w:tcPr>
+            <w:tcW w:type="dxa" w:w="2880"/>
+          </w:tcPr>
+          <w:p>
+            <w:r>
+              <w:t>Centros similares mostrados al pie de la ficha de centro. El cap se pasa como argumento a la función; revisa el código si se va a modificar.</w:t>
+            </w:r>
+          </w:p>
+        </w:tc>
+      </w:tr>
+      <w:tr>
+        <w:tc>
+          <w:tcPr>
+            <w:tcW w:type="dxa" w:w="2304"/>
+          </w:tcPr>
+          <w:p>
+            <w:r>
+              <w:t>Especialidades visibles por centro</w:t>
+            </w:r>
+          </w:p>
+        </w:tc>
+        <w:tc>
+          <w:tcPr>
+            <w:tcW w:type="dxa" w:w="1296"/>
+          </w:tcPr>
+          <w:p>
+            <w:r>
+              <w:t>4 (resto colapsadas)</w:t>
+            </w:r>
+          </w:p>
+        </w:tc>
+        <w:tc>
+          <w:tcPr>
+            <w:tcW w:type="dxa" w:w="2880"/>
+          </w:tcPr>
+          <w:p>
+            <w:r>
+              <w:t>api/centro.js:145</w:t>
+            </w:r>
+          </w:p>
+        </w:tc>
+        <w:tc>
+          <w:tcPr>
+            <w:tcW w:type="dxa" w:w="2880"/>
+          </w:tcPr>
+          <w:p>
+            <w:r>
+              <w:t>Solo las primeras 4 especialidades se muestran expandidas por defecto en el card de un centro; el resto aparecen colapsadas tras un toggle.</w:t>
+            </w:r>
+          </w:p>
+        </w:tc>
+      </w:tr>
+      <w:tr>
+        <w:tc>
+          <w:tcPr>
+            <w:tcW w:type="dxa" w:w="2304"/>
+          </w:tcPr>
+          <w:p>
+            <w:r>
+              <w:t>Concurrencia de fetch a API ASISA</w:t>
+            </w:r>
+          </w:p>
+        </w:tc>
+        <w:tc>
+          <w:tcPr>
+            <w:tcW w:type="dxa" w:w="1296"/>
+          </w:tcPr>
+          <w:p>
+            <w:r>
+              <w:t>10 (providers), 25 (provider-details)</w:t>
+            </w:r>
+          </w:p>
+        </w:tc>
+        <w:tc>
+          <w:tcPr>
+            <w:tcW w:type="dxa" w:w="2880"/>
+          </w:tcPr>
+          <w:p>
+            <w:r>
+              <w:t>generate-providers-data.mjs y generate-provider-details.mjs</w:t>
+            </w:r>
+          </w:p>
+        </w:tc>
+        <w:tc>
+          <w:tcPr>
+            <w:tcW w:type="dxa" w:w="2880"/>
+          </w:tcPr>
+          <w:p>
+            <w:r>
+              <w:t>Requests paralelas a /searchPortal y /providers/details. Bajar a 5/10 si aparecen 429.</w:t>
+            </w:r>
+          </w:p>
+        </w:tc>
+      </w:tr>
+      <w:tr>
+        <w:tc>
+          <w:tcPr>
+            <w:tcW w:type="dxa" w:w="2304"/>
+          </w:tcPr>
+          <w:p>
+            <w:r>
+              <w:t>Concurrencia de admin EDS</w:t>
+            </w:r>
+          </w:p>
+        </w:tc>
+        <w:tc>
+          <w:tcPr>
+            <w:tcW w:type="dxa" w:w="1296"/>
+          </w:tcPr>
+          <w:p>
+            <w:r>
+              <w:t>10</w:t>
+            </w:r>
+          </w:p>
+        </w:tc>
+        <w:tc>
+          <w:tcPr>
+            <w:tcW w:type="dxa" w:w="2880"/>
+          </w:tcPr>
+          <w:p>
+            <w:r>
+              <w:t>refresh-eds-pages.mjs (CONCURRENCY)</w:t>
+            </w:r>
+          </w:p>
+        </w:tc>
+        <w:tc>
+          <w:tcPr>
+            <w:tcW w:type="dxa" w:w="2880"/>
+          </w:tcPr>
+          <w:p>
+            <w:r>
+              <w:t>Requests paralelas a admin.hlx.page (preview/live/code/index). Subir podría disparar rate limits.</w:t>
+            </w:r>
+          </w:p>
+        </w:tc>
+      </w:tr>
+      <w:tr>
+        <w:tc>
+          <w:tcPr>
+            <w:tcW w:type="dxa" w:w="2304"/>
+          </w:tcPr>
+          <w:p>
+            <w:r>
+              <w:t>Concurrencia de copy AEM Author</w:t>
+            </w:r>
+          </w:p>
+        </w:tc>
+        <w:tc>
+          <w:tcPr>
+            <w:tcW w:type="dxa" w:w="1296"/>
+          </w:tcPr>
+          <w:p>
+            <w:r>
+              <w:t>5</w:t>
+            </w:r>
+          </w:p>
+        </w:tc>
+        <w:tc>
+          <w:tcPr>
+            <w:tcW w:type="dxa" w:w="2880"/>
+          </w:tcPr>
+          <w:p>
+            <w:r>
+              <w:t>create-aem-pages.mjs (CONCURRENCY)</w:t>
+            </w:r>
+          </w:p>
+        </w:tc>
+        <w:tc>
+          <w:tcPr>
+            <w:tcW w:type="dxa" w:w="2880"/>
+          </w:tcPr>
+          <w:p>
+            <w:r>
+              <w:t>Copias paralelas vía /bin/wcmcommand. Más causa OakLock collisions; menos enlentece.</w:t>
+            </w:r>
+          </w:p>
+        </w:tc>
+      </w:tr>
+      <w:tr>
+        <w:tc>
+          <w:tcPr>
+            <w:tcW w:type="dxa" w:w="2304"/>
+          </w:tcPr>
+          <w:p>
+            <w:r>
+              <w:t>Cache TTL CDN</w:t>
+            </w:r>
+          </w:p>
+        </w:tc>
+        <w:tc>
+          <w:tcPr>
+            <w:tcW w:type="dxa" w:w="1296"/>
+          </w:tcPr>
+          <w:p>
+            <w:r>
+              <w:t>s-maxage=300, stale-while-revalidate=3600</w:t>
+            </w:r>
+          </w:p>
+        </w:tc>
+        <w:tc>
+          <w:tcPr>
+            <w:tcW w:type="dxa" w:w="2880"/>
+          </w:tcPr>
+          <w:p>
+            <w:r>
+              <w:t>api/providers.js, api/doctor.js, api/centro.js (res.setHeader)</w:t>
+            </w:r>
+          </w:p>
+        </w:tc>
+        <w:tc>
+          <w:tcPr>
+            <w:tcW w:type="dxa" w:w="2880"/>
+          </w:tcPr>
+          <w:p>
+            <w:r>
+              <w:t>5 min de cache fresh + 1h de stale en el edge. Tras un update de datos, los listados pueden tardar hasta 5 min en reflejar.</w:t>
+            </w:r>
+          </w:p>
+        </w:tc>
+      </w:tr>
+      <w:tr>
+        <w:tc>
+          <w:tcPr>
+            <w:tcW w:type="dxa" w:w="2304"/>
+          </w:tcPr>
+          <w:p>
+            <w:r>
+              <w:t>Cache TTL sitemaps</w:t>
+            </w:r>
+          </w:p>
+        </w:tc>
+        <w:tc>
+          <w:tcPr>
+            <w:tcW w:type="dxa" w:w="1296"/>
+          </w:tcPr>
+          <w:p>
+            <w:r>
+              <w:t>s-maxage=86400, stale-while-revalidate=86400</w:t>
+            </w:r>
+          </w:p>
+        </w:tc>
+        <w:tc>
+          <w:tcPr>
+            <w:tcW w:type="dxa" w:w="2880"/>
+          </w:tcPr>
+          <w:p>
+            <w:r>
+              <w:t>api/sitemap.js, api/sitemap-cuadro-medico.js</w:t>
+            </w:r>
+          </w:p>
+        </w:tc>
+        <w:tc>
+          <w:tcPr>
+            <w:tcW w:type="dxa" w:w="2880"/>
+          </w:tcPr>
+          <w:p>
+            <w:r>
+              <w:t>24h de cache fresh + 24h stale para sitemaps.</w:t>
+            </w:r>
+          </w:p>
+        </w:tc>
+      </w:tr>
+    </w:tbl>
     <w:p>
       <w:pPr>
         <w:pStyle w:val="Heading4"/>

</xml_diff>

<commit_message>
docs(handoff): describe only the current state, drop "before/after" framing
Rewrite phrases that imply past changes (e.g. "los sitemaps ya NO se
montan aquí", "ya retirado", "se conservan como vía paralela",
"actualmente DESCONECTADO", "extraído originalmente") so the doc reads
as a straight description of how things work today. Add cURL examples
on the Vercel sitemap endpoints to make the description concrete.

Co-Authored-By: Claude Opus 4.7 <noreply@anthropic.com>
</commit_message>
<xml_diff>
--- a/docs/traspaso-conocimiento.docx
+++ b/docs/traspaso-conocimiento.docx
@@ -1378,7 +1378,7 @@
           </w:tcPr>
           <w:p>
             <w:r>
-              <w:t>Mountpoints. Solo monta "/" desde AEM Author (/bin/franklin.delivery/asisa-softtek/asisa-pc/main, sufijo .html). Los sitemaps ya NO se montan aquí — los genera EDS nativamente vía helix-sitemap.yaml.</w:t>
+              <w:t>Mountpoints. Monta "/" desde AEM Author (/bin/franklin.delivery/asisa-softtek/asisa-pc/main, sufijo .html). Los sitemaps se generan nativamente vía helix-sitemap.yaml.</w:t>
             </w:r>
           </w:p>
         </w:tc>
@@ -3595,7 +3595,7 @@
         <w:pStyle w:val="ListBullet"/>
       </w:pPr>
       <w:r>
-        <w:t>Consumido por: cuadro-medico-ficha-doctor, cuadro-medico-otros-medicos, cuadro-medico-spec-localizacion (ya retirado).</w:t>
+        <w:t>Consumido por: cuadro-medico-ficha-doctor y cuadro-medico-otros-medicos.</w:t>
       </w:r>
     </w:p>
     <w:p>
@@ -4292,7 +4292,7 @@
         <w:pStyle w:val="Heading4"/>
       </w:pPr>
       <w:r>
-        <w:t>Endpoints 9 y 10 · sitemaps (Vercel-only fallback)</w:t>
+        <w:t>Endpoints 9 y 10 · sitemaps en Vercel</w:t>
       </w:r>
     </w:p>
     <w:p>
@@ -4301,6 +4301,96 @@
       </w:r>
     </w:p>
     <w:p>
+      <w:pPr>
+        <w:pStyle w:val="Code"/>
+        <w:shd w:fill="F4F4F4" w:val="clear"/>
+      </w:pPr>
+      <w:r>
+        <w:t>curl https://asisa-pc.vercel.app/sitemap.xml</w:t>
+      </w:r>
+    </w:p>
+    <w:p>
+      <w:pPr>
+        <w:pStyle w:val="Code"/>
+        <w:shd w:fill="F4F4F4" w:val="clear"/>
+      </w:pPr>
+      <w:r>
+        <w:t xml:space="preserve"> </w:t>
+      </w:r>
+    </w:p>
+    <w:p>
+      <w:pPr>
+        <w:pStyle w:val="Code"/>
+        <w:shd w:fill="F4F4F4" w:val="clear"/>
+      </w:pPr>
+      <w:r>
+        <w:t>Devuelve:</w:t>
+      </w:r>
+    </w:p>
+    <w:p>
+      <w:pPr>
+        <w:pStyle w:val="Code"/>
+        <w:shd w:fill="F4F4F4" w:val="clear"/>
+      </w:pPr>
+      <w:r>
+        <w:t>&lt;sitemapindex&gt;</w:t>
+      </w:r>
+    </w:p>
+    <w:p>
+      <w:pPr>
+        <w:pStyle w:val="Code"/>
+        <w:shd w:fill="F4F4F4" w:val="clear"/>
+      </w:pPr>
+      <w:r>
+        <w:t xml:space="preserve">  &lt;sitemap&gt;&lt;loc&gt;https://www.asisa.es/sitemap-cuadro-medico-provincias.xml&lt;/loc&gt;&lt;/sitemap&gt;</w:t>
+      </w:r>
+    </w:p>
+    <w:p>
+      <w:pPr>
+        <w:pStyle w:val="Code"/>
+        <w:shd w:fill="F4F4F4" w:val="clear"/>
+      </w:pPr>
+      <w:r>
+        <w:t xml:space="preserve">  &lt;sitemap&gt;&lt;loc&gt;https://www.asisa.es/sitemap-cuadro-medico-provincia-specs.xml&lt;/loc&gt;&lt;/sitemap&gt;</w:t>
+      </w:r>
+    </w:p>
+    <w:p>
+      <w:pPr>
+        <w:pStyle w:val="Code"/>
+        <w:shd w:fill="F4F4F4" w:val="clear"/>
+      </w:pPr>
+      <w:r>
+        <w:t xml:space="preserve">  &lt;sitemap&gt;&lt;loc&gt;https://www.asisa.es/sitemap-cuadro-medico-doctores.xml&lt;/loc&gt;&lt;/sitemap&gt;</w:t>
+      </w:r>
+    </w:p>
+    <w:p>
+      <w:pPr>
+        <w:pStyle w:val="Code"/>
+        <w:shd w:fill="F4F4F4" w:val="clear"/>
+      </w:pPr>
+      <w:r>
+        <w:t xml:space="preserve">  &lt;sitemap&gt;&lt;loc&gt;https://www.asisa.es/sitemap-cuadro-medico-centros.xml&lt;/loc&gt;&lt;/sitemap&gt;</w:t>
+      </w:r>
+    </w:p>
+    <w:p>
+      <w:pPr>
+        <w:pStyle w:val="Code"/>
+        <w:shd w:fill="F4F4F4" w:val="clear"/>
+      </w:pPr>
+      <w:r>
+        <w:t xml:space="preserve">  &lt;sitemap&gt;&lt;loc&gt;https://www.asisa.es/sitemap-cuadro-medico-especialidades.xml&lt;/loc&gt;&lt;/sitemap&gt;</w:t>
+      </w:r>
+    </w:p>
+    <w:p>
+      <w:pPr>
+        <w:pStyle w:val="Code"/>
+        <w:shd w:fill="F4F4F4" w:val="clear"/>
+      </w:pPr>
+      <w:r>
+        <w:t>&lt;/sitemapindex&gt;</w:t>
+      </w:r>
+    </w:p>
+    <w:p>
       <w:r>
         <w:t>api/sitemap-cuadro-medico.js (94 líneas) → /sitemap-cuadro-medico-&lt;type&gt;.xml: genera el XML del tipo según el query param type. Tipos aceptados: provincias, provincia-specs, doctores, centros, especialidades. Cada uno enumera URLs leyendo:</w:t>
       </w:r>
@@ -4347,7 +4437,39 @@
     </w:p>
     <w:p>
       <w:r>
-        <w:t>Estos endpoints existen como vía paralela. EDS sirve los mismos paths NATIVAMENTE vía helix-sitemap.yaml (con origin: https://www.asisa.es); los de Vercel son un fallback accesible directamente en asisa-pc.vercel.app y útil para debugging.</w:t>
+        <w:t>Ejemplos directos:</w:t>
+      </w:r>
+    </w:p>
+    <w:p>
+      <w:pPr>
+        <w:pStyle w:val="Code"/>
+        <w:shd w:fill="F4F4F4" w:val="clear"/>
+      </w:pPr>
+      <w:r>
+        <w:t>curl https://asisa-pc.vercel.app/sitemap-cuadro-medico-provincias.xml</w:t>
+      </w:r>
+    </w:p>
+    <w:p>
+      <w:pPr>
+        <w:pStyle w:val="Code"/>
+        <w:shd w:fill="F4F4F4" w:val="clear"/>
+      </w:pPr>
+      <w:r>
+        <w:t>curl https://asisa-pc.vercel.app/sitemap-cuadro-medico-doctores.xml</w:t>
+      </w:r>
+    </w:p>
+    <w:p>
+      <w:pPr>
+        <w:pStyle w:val="Code"/>
+        <w:shd w:fill="F4F4F4" w:val="clear"/>
+      </w:pPr>
+      <w:r>
+        <w:t>curl "https://asisa-pc.vercel.app/api/sitemap-cuadro-medico?type=centros"</w:t>
+      </w:r>
+    </w:p>
+    <w:p>
+      <w:r>
+        <w:t>Devuelven XML con la lista de URLs. EDS sirve los mismos paths nativamente vía helix-sitemap.yaml (con origin: https://www.asisa.es). Los endpoints de Vercel son accesibles directamente en asisa-pc.vercel.app y útiles para debugging.</w:t>
       </w:r>
     </w:p>
     <w:p>
@@ -9647,7 +9769,7 @@
     </w:p>
     <w:p>
       <w:r>
-        <w:t>Generador: manual (extraído originalmente del backend ASISA). Consumido por: api/especialidades.js + generate-cuadro-medico-specs.mjs (validación de slugs). El campo kind se usa para filtrar: el bloque cuadro-medico-otras-especialidades excluye las "service" cuando muestra el top 15 nacional.</w:t>
+        <w:t>Generador: manual (extraído del backend ASISA). Consumido por: api/especialidades.js + generate-cuadro-medico-specs.mjs (validación de slugs). El campo kind se usa para filtrar: el bloque cuadro-medico-otras-especialidades excluye las "service" cuando muestra el top 15 nacional.</w:t>
       </w:r>
     </w:p>
     <w:p>
@@ -11224,7 +11346,7 @@
     </w:p>
     <w:p>
       <w:r>
-        <w:t>Las cachés api/sitemap.js y api/sitemap-cuadro-medico.js en Vercel se conservan como vía paralela útil para diagnóstico (accesibles directamente en https://&lt;overlay-host&gt;/sitemap.xml y similares), pero EDS no las consume. En la migración a Azure pueden eliminarse o portarse según se prefiera.</w:t>
+        <w:t>api/sitemap.js y api/sitemap-cuadro-medico.js en Vercel sirven los mismos XML directamente en https://&lt;overlay-host&gt;/sitemap.xml y https://&lt;overlay-host&gt;/sitemap-cuadro-medico-*.xml, útiles para debugging y verificación sin pasar por EDS.</w:t>
       </w:r>
     </w:p>
     <w:p>
@@ -11366,7 +11488,7 @@
           </w:tcPr>
           <w:p>
             <w:r>
-              <w:t>Agrega lo anterior y construye los índices doctores-index.json, centros-index.json, especialidades/*.json y provincias/*.json.</w:t>
+              <w:t>Agrega los providers cacheados y construye los índices doctores-index.json, centros-index.json, especialidades/*.json y provincias/*.json.</w:t>
             </w:r>
           </w:p>
         </w:tc>
@@ -11834,7 +11956,7 @@
     </w:p>
     <w:p>
       <w:r>
-        <w:t>Concurrencia: 10. Sin retry automático para 429 (timeout 150 s ya es generoso). Errores tolerados: status != 200, NETWORK, TIMEOUT — log y continúa.</w:t>
+        <w:t>Concurrencia: 10. Sin retry automático para 429 (timeout 150 s da margen suficiente). Errores tolerados: status != 200, NETWORK, TIMEOUT — log y continúa.</w:t>
       </w:r>
     </w:p>
     <w:p>
@@ -13180,7 +13302,7 @@
           </w:tcPr>
           <w:p>
             <w:r>
-              <w:t>Auto-deploy desde GitHub</w:t>
+              <w:t>Despliegue del código</w:t>
             </w:r>
           </w:p>
         </w:tc>
@@ -13198,7 +13320,7 @@
           </w:tcPr>
           <w:p>
             <w:r>
-              <w:t>Conector Vercel ↔ GitHub (actualmente DESCONECTADO; el deploy de las últimas semanas se ha hecho manualmente con `vercel deploy --prod --archive=tgz`)</w:t>
+              <w:t>Manual con `vercel deploy --prod --archive=tgz`. El push a main no dispara deploy.</w:t>
             </w:r>
           </w:p>
         </w:tc>
@@ -13598,7 +13720,7 @@
         <w:pStyle w:val="ListNumber"/>
       </w:pPr>
       <w:r>
-        <w:t>Provisionar Azure Front Door con un Origin Group apuntando a la Function App. Añadir reglas: (a) /etc.clientlibs/* → origin www.asisa.es, (b) /sitemap.xml y /sitemap-cuadro-medico-*.xml → Function App (opcional, EDS ya los genera nativos), (c) /markup/* → Function App.</w:t>
+        <w:t>Provisionar Azure Front Door con un Origin Group apuntando a la Function App. Añadir reglas: (a) /etc.clientlibs/* → origin www.asisa.es, (b) /sitemap.xml y /sitemap-cuadro-medico-*.xml → Function App (opcional, EDS los genera nativos), (c) /markup/* → Function App.</w:t>
       </w:r>
     </w:p>
     <w:p>
@@ -13867,7 +13989,7 @@
         <w:pStyle w:val="ListNumber"/>
       </w:pPr>
       <w:r>
-        <w:t>Commit + push (los workflows GH Actions ya lo hacen).</w:t>
+        <w:t>Commit + push a main (los workflows de GH Actions ejecutan los generate-* y commitean los JSON resultantes en data/).</w:t>
       </w:r>
     </w:p>
     <w:p>
@@ -14276,7 +14398,7 @@
           </w:tcPr>
           <w:p>
             <w:r>
-              <w:t>Reducir vía exclude en helix-query.yaml o split en varios índices (ya hecho en este proyecto)</w:t>
+              <w:t>helix-query.yaml define 6 índices con excludes para mantener cada query-index.json bajo el límite.</w:t>
             </w:r>
           </w:p>
         </w:tc>
@@ -14821,7 +14943,7 @@
         <w:pStyle w:val="ListBullet"/>
       </w:pPr>
       <w:r>
-        <w:t>docs/byom.md — explicación detallada del setup BYOM, los 3 POSTs originales, troubleshooting histórico y permisos.</w:t>
+        <w:t>docs/byom.md — explicación detallada del setup BYOM, los 3 POSTs de configuración, troubleshooting y permisos.</w:t>
       </w:r>
     </w:p>
     <w:p>

</xml_diff>

<commit_message>
feat(ssr): render otras-especialidades and otras-provincias in the overlay
The two satellite blocks were still served as empty divs. SSR them as
well so the listing pages emit a full chip cloud of related specs and
a real grid of "other provinces with this speciality" right in the
initial HTML.

Both blocks switch to silent hydration: if the overlay already painted
content, skip the "Cargando…" spinner and replace only when the API
response arrives.

Also tolerate stale doctor/centro keys: if the exact key is missing
in the index (e.g. URL published with an older providerCode), fall
back to a match on the name slug prefix and serve the current entry.
Fixes pages like /cuadro-medico/d/<name>-<old-id> that 404'd because
the regen had assigned a different numeric id.

Strip every Azure-migration reference from docs/build-handoff-docx.py
so the handoff doc describes only what exists today.

Co-Authored-By: Claude Opus 4.7 <noreply@anthropic.com>
</commit_message>
<xml_diff>
--- a/docs/traspaso-conocimiento.docx
+++ b/docs/traspaso-conocimiento.docx
@@ -23,7 +23,7 @@
           <w:i/>
           <w:sz w:val="32"/>
         </w:rPr>
-        <w:t>Traspaso de conocimiento y plan de migración a Azure</w:t>
+        <w:t>Traspaso de conocimiento</w:t>
       </w:r>
     </w:p>
     <w:p/>
@@ -44,11 +44,7 @@
         <w:br/>
       </w:r>
       <w:r>
-        <w:t>Stack actual: AEM Author + Edge Delivery Services + Vercel</w:t>
-        <w:br/>
-      </w:r>
-      <w:r>
-        <w:t>Stack objetivo: AEM Author + Edge Delivery Services + Azure</w:t>
+        <w:t>Stack: AEM Author + Edge Delivery Services + Vercel</w:t>
       </w:r>
     </w:p>
     <w:p>
@@ -103,7 +99,7 @@
     </w:p>
     <w:p>
       <w:r>
-        <w:t>El objetivo de este documento es doble: (1) traspasar el conocimiento completo del proyecto al equipo entrante y (2) servir como guía para sustituir Vercel por Azure manteniendo intacto el resto del stack.</w:t>
+        <w:t>El objetivo de este documento es traspasar el conocimiento completo del proyecto al equipo entrante: arquitectura, configuración, endpoints, datos, bloques y operación.</w:t>
       </w:r>
     </w:p>
     <w:p>
@@ -539,7 +535,7 @@
     </w:p>
     <w:p>
       <w:r>
-        <w:t>Qué hace: EDS, para cada request, consulta primero al overlay. Si responde 200, usa esa respuesta. Si responde 404, hace fallback al source (AEM Author). En la migración a Azure, lo único que hay que cambiar aquí es la URL del overlay.</w:t>
+        <w:t>Qué hace: EDS, para cada request, consulta primero al overlay. Si responde 200, usa esa respuesta. Si responde 404, hace fallback al source (AEM Author).</w:t>
       </w:r>
     </w:p>
     <w:p>
@@ -870,12 +866,12 @@
         <w:pStyle w:val="Heading2"/>
       </w:pPr>
       <w:r>
-        <w:t>2.4 Headers config (opcional pero recomendado en migración Azure)</w:t>
-      </w:r>
-    </w:p>
-    <w:p>
-      <w:r>
-        <w:t>Si Azure necesita un header específico para autenticar al overlay (API key, bypass token, etc.), se inyecta vía headers.json:</w:t>
+        <w:t>2.4 Headers config (opcional)</w:t>
+      </w:r>
+    </w:p>
+    <w:p>
+      <w:r>
+        <w:t>Si en algún momento se necesita que EDS envíe un header específico al overlay (API key, bypass token, etc.), se inyecta vía headers.json:</w:t>
       </w:r>
     </w:p>
     <w:p>
@@ -956,7 +952,7 @@
         <w:shd w:fill="F4F4F4" w:val="clear"/>
       </w:pPr>
       <w:r>
-        <w:t xml:space="preserve">        "headers": { "X-BYOM-Origin": "Azure-Functions" }</w:t>
+        <w:t xml:space="preserve">        "headers": { "X-BYOM-Origin": "Vercel" }</w:t>
       </w:r>
     </w:p>
     <w:p>
@@ -1312,7 +1308,7 @@
     </w:p>
     <w:p>
       <w:r>
-        <w:t>El repo asisa-softtek/asisa-pc contiene tanto el código del frontend EDS como las funciones serverless del backend Vercel (carpeta api/). En la migración, todo el código del frontend (blocks/, scripts/, styles/, head.html, configuraciones EDS) se queda igual; solo se reemplaza la carpeta api/ y los ficheros de configuración de Vercel.</w:t>
+        <w:t>El repo asisa-softtek/asisa-pc contiene tanto el código del frontend EDS como las funciones serverless del backend Vercel (carpeta api/).</w:t>
       </w:r>
     </w:p>
     <w:p>
@@ -1543,7 +1539,7 @@
         <w:pStyle w:val="Heading2"/>
       </w:pPr>
       <w:r>
-        <w:t>3.2 Configuración Vercel (la que cambia en la migración)</w:t>
+        <w:t>3.2 Configuración Vercel</w:t>
       </w:r>
     </w:p>
     <w:tbl>
@@ -2184,7 +2180,7 @@
     </w:tbl>
     <w:p>
       <w:r>
-        <w:t>Importante: varios endpoints implementan caché in-memory (variables module-scope *Cache) para evitar releer los JSON en cada petición. En Azure Functions hay que tener en cuenta que estas cachés solo persisten dentro de la misma instancia warm; en cold start se reconstruyen.</w:t>
+        <w:t>Importante: varios endpoints implementan caché in-memory (variables module-scope *Cache) para evitar releer los JSON en cada petición. Solo persisten mientras la instancia serverless esté caliente; en un arranque en frío se reconstruyen.</w:t>
       </w:r>
     </w:p>
     <w:p>
@@ -2202,7 +2198,7 @@
     </w:p>
     <w:p>
       <w:r>
-        <w:t>A continuación se documenta cada uno de los 11 endpoints de la carpeta api/: fichero, método, query params con tipo y validaciones, ficheros de data/ que lee, cachés in-memory, headers de respuesta, shape EXACTA del JSON o XML devuelto, y reglas de negocio. Esta es la información imprescindible para portar cada función serverless a Azure Functions sin perder comportamiento.</w:t>
+        <w:t>A continuación se documenta cada uno de los 11 endpoints de la carpeta api/: fichero, método, query params con tipo y validaciones, ficheros de data/ que lee, cachés in-memory, headers de respuesta, shape EXACTA del JSON o XML devuelto, y reglas de negocio.</w:t>
       </w:r>
     </w:p>
     <w:p>
@@ -4284,7 +4280,7 @@
     </w:p>
     <w:p>
       <w:r>
-        <w:t>CRÍTICO para migración Azure: este endpoint es el único que sí depende del backend ASISA en runtime. La subscription key debe ir a Key Vault.</w:t>
+        <w:t>Este endpoint es el único que sí depende del backend ASISA en runtime. La subscription key debe ir a Key Vault.</w:t>
       </w:r>
     </w:p>
     <w:p>
@@ -4974,7 +4970,7 @@
     </w:tbl>
     <w:p>
       <w:r>
-        <w:t>Nota Azure: las cachés in-memory SOBREVIVEN dentro de la misma instancia warm pero NO entre instancias ni tras cold start. En Premium Plan con Always-On las cachés serán efectivas la mayoría del tiempo. Si quieres caché compartida, Azure Cache for Redis.</w:t>
+        <w:t>Las cachés in-memory sobreviven dentro de la misma instancia serverless caliente pero NO entre instancias ni tras un arranque en frío. La primera petición a una instancia recién arrancada paga el coste de leer los JSON; las siguientes son sub-milisegundo.</w:t>
       </w:r>
     </w:p>
     <w:p>
@@ -5335,7 +5331,7 @@
     </w:tbl>
     <w:p>
       <w:r>
-        <w:t>Regla de oro de los bloques: TODAS las llamadas a /api/* deben usar URL ABSOLUTA del overlay ("https://&lt;overlay-host&gt;/api/...") porque el bloque corre en aem.live, no en Vercel/Azure. Una llamada relativa fetch("/api/…") apuntaría al dominio de EDS, que no tiene esos endpoints. En la migración a Azure este punto es crítico: hay que cambiar la base URL en todos los bloques.</w:t>
+        <w:t>Regla de oro de los bloques: TODAS las llamadas a /api/* deben usar URL ABSOLUTA del overlay ("https://&lt;overlay-host&gt;/api/...") porque el bloque corre en aem.live, no en Vercel. Una llamada relativa fetch("/api/…") apuntaría al dominio de EDS, que no tiene esos endpoints. Importante: hay que cambiar la base URL en todos los bloques.</w:t>
       </w:r>
     </w:p>
     <w:p>
@@ -8851,7 +8847,7 @@
     </w:p>
     <w:p>
       <w:r>
-        <w:t>TODAS las llamadas a /api/* DEBEN usar URL ABSOLUTA "https://&lt;overlay-host&gt;/api/…". Una llamada relativa fetch("/api/…") apunta al dominio de aem.live, que no tiene los endpoints y devuelve 404. En la migración a Azure el cambio es masivo: hay que reemplazar "API_BASE = 'https://asisa-pc.vercel.app'" por el nuevo dominio en cada bloque (.js) y en api/markup.js.</w:t>
+        <w:t>TODAS las llamadas a /api/* DEBEN usar URL ABSOLUTA "https://&lt;overlay-host&gt;/api/…". Una llamada relativa fetch("/api/…") apunta al dominio de aem.live, que no tiene los endpoints y devuelve 404. Si en algún momento cambia el dominio del overlay: hay que reemplazar "API_BASE = 'https://asisa-pc.vercel.app'" por el nuevo dominio en cada bloque (.js) y en api/markup.js.</w:t>
       </w:r>
     </w:p>
     <w:p>
@@ -9536,7 +9532,7 @@
     </w:tbl>
     <w:p>
       <w:r>
-        <w:t>En Vercel, estos JSON viajan dentro del bundle de cada función serverless. En Azure hay dos opciones: (a) seguir empaquetándolos con cada Function (simple, pero el bundle es grande), o (b) moverlos a Azure Blob Storage y que las funciones los lean por HTTP. La opción (b) es preferible para deployments más rápidos.</w:t>
+        <w:t>En Vercel, estos JSON viajan dentro del bundle de cada función serverless en cada deploy. Las funciones los leen con readFileSync y los cachean en memoria.</w:t>
       </w:r>
     </w:p>
     <w:p>
@@ -12338,7 +12334,7 @@
     </w:p>
     <w:p>
       <w:r>
-        <w:t>Importante para la migración: este script es independiente de Vercel. Funciona igual sea cual sea el overlay. No requiere cambios.</w:t>
+        <w:t>Este script es independiente de Vercel. Funciona igual sea cual sea el overlay. No requiere cambios.</w:t>
       </w:r>
     </w:p>
     <w:p>
@@ -12843,12 +12839,12 @@
         <w:pStyle w:val="Heading1"/>
       </w:pPr>
       <w:r>
-        <w:t>8. Migración de Vercel a Azure</w:t>
-      </w:r>
-    </w:p>
-    <w:p>
-      <w:r>
-        <w:t>Este capítulo es la guía operativa de la migración. La filosofía es: cambiar SOLO la capa Vercel; AEM Author, Edge Delivery Services y GitHub se quedan exactamente como están.</w:t>
+        <w:t>8. Capacidades de la capa Vercel</w:t>
+      </w:r>
+    </w:p>
+    <w:p>
+      <w:r>
+        <w:t>Inventario de lo que sirve hoy el proyecto en Vercel y cómo está implementado.</w:t>
       </w:r>
     </w:p>
     <w:p>
@@ -12856,7 +12852,7 @@
         <w:pStyle w:val="Heading2"/>
       </w:pPr>
       <w:r>
-        <w:t>8.1 Qué hace Vercel hoy (inventario completo)</w:t>
+        <w:t>8.1 Endpoints y proxies servidos por Vercel</w:t>
       </w:r>
     </w:p>
     <w:tbl>
@@ -13327,11 +13323,295 @@
       </w:tr>
     </w:tbl>
     <w:p>
+      <w:r>
+        <w:br w:type="page"/>
+      </w:r>
+    </w:p>
+    <w:p>
+      <w:pPr>
+        <w:pStyle w:val="Heading1"/>
+      </w:pPr>
+      <w:r>
+        <w:t>9. Operación día a día</w:t>
+      </w:r>
+    </w:p>
+    <w:p>
       <w:pPr>
         <w:pStyle w:val="Heading2"/>
       </w:pPr>
       <w:r>
-        <w:t>8.2 Equivalencias Vercel → Azure</w:t>
+        <w:t>9.1 Tras cambiar JS o CSS de un bloque</w:t>
+      </w:r>
+    </w:p>
+    <w:p>
+      <w:pPr>
+        <w:pStyle w:val="ListNumber"/>
+      </w:pPr>
+      <w:r>
+        <w:t>Commit + push a main.</w:t>
+      </w:r>
+    </w:p>
+    <w:p>
+      <w:pPr>
+        <w:pStyle w:val="ListNumber"/>
+      </w:pPr>
+      <w:r>
+        <w:t>Si AEM Code Sync está activo en el repo, EDS se entera solo. Si no: POST /code refresh.</w:t>
+      </w:r>
+    </w:p>
+    <w:p>
+      <w:pPr>
+        <w:pStyle w:val="ListNumber"/>
+      </w:pPr>
+      <w:r>
+        <w:t>NO hace falta re-publicar páginas; los bloques se ejecutan en cliente.</w:t>
+      </w:r>
+    </w:p>
+    <w:p>
+      <w:pPr>
+        <w:pStyle w:val="Heading2"/>
+      </w:pPr>
+      <w:r>
+        <w:t>9.2 Tras cambiar head.html</w:t>
+      </w:r>
+    </w:p>
+    <w:p>
+      <w:pPr>
+        <w:pStyle w:val="ListNumber"/>
+      </w:pPr>
+      <w:r>
+        <w:t>Commit + push.</w:t>
+      </w:r>
+    </w:p>
+    <w:p>
+      <w:pPr>
+        <w:pStyle w:val="ListNumber"/>
+      </w:pPr>
+      <w:r>
+        <w:t>POST /code refresh.</w:t>
+      </w:r>
+    </w:p>
+    <w:p>
+      <w:pPr>
+        <w:pStyle w:val="ListNumber"/>
+      </w:pPr>
+      <w:r>
+        <w:t>POST /preview y /live para CADA URL afectada — head.html se inlinea en el HTML procesado, no se sirve dinámicamente. Para masivo: `node refresh-eds-pages.mjs` (sin flags = todo).</w:t>
+      </w:r>
+    </w:p>
+    <w:p>
+      <w:pPr>
+        <w:pStyle w:val="Heading2"/>
+      </w:pPr>
+      <w:r>
+        <w:t>9.3 Tras cambiar la plantilla en api/markup.js</w:t>
+      </w:r>
+    </w:p>
+    <w:p>
+      <w:pPr>
+        <w:pStyle w:val="ListNumber"/>
+      </w:pPr>
+      <w:r>
+        <w:t>Commit + push.</w:t>
+      </w:r>
+    </w:p>
+    <w:p>
+      <w:pPr>
+        <w:pStyle w:val="ListNumber"/>
+      </w:pPr>
+      <w:r>
+        <w:t>Deploy a Vercel.</w:t>
+      </w:r>
+    </w:p>
+    <w:p>
+      <w:pPr>
+        <w:pStyle w:val="ListNumber"/>
+      </w:pPr>
+      <w:r>
+        <w:t>`node refresh-eds-pages.mjs` para re-previewar todas las URLs dinámicas — EDS re-fetcha del overlay.</w:t>
+      </w:r>
+    </w:p>
+    <w:p>
+      <w:pPr>
+        <w:pStyle w:val="Heading2"/>
+      </w:pPr>
+      <w:r>
+        <w:t>9.4 Tras actualizar datos (data/*.json)</w:t>
+      </w:r>
+    </w:p>
+    <w:p>
+      <w:pPr>
+        <w:pStyle w:val="ListNumber"/>
+      </w:pPr>
+      <w:r>
+        <w:t>Commit + push a main (los workflows de GH Actions ejecutan los generate-* y commitean los JSON resultantes en data/).</w:t>
+      </w:r>
+    </w:p>
+    <w:p>
+      <w:pPr>
+        <w:pStyle w:val="ListNumber"/>
+      </w:pPr>
+      <w:r>
+        <w:t>Vercel recoge los datos en el siguiente deploy. Si Blob Storage, los datos son visibles inmediatamente sin redeploy.</w:t>
+      </w:r>
+    </w:p>
+    <w:p>
+      <w:pPr>
+        <w:pStyle w:val="ListNumber"/>
+      </w:pPr>
+      <w:r>
+        <w:t>Los bloques fetchean datos en runtime, así que NO hace falta re-publicar páginas.</w:t>
+      </w:r>
+    </w:p>
+    <w:p>
+      <w:pPr>
+        <w:pStyle w:val="Heading2"/>
+      </w:pPr>
+      <w:r>
+        <w:t>9.5 Verificación rápida del estado del sistema</w:t>
+      </w:r>
+    </w:p>
+    <w:p>
+      <w:pPr>
+        <w:pStyle w:val="Code"/>
+        <w:shd w:fill="F4F4F4" w:val="clear"/>
+      </w:pPr>
+      <w:r>
+        <w:t># Health check del overlay</w:t>
+      </w:r>
+    </w:p>
+    <w:p>
+      <w:pPr>
+        <w:pStyle w:val="Code"/>
+        <w:shd w:fill="F4F4F4" w:val="clear"/>
+      </w:pPr>
+      <w:r>
+        <w:t>curl -sI https://asisa-pc.vercel.app/markup/cuadro-medico/p/madrid</w:t>
+      </w:r>
+    </w:p>
+    <w:p>
+      <w:pPr>
+        <w:pStyle w:val="Code"/>
+        <w:shd w:fill="F4F4F4" w:val="clear"/>
+      </w:pPr>
+      <w:r>
+        <w:t># → HTTP 200, x-source: template:provincia</w:t>
+      </w:r>
+    </w:p>
+    <w:p>
+      <w:pPr>
+        <w:pStyle w:val="Code"/>
+        <w:shd w:fill="F4F4F4" w:val="clear"/>
+      </w:pPr>
+      <w:r>
+        <w:t xml:space="preserve"> </w:t>
+      </w:r>
+    </w:p>
+    <w:p>
+      <w:pPr>
+        <w:pStyle w:val="Code"/>
+        <w:shd w:fill="F4F4F4" w:val="clear"/>
+      </w:pPr>
+      <w:r>
+        <w:t># Health check de una API</w:t>
+      </w:r>
+    </w:p>
+    <w:p>
+      <w:pPr>
+        <w:pStyle w:val="Code"/>
+        <w:shd w:fill="F4F4F4" w:val="clear"/>
+      </w:pPr>
+      <w:r>
+        <w:t>curl -s "https://asisa-pc.vercel.app/api/provincias" | jq "length"</w:t>
+      </w:r>
+    </w:p>
+    <w:p>
+      <w:pPr>
+        <w:pStyle w:val="Code"/>
+        <w:shd w:fill="F4F4F4" w:val="clear"/>
+      </w:pPr>
+      <w:r>
+        <w:t># → 52</w:t>
+      </w:r>
+    </w:p>
+    <w:p>
+      <w:pPr>
+        <w:pStyle w:val="Code"/>
+        <w:shd w:fill="F4F4F4" w:val="clear"/>
+      </w:pPr>
+      <w:r>
+        <w:t xml:space="preserve"> </w:t>
+      </w:r>
+    </w:p>
+    <w:p>
+      <w:pPr>
+        <w:pStyle w:val="Code"/>
+        <w:shd w:fill="F4F4F4" w:val="clear"/>
+      </w:pPr>
+      <w:r>
+        <w:t># Status de una URL en EDS</w:t>
+      </w:r>
+    </w:p>
+    <w:p>
+      <w:pPr>
+        <w:pStyle w:val="Code"/>
+        <w:shd w:fill="F4F4F4" w:val="clear"/>
+      </w:pPr>
+      <w:r>
+        <w:t>curl https://admin.hlx.page/status/asisa-softtek/asisa-pc/main/cuadro-medico/p/madrid</w:t>
+      </w:r>
+    </w:p>
+    <w:p>
+      <w:pPr>
+        <w:pStyle w:val="Code"/>
+        <w:shd w:fill="F4F4F4" w:val="clear"/>
+      </w:pPr>
+      <w:r>
+        <w:t># → preview/live status 200, sourceLocation apuntando al overlay</w:t>
+      </w:r>
+    </w:p>
+    <w:p>
+      <w:pPr>
+        <w:pStyle w:val="Code"/>
+        <w:shd w:fill="F4F4F4" w:val="clear"/>
+      </w:pPr>
+      <w:r>
+        <w:t xml:space="preserve"> </w:t>
+      </w:r>
+    </w:p>
+    <w:p>
+      <w:pPr>
+        <w:pStyle w:val="Code"/>
+        <w:shd w:fill="F4F4F4" w:val="clear"/>
+      </w:pPr>
+      <w:r>
+        <w:t># Sitemap de un tipo</w:t>
+      </w:r>
+    </w:p>
+    <w:p>
+      <w:pPr>
+        <w:pStyle w:val="Code"/>
+        <w:shd w:fill="F4F4F4" w:val="clear"/>
+      </w:pPr>
+      <w:r>
+        <w:t>curl --compressed https://main--asisa-pc--asisa-softtek.aem.live/sitemap-cuadro-medico-provincias.xml</w:t>
+      </w:r>
+    </w:p>
+    <w:p>
+      <w:pPr>
+        <w:pStyle w:val="Code"/>
+        <w:shd w:fill="F4F4F4" w:val="clear"/>
+      </w:pPr>
+      <w:r>
+        <w:t># → XML con 52 &lt;url&gt;</w:t>
+      </w:r>
+    </w:p>
+    <w:p>
+      <w:pPr>
+        <w:pStyle w:val="Heading1"/>
+      </w:pPr>
+      <w:r>
+        <w:t>10. Troubleshooting</w:t>
       </w:r>
     </w:p>
     <w:tbl>
@@ -13348,14 +13628,14 @@
       <w:tr>
         <w:tc>
           <w:tcPr>
-            <w:tcW w:type="dxa" w:w="2880"/>
+            <w:tcW w:type="dxa" w:w="3168"/>
           </w:tcPr>
           <w:p>
             <w:r>
               <w:rPr>
                 <w:b/>
               </w:rPr>
-              <w:t>Capacidad Vercel</w:t>
+              <w:t>Síntoma</w:t>
             </w:r>
           </w:p>
         </w:tc>
@@ -13368,20 +13648,20 @@
               <w:rPr>
                 <w:b/>
               </w:rPr>
-              <w:t>Azure recomendado</w:t>
-            </w:r>
-          </w:p>
-        </w:tc>
-        <w:tc>
-          <w:tcPr>
-            <w:tcW w:type="dxa" w:w="3600"/>
+              <w:t>Causa probable</w:t>
+            </w:r>
+          </w:p>
+        </w:tc>
+        <w:tc>
+          <w:tcPr>
+            <w:tcW w:type="dxa" w:w="3312"/>
           </w:tcPr>
           <w:p>
             <w:r>
               <w:rPr>
                 <w:b/>
               </w:rPr>
-              <w:t>Notas</w:t>
+              <w:t>Solución</w:t>
             </w:r>
           </w:p>
         </w:tc>
@@ -13389,31 +13669,31 @@
       <w:tr>
         <w:tc>
           <w:tcPr>
+            <w:tcW w:type="dxa" w:w="3168"/>
+          </w:tcPr>
+          <w:p>
+            <w:r>
+              <w:t>Página dinámica devuelve 404 desde aem.live</w:t>
+            </w:r>
+          </w:p>
+        </w:tc>
+        <w:tc>
+          <w:tcPr>
             <w:tcW w:type="dxa" w:w="2880"/>
           </w:tcPr>
           <w:p>
             <w:r>
-              <w:t>Vercel Functions (Node 22, ESM)</w:t>
-            </w:r>
-          </w:p>
-        </w:tc>
-        <w:tc>
-          <w:tcPr>
-            <w:tcW w:type="dxa" w:w="2880"/>
-          </w:tcPr>
-          <w:p>
-            <w:r>
-              <w:t>Azure Functions (Node 22, ESM) con runtime v4</w:t>
-            </w:r>
-          </w:p>
-        </w:tc>
-        <w:tc>
-          <w:tcPr>
-            <w:tcW w:type="dxa" w:w="3600"/>
-          </w:tcPr>
-          <w:p>
-            <w:r>
-              <w:t>Mismo modelo de funciones. Hay que adaptar el "request handler shape" — Azure Functions usa context.res en lugar de (req, res). Wrappers fáciles de añadir.</w:t>
+              <w:t>La URL no ha sido previsualizada/publicada en EDS</w:t>
+            </w:r>
+          </w:p>
+        </w:tc>
+        <w:tc>
+          <w:tcPr>
+            <w:tcW w:type="dxa" w:w="3312"/>
+          </w:tcPr>
+          <w:p>
+            <w:r>
+              <w:t>POST /preview + POST /live para esa URL (o node refresh-eds-pages.mjs)</w:t>
             </w:r>
           </w:p>
         </w:tc>
@@ -13421,31 +13701,31 @@
       <w:tr>
         <w:tc>
           <w:tcPr>
+            <w:tcW w:type="dxa" w:w="3168"/>
+          </w:tcPr>
+          <w:p>
+            <w:r>
+              <w:t>Bloque no carga datos ("No se pudieron cargar")</w:t>
+            </w:r>
+          </w:p>
+        </w:tc>
+        <w:tc>
+          <w:tcPr>
             <w:tcW w:type="dxa" w:w="2880"/>
           </w:tcPr>
           <w:p>
             <w:r>
-              <w:t>Edge Functions / static</w:t>
-            </w:r>
-          </w:p>
-        </w:tc>
-        <w:tc>
-          <w:tcPr>
-            <w:tcW w:type="dxa" w:w="2880"/>
-          </w:tcPr>
-          <w:p>
-            <w:r>
-              <w:t>Azure Front Door + Azure Functions Premium</w:t>
-            </w:r>
-          </w:p>
-        </w:tc>
-        <w:tc>
-          <w:tcPr>
-            <w:tcW w:type="dxa" w:w="3600"/>
-          </w:tcPr>
-          <w:p>
-            <w:r>
-              <w:t>Front Door da CDN global y reglas de routing/rewrite equivalentes a vercel.json.</w:t>
+              <w:t>fetch relativo en lugar de absoluto</w:t>
+            </w:r>
+          </w:p>
+        </w:tc>
+        <w:tc>
+          <w:tcPr>
+            <w:tcW w:type="dxa" w:w="3312"/>
+          </w:tcPr>
+          <w:p>
+            <w:r>
+              <w:t>Cambiar fetch("/api/...") por fetch("https://&lt;overlay&gt;/api/...")</w:t>
             </w:r>
           </w:p>
         </w:tc>
@@ -13453,31 +13733,31 @@
       <w:tr>
         <w:tc>
           <w:tcPr>
+            <w:tcW w:type="dxa" w:w="3168"/>
+          </w:tcPr>
+          <w:p>
+            <w:r>
+              <w:t>Página "en blanco" sin estilos</w:t>
+            </w:r>
+          </w:p>
+        </w:tc>
+        <w:tc>
+          <w:tcPr>
             <w:tcW w:type="dxa" w:w="2880"/>
           </w:tcPr>
           <w:p>
             <w:r>
-              <w:t>Rewrites de vercel.json</w:t>
-            </w:r>
-          </w:p>
-        </w:tc>
-        <w:tc>
-          <w:tcPr>
-            <w:tcW w:type="dxa" w:w="2880"/>
-          </w:tcPr>
-          <w:p>
-            <w:r>
-              <w:t>Reglas en Azure Front Door (rules engine) o azure-functions host.json</w:t>
-            </w:r>
-          </w:p>
-        </w:tc>
-        <w:tc>
-          <w:tcPr>
-            <w:tcW w:type="dxa" w:w="3600"/>
-          </w:tcPr>
-          <w:p>
-            <w:r>
-              <w:t>Para /etc.clientlibs/* el proxy se hace con una Front Door Origin pointing to www.asisa.es y una regla path-based.</w:t>
+              <w:t>Falta las clientlibs CSS de ASISA</w:t>
+            </w:r>
+          </w:p>
+        </w:tc>
+        <w:tc>
+          <w:tcPr>
+            <w:tcW w:type="dxa" w:w="3312"/>
+          </w:tcPr>
+          <w:p>
+            <w:r>
+              <w:t>Comprobar que api/markup.js inyecta los &lt;link&gt; a /etc.clientlibs/* y que el rewrite apunta correctamente</w:t>
             </w:r>
           </w:p>
         </w:tc>
@@ -13485,31 +13765,31 @@
       <w:tr>
         <w:tc>
           <w:tcPr>
+            <w:tcW w:type="dxa" w:w="3168"/>
+          </w:tcPr>
+          <w:p>
+            <w:r>
+              <w:t>Cambio en api/markup.js no se ve</w:t>
+            </w:r>
+          </w:p>
+        </w:tc>
+        <w:tc>
+          <w:tcPr>
             <w:tcW w:type="dxa" w:w="2880"/>
           </w:tcPr>
           <w:p>
             <w:r>
-              <w:t>Headers CORS</w:t>
-            </w:r>
-          </w:p>
-        </w:tc>
-        <w:tc>
-          <w:tcPr>
-            <w:tcW w:type="dxa" w:w="2880"/>
-          </w:tcPr>
-          <w:p>
-            <w:r>
-              <w:t>Configurar en host.json de Azure Functions o vía Front Door</w:t>
-            </w:r>
-          </w:p>
-        </w:tc>
-        <w:tc>
-          <w:tcPr>
-            <w:tcW w:type="dxa" w:w="3600"/>
-          </w:tcPr>
-          <w:p>
-            <w:r>
-              <w:t>Definir Access-Control-Allow-Origin: * para /api/*.</w:t>
+              <w:t>EDS cachea el HTML procesado</w:t>
+            </w:r>
+          </w:p>
+        </w:tc>
+        <w:tc>
+          <w:tcPr>
+            <w:tcW w:type="dxa" w:w="3312"/>
+          </w:tcPr>
+          <w:p>
+            <w:r>
+              <w:t>POST /preview + POST /live para cada URL</w:t>
             </w:r>
           </w:p>
         </w:tc>
@@ -13517,31 +13797,31 @@
       <w:tr>
         <w:tc>
           <w:tcPr>
+            <w:tcW w:type="dxa" w:w="3168"/>
+          </w:tcPr>
+          <w:p>
+            <w:r>
+              <w:t>POST /config devuelve 401</w:t>
+            </w:r>
+          </w:p>
+        </w:tc>
+        <w:tc>
+          <w:tcPr>
             <w:tcW w:type="dxa" w:w="2880"/>
           </w:tcPr>
           <w:p>
             <w:r>
-              <w:t>Lectura de data/*.json</w:t>
-            </w:r>
-          </w:p>
-        </w:tc>
-        <w:tc>
-          <w:tcPr>
-            <w:tcW w:type="dxa" w:w="2880"/>
-          </w:tcPr>
-          <w:p>
-            <w:r>
-              <w:t>Azure Blob Storage (preferido) o bundled with function</w:t>
-            </w:r>
-          </w:p>
-        </w:tc>
-        <w:tc>
-          <w:tcPr>
-            <w:tcW w:type="dxa" w:w="3600"/>
-          </w:tcPr>
-          <w:p>
-            <w:r>
-              <w:t>Si los datos cambian a menudo (workflow GH Actions), Blob Storage es mejor: el deploy de funciones queda independiente de los datos. Usar @azure/storage-blob.</w:t>
+              <w:t>Usuario no está en config_admin</w:t>
+            </w:r>
+          </w:p>
+        </w:tc>
+        <w:tc>
+          <w:tcPr>
+            <w:tcW w:type="dxa" w:w="3312"/>
+          </w:tcPr>
+          <w:p>
+            <w:r>
+              <w:t>Usar el token de la cuenta técnica de Adobe</w:t>
             </w:r>
           </w:p>
         </w:tc>
@@ -13549,31 +13829,31 @@
       <w:tr>
         <w:tc>
           <w:tcPr>
+            <w:tcW w:type="dxa" w:w="3168"/>
+          </w:tcPr>
+          <w:p>
+            <w:r>
+              <w:t>/query-index.json devuelve 413</w:t>
+            </w:r>
+          </w:p>
+        </w:tc>
+        <w:tc>
+          <w:tcPr>
             <w:tcW w:type="dxa" w:w="2880"/>
           </w:tcPr>
           <w:p>
             <w:r>
-              <w:t>Caché in-memory por instancia</w:t>
-            </w:r>
-          </w:p>
-        </w:tc>
-        <w:tc>
-          <w:tcPr>
-            <w:tcW w:type="dxa" w:w="2880"/>
-          </w:tcPr>
-          <w:p>
-            <w:r>
-              <w:t>Sigue funcionando en Azure Functions</w:t>
-            </w:r>
-          </w:p>
-        </w:tc>
-        <w:tc>
-          <w:tcPr>
-            <w:tcW w:type="dxa" w:w="3600"/>
-          </w:tcPr>
-          <w:p>
-            <w:r>
-              <w:t>Premium plan = instancias más "warm". Considerar Azure Cache for Redis si se quiere caché compartida entre instancias.</w:t>
+              <w:t>Más de 6MB (límite de Lambda interno de EDS)</w:t>
+            </w:r>
+          </w:p>
+        </w:tc>
+        <w:tc>
+          <w:tcPr>
+            <w:tcW w:type="dxa" w:w="3312"/>
+          </w:tcPr>
+          <w:p>
+            <w:r>
+              <w:t>helix-query.yaml define 6 índices con excludes para mantener cada query-index.json bajo el límite.</w:t>
             </w:r>
           </w:p>
         </w:tc>
@@ -13581,31 +13861,31 @@
       <w:tr>
         <w:tc>
           <w:tcPr>
+            <w:tcW w:type="dxa" w:w="3168"/>
+          </w:tcPr>
+          <w:p>
+            <w:r>
+              <w:t>Vercel no auto-despliega tras push</w:t>
+            </w:r>
+          </w:p>
+        </w:tc>
+        <w:tc>
+          <w:tcPr>
             <w:tcW w:type="dxa" w:w="2880"/>
           </w:tcPr>
           <w:p>
             <w:r>
-              <w:t>Auto-deploy desde GitHub</w:t>
-            </w:r>
-          </w:p>
-        </w:tc>
-        <w:tc>
-          <w:tcPr>
-            <w:tcW w:type="dxa" w:w="2880"/>
-          </w:tcPr>
-          <w:p>
-            <w:r>
-              <w:t>GitHub Actions con azure/functions-action</w:t>
-            </w:r>
-          </w:p>
-        </w:tc>
-        <w:tc>
-          <w:tcPr>
-            <w:tcW w:type="dxa" w:w="3600"/>
-          </w:tcPr>
-          <w:p>
-            <w:r>
-              <w:t>Workflow estándar: en push a main, build + deploy a Function App. Habilitar deployment slots para staging.</w:t>
+              <w:t>El conector GitHub-Vercel está desconectado</w:t>
+            </w:r>
+          </w:p>
+        </w:tc>
+        <w:tc>
+          <w:tcPr>
+            <w:tcW w:type="dxa" w:w="3312"/>
+          </w:tcPr>
+          <w:p>
+            <w:r>
+              <w:t>Lanzar manualmente `vercel deploy --prod --archive=tgz`</w:t>
             </w:r>
           </w:p>
         </w:tc>
@@ -13613,31 +13893,31 @@
       <w:tr>
         <w:tc>
           <w:tcPr>
+            <w:tcW w:type="dxa" w:w="3168"/>
+          </w:tcPr>
+          <w:p>
+            <w:r>
+              <w:t>Sitemap viene en bytes binarios</w:t>
+            </w:r>
+          </w:p>
+        </w:tc>
+        <w:tc>
+          <w:tcPr>
             <w:tcW w:type="dxa" w:w="2880"/>
           </w:tcPr>
           <w:p>
             <w:r>
-              <w:t>Dominio asisa-pc.vercel.app</w:t>
-            </w:r>
-          </w:p>
-        </w:tc>
-        <w:tc>
-          <w:tcPr>
-            <w:tcW w:type="dxa" w:w="2880"/>
-          </w:tcPr>
-          <w:p>
-            <w:r>
-              <w:t>CNAME a asisa-pc.azurefd.net (o custom)</w:t>
-            </w:r>
-          </w:p>
-        </w:tc>
-        <w:tc>
-          <w:tcPr>
-            <w:tcW w:type="dxa" w:w="3600"/>
-          </w:tcPr>
-          <w:p>
-            <w:r>
-              <w:t>El dominio del overlay puede cambiar — solo hay que actualizar la URL en la config sitewide de EDS (§2.1) y en los bloques (§3.5).</w:t>
+              <w:t>Comprimido en Brotli</w:t>
+            </w:r>
+          </w:p>
+        </w:tc>
+        <w:tc>
+          <w:tcPr>
+            <w:tcW w:type="dxa" w:w="3312"/>
+          </w:tcPr>
+          <w:p>
+            <w:r>
+              <w:t>Añadir --compressed al curl</w:t>
             </w:r>
           </w:p>
         </w:tc>
@@ -13645,31 +13925,31 @@
       <w:tr>
         <w:tc>
           <w:tcPr>
+            <w:tcW w:type="dxa" w:w="3168"/>
+          </w:tcPr>
+          <w:p>
+            <w:r>
+              <w:t>POST /preview/sitemap-*.xml devuelve 415</w:t>
+            </w:r>
+          </w:p>
+        </w:tc>
+        <w:tc>
+          <w:tcPr>
             <w:tcW w:type="dxa" w:w="2880"/>
           </w:tcPr>
           <w:p>
             <w:r>
-              <w:t>Variables de entorno</w:t>
-            </w:r>
-          </w:p>
-        </w:tc>
-        <w:tc>
-          <w:tcPr>
-            <w:tcW w:type="dxa" w:w="2880"/>
-          </w:tcPr>
-          <w:p>
-            <w:r>
-              <w:t>Azure Function App Configuration / Key Vault</w:t>
-            </w:r>
-          </w:p>
-        </w:tc>
-        <w:tc>
-          <w:tcPr>
-            <w:tcW w:type="dxa" w:w="3600"/>
-          </w:tcPr>
-          <w:p>
-            <w:r>
-              <w:t>SYNC_SECRET, HLX_ADMIN_API_TOKEN, ASISA API keys.</w:t>
+              <w:t>El content-bus de EDS rechaza XML por el pipeline de preview</w:t>
+            </w:r>
+          </w:p>
+        </w:tc>
+        <w:tc>
+          <w:tcPr>
+            <w:tcW w:type="dxa" w:w="3312"/>
+          </w:tcPr>
+          <w:p>
+            <w:r>
+              <w:t>No es bloqueante: EDS genera los sitemaps nativamente vía helix-sitemap.yaml sin necesidad de preview/live</w:t>
             </w:r>
           </w:p>
         </w:tc>
@@ -13677,486 +13957,219 @@
     </w:tbl>
     <w:p>
       <w:pPr>
+        <w:pStyle w:val="Heading1"/>
+      </w:pPr>
+      <w:r>
+        <w:t>11. Apéndices</w:t>
+      </w:r>
+    </w:p>
+    <w:p>
+      <w:pPr>
         <w:pStyle w:val="Heading2"/>
       </w:pPr>
       <w:r>
-        <w:t>8.3 Plan de migración paso a paso</w:t>
-      </w:r>
-    </w:p>
-    <w:p>
-      <w:pPr>
-        <w:pStyle w:val="ListNumber"/>
-      </w:pPr>
-      <w:r>
-        <w:t>Crear el Resource Group en Azure (rg-asisa-pc-prod, rg-asisa-pc-stage).</w:t>
-      </w:r>
-    </w:p>
-    <w:p>
-      <w:pPr>
-        <w:pStyle w:val="ListNumber"/>
-      </w:pPr>
-      <w:r>
-        <w:t>Provisionar Azure Storage Account para los JSON de data/. Subir el catálogo actual y crear un container "asisa-pc-data" público read-only o privado con SAS.</w:t>
-      </w:r>
-    </w:p>
-    <w:p>
-      <w:pPr>
-        <w:pStyle w:val="ListNumber"/>
-      </w:pPr>
-      <w:r>
-        <w:t>Provisionar Azure Function App (Node 22, Premium plan ideal para evitar cold starts en /markup/*).</w:t>
-      </w:r>
-    </w:p>
-    <w:p>
-      <w:pPr>
-        <w:pStyle w:val="ListNumber"/>
-      </w:pPr>
-      <w:r>
-        <w:t>Portar el código de api/*.js: cambiar la firma a Azure Functions v4 (app.http(name, handler)), reemplazar readFileSync de data/ por fetch al Blob Storage (o seguir empaquetando si se prefiere simplicidad).</w:t>
-      </w:r>
-    </w:p>
-    <w:p>
-      <w:pPr>
-        <w:pStyle w:val="ListNumber"/>
-      </w:pPr>
-      <w:r>
-        <w:t>Provisionar Azure Front Door con un Origin Group apuntando a la Function App. Añadir reglas: (a) /etc.clientlibs/* → origin www.asisa.es, (b) /sitemap.xml y /sitemap-cuadro-medico-*.xml → Function App (opcional, EDS los genera nativos), (c) /markup/* → Function App.</w:t>
-      </w:r>
-    </w:p>
-    <w:p>
-      <w:pPr>
-        <w:pStyle w:val="ListNumber"/>
-      </w:pPr>
-      <w:r>
-        <w:t>Configurar dominio custom en Front Door (ej. asisa-pc.azurefd.net).</w:t>
-      </w:r>
-    </w:p>
-    <w:p>
-      <w:pPr>
-        <w:pStyle w:val="ListNumber"/>
-      </w:pPr>
-      <w:r>
-        <w:t>Crear un workflow GitHub Actions que despliega a Azure Functions en cada push.</w:t>
-      </w:r>
-    </w:p>
-    <w:p>
-      <w:pPr>
-        <w:pStyle w:val="ListNumber"/>
-      </w:pPr>
-      <w:r>
-        <w:t>Actualizar las URLs en los bloques (blocks/*/*.js — buscar "asisa-pc.vercel.app" y reemplazar). Ojo: hay ~10 ficheros con la URL hardcodeada.</w:t>
-      </w:r>
-    </w:p>
-    <w:p>
-      <w:pPr>
-        <w:pStyle w:val="ListNumber"/>
-      </w:pPr>
-      <w:r>
-        <w:t>Actualizar head.html: las tres líneas que cargan /etc.clientlibs/* deben apuntar al nuevo dominio Azure.</w:t>
-      </w:r>
-    </w:p>
-    <w:p>
-      <w:pPr>
-        <w:pStyle w:val="ListNumber"/>
-      </w:pPr>
-      <w:r>
-        <w:t>Actualizar api/markup.js: el template HTML inyecta tres &lt;link rel="stylesheet" href="https://asisa-pc.vercel.app/etc.clientlibs/..."&gt; — cambiar al nuevo dominio.</w:t>
-      </w:r>
-    </w:p>
-    <w:p>
-      <w:pPr>
-        <w:pStyle w:val="ListNumber"/>
-      </w:pPr>
-      <w:r>
-        <w:t>Hacer push a main (cambios de URL + nuevo workflow Azure).</w:t>
-      </w:r>
-    </w:p>
-    <w:p>
-      <w:pPr>
-        <w:pStyle w:val="ListNumber"/>
-      </w:pPr>
-      <w:r>
-        <w:t>Ejecutar POST /code refresh para que EDS recoja head.html y los bloques nuevos.</w:t>
-      </w:r>
-    </w:p>
-    <w:p>
-      <w:pPr>
-        <w:pStyle w:val="ListNumber"/>
-      </w:pPr>
-      <w:r>
-        <w:t>Modificar la sitewide config de EDS: cambiar content.overlay.url de https://asisa-pc.vercel.app/markup a https://asisa-pc.azurefd.net/markup (comando completo en §2.1). Requiere token config_admin.</w:t>
-      </w:r>
-    </w:p>
-    <w:p>
-      <w:pPr>
-        <w:pStyle w:val="ListNumber"/>
-      </w:pPr>
-      <w:r>
-        <w:t>Ejecutar `node refresh-eds-pages.mjs --reindex` para que EDS reconstruya sus índices apuntando al overlay nuevo.</w:t>
-      </w:r>
-    </w:p>
-    <w:p>
-      <w:pPr>
-        <w:pStyle w:val="ListNumber"/>
-      </w:pPr>
-      <w:r>
-        <w:t>Verificar: status de una URL de cuadro médico debe mostrar sourceLocation con el nuevo overlay; los bloques deben pintar datos correctamente; los 6 sitemaps deben responder 200 con XML válido.</w:t>
-      </w:r>
-    </w:p>
-    <w:p>
-      <w:pPr>
-        <w:pStyle w:val="ListNumber"/>
-      </w:pPr>
-      <w:r>
-        <w:t>Una vez verificado, retirar el proyecto Vercel (o dejarlo apagado un tiempo como backup).</w:t>
-      </w:r>
-    </w:p>
+        <w:t>11.1 URLs y dominios clave</w:t>
+      </w:r>
+    </w:p>
+    <w:tbl>
+      <w:tblPr>
+        <w:tblStyle w:val="LightGrid-Accent1"/>
+        <w:tblW w:type="auto" w:w="0"/>
+        <w:tblLook w:firstColumn="1" w:firstRow="1" w:lastColumn="0" w:lastRow="0" w:noHBand="0" w:noVBand="1" w:val="04A0"/>
+      </w:tblPr>
+      <w:tblGrid>
+        <w:gridCol w:w="4320"/>
+        <w:gridCol w:w="4320"/>
+      </w:tblGrid>
+      <w:tr>
+        <w:tc>
+          <w:tcPr>
+            <w:tcW w:type="dxa" w:w="3600"/>
+          </w:tcPr>
+          <w:p>
+            <w:r>
+              <w:rPr>
+                <w:b/>
+              </w:rPr>
+              <w:t>Entorno</w:t>
+            </w:r>
+          </w:p>
+        </w:tc>
+        <w:tc>
+          <w:tcPr>
+            <w:tcW w:type="dxa" w:w="5760"/>
+          </w:tcPr>
+          <w:p>
+            <w:r>
+              <w:rPr>
+                <w:b/>
+              </w:rPr>
+              <w:t>URL</w:t>
+            </w:r>
+          </w:p>
+        </w:tc>
+      </w:tr>
+      <w:tr>
+        <w:tc>
+          <w:tcPr>
+            <w:tcW w:type="dxa" w:w="3600"/>
+          </w:tcPr>
+          <w:p>
+            <w:r>
+              <w:t>EDS Live (público)</w:t>
+            </w:r>
+          </w:p>
+        </w:tc>
+        <w:tc>
+          <w:tcPr>
+            <w:tcW w:type="dxa" w:w="5760"/>
+          </w:tcPr>
+          <w:p>
+            <w:r>
+              <w:t>https://main--asisa-pc--asisa-softtek.aem.live</w:t>
+            </w:r>
+          </w:p>
+        </w:tc>
+      </w:tr>
+      <w:tr>
+        <w:tc>
+          <w:tcPr>
+            <w:tcW w:type="dxa" w:w="3600"/>
+          </w:tcPr>
+          <w:p>
+            <w:r>
+              <w:t>EDS Preview (autenticado)</w:t>
+            </w:r>
+          </w:p>
+        </w:tc>
+        <w:tc>
+          <w:tcPr>
+            <w:tcW w:type="dxa" w:w="5760"/>
+          </w:tcPr>
+          <w:p>
+            <w:r>
+              <w:t>https://main--asisa-pc--asisa-softtek.aem.page</w:t>
+            </w:r>
+          </w:p>
+        </w:tc>
+      </w:tr>
+      <w:tr>
+        <w:tc>
+          <w:tcPr>
+            <w:tcW w:type="dxa" w:w="3600"/>
+          </w:tcPr>
+          <w:p>
+            <w:r>
+              <w:t>Vercel (overlay + APIs)</w:t>
+            </w:r>
+          </w:p>
+        </w:tc>
+        <w:tc>
+          <w:tcPr>
+            <w:tcW w:type="dxa" w:w="5760"/>
+          </w:tcPr>
+          <w:p>
+            <w:r>
+              <w:t>https://asisa-pc.vercel.app</w:t>
+            </w:r>
+          </w:p>
+        </w:tc>
+      </w:tr>
+      <w:tr>
+        <w:tc>
+          <w:tcPr>
+            <w:tcW w:type="dxa" w:w="3600"/>
+          </w:tcPr>
+          <w:p>
+            <w:r>
+              <w:t>AEM Author</w:t>
+            </w:r>
+          </w:p>
+        </w:tc>
+        <w:tc>
+          <w:tcPr>
+            <w:tcW w:type="dxa" w:w="5760"/>
+          </w:tcPr>
+          <w:p>
+            <w:r>
+              <w:t>https://author-p133185-e1320482.adobeaemcloud.com</w:t>
+            </w:r>
+          </w:p>
+        </w:tc>
+      </w:tr>
+      <w:tr>
+        <w:tc>
+          <w:tcPr>
+            <w:tcW w:type="dxa" w:w="3600"/>
+          </w:tcPr>
+          <w:p>
+            <w:r>
+              <w:t>Admin HLX API</w:t>
+            </w:r>
+          </w:p>
+        </w:tc>
+        <w:tc>
+          <w:tcPr>
+            <w:tcW w:type="dxa" w:w="5760"/>
+          </w:tcPr>
+          <w:p>
+            <w:r>
+              <w:t>https://admin.hlx.page</w:t>
+            </w:r>
+          </w:p>
+        </w:tc>
+      </w:tr>
+      <w:tr>
+        <w:tc>
+          <w:tcPr>
+            <w:tcW w:type="dxa" w:w="3600"/>
+          </w:tcPr>
+          <w:p>
+            <w:r>
+              <w:t>GitHub repo</w:t>
+            </w:r>
+          </w:p>
+        </w:tc>
+        <w:tc>
+          <w:tcPr>
+            <w:tcW w:type="dxa" w:w="5760"/>
+          </w:tcPr>
+          <w:p>
+            <w:r>
+              <w:t>https://github.com/asisa-softtek/asisa-pc</w:t>
+            </w:r>
+          </w:p>
+        </w:tc>
+      </w:tr>
+      <w:tr>
+        <w:tc>
+          <w:tcPr>
+            <w:tcW w:type="dxa" w:w="3600"/>
+          </w:tcPr>
+          <w:p>
+            <w:r>
+              <w:t>Producción final (target)</w:t>
+            </w:r>
+          </w:p>
+        </w:tc>
+        <w:tc>
+          <w:tcPr>
+            <w:tcW w:type="dxa" w:w="5760"/>
+          </w:tcPr>
+          <w:p>
+            <w:r>
+              <w:t>https://www.asisa.es</w:t>
+            </w:r>
+          </w:p>
+        </w:tc>
+      </w:tr>
+    </w:tbl>
     <w:p>
       <w:pPr>
         <w:pStyle w:val="Heading2"/>
       </w:pPr>
       <w:r>
-        <w:t>8.4 Puntos delicados de la migración</w:t>
-      </w:r>
-    </w:p>
-    <w:p>
-      <w:pPr>
-        <w:pStyle w:val="ListBullet"/>
-      </w:pPr>
-      <w:r>
-        <w:t>Cold starts: Azure Functions en Consumption Plan puede tener cold starts &gt;2s, inaceptable para el overlay BYOM (EDS hace request y el HTML aparece en LCP). Usar Premium Plan o Always-On.</w:t>
-      </w:r>
-    </w:p>
-    <w:p>
-      <w:pPr>
-        <w:pStyle w:val="ListBullet"/>
-      </w:pPr>
-      <w:r>
-        <w:t>Imports entre funciones: api/markup.js importa de api/sitemap.js y api/sitemap-cuadro-medico.js. En Vercel cada función se bundlea independiente; en Azure Functions v4 hay que configurar el packaging para compartir código vía shared/.</w:t>
-      </w:r>
-    </w:p>
-    <w:p>
-      <w:pPr>
-        <w:pStyle w:val="ListBullet"/>
-      </w:pPr>
-      <w:r>
-        <w:t>Tamaño del deploy: con 33.000 ficheros JSON en data/ el bundle de cada función es enorme. Si NO se usa Blob Storage, hay que aumentar los límites de deploy en Azure (default ~250MB).</w:t>
-      </w:r>
-    </w:p>
-    <w:p>
-      <w:pPr>
-        <w:pStyle w:val="ListBullet"/>
-      </w:pPr>
-      <w:r>
-        <w:t>CORS: las APIs necesitan Access-Control-Allow-Origin: * porque los bloques en aem.live hacen fetch cross-origin. Configurar explícitamente en host.json o vía Front Door rules.</w:t>
-      </w:r>
-    </w:p>
-    <w:p>
-      <w:pPr>
-        <w:pStyle w:val="ListBullet"/>
-      </w:pPr>
-      <w:r>
-        <w:t>Permisos EDS: hace falta el token config_admin (cuenta técnica de Adobe) para cambiar la sitewide config. jorge.lorenzo@ext.softtek.com NO tiene ese rol. Localizar al técnico de Adobe (proyecto en https://developer.adobe.com/console) antes de empezar la migración.</w:t>
-      </w:r>
-    </w:p>
-    <w:p>
-      <w:pPr>
-        <w:pStyle w:val="ListBullet"/>
-      </w:pPr>
-      <w:r>
-        <w:t>Rollback: mientras Azure no esté validado, mantener Vercel funcional. Para volver, basta con un nuevo POST sitewide config apuntando de nuevo al overlay Vercel.</w:t>
-      </w:r>
-    </w:p>
-    <w:p>
-      <w:r>
-        <w:br w:type="page"/>
-      </w:r>
-    </w:p>
-    <w:p>
-      <w:pPr>
-        <w:pStyle w:val="Heading1"/>
-      </w:pPr>
-      <w:r>
-        <w:t>9. Operación día a día</w:t>
-      </w:r>
-    </w:p>
-    <w:p>
-      <w:pPr>
-        <w:pStyle w:val="Heading2"/>
-      </w:pPr>
-      <w:r>
-        <w:t>9.1 Tras cambiar JS o CSS de un bloque</w:t>
-      </w:r>
-    </w:p>
-    <w:p>
-      <w:pPr>
-        <w:pStyle w:val="ListNumber"/>
-      </w:pPr>
-      <w:r>
-        <w:t>Commit + push a main.</w:t>
-      </w:r>
-    </w:p>
-    <w:p>
-      <w:pPr>
-        <w:pStyle w:val="ListNumber"/>
-      </w:pPr>
-      <w:r>
-        <w:t>Si AEM Code Sync está activo en el repo, EDS se entera solo. Si no: POST /code refresh.</w:t>
-      </w:r>
-    </w:p>
-    <w:p>
-      <w:pPr>
-        <w:pStyle w:val="ListNumber"/>
-      </w:pPr>
-      <w:r>
-        <w:t>NO hace falta re-publicar páginas; los bloques se ejecutan en cliente.</w:t>
-      </w:r>
-    </w:p>
-    <w:p>
-      <w:pPr>
-        <w:pStyle w:val="Heading2"/>
-      </w:pPr>
-      <w:r>
-        <w:t>9.2 Tras cambiar head.html</w:t>
-      </w:r>
-    </w:p>
-    <w:p>
-      <w:pPr>
-        <w:pStyle w:val="ListNumber"/>
-      </w:pPr>
-      <w:r>
-        <w:t>Commit + push.</w:t>
-      </w:r>
-    </w:p>
-    <w:p>
-      <w:pPr>
-        <w:pStyle w:val="ListNumber"/>
-      </w:pPr>
-      <w:r>
-        <w:t>POST /code refresh.</w:t>
-      </w:r>
-    </w:p>
-    <w:p>
-      <w:pPr>
-        <w:pStyle w:val="ListNumber"/>
-      </w:pPr>
-      <w:r>
-        <w:t>POST /preview y /live para CADA URL afectada — head.html se inlinea en el HTML procesado, no se sirve dinámicamente. Para masivo: `node refresh-eds-pages.mjs` (sin flags = todo).</w:t>
-      </w:r>
-    </w:p>
-    <w:p>
-      <w:pPr>
-        <w:pStyle w:val="Heading2"/>
-      </w:pPr>
-      <w:r>
-        <w:t>9.3 Tras cambiar la plantilla en api/markup.js</w:t>
-      </w:r>
-    </w:p>
-    <w:p>
-      <w:pPr>
-        <w:pStyle w:val="ListNumber"/>
-      </w:pPr>
-      <w:r>
-        <w:t>Commit + push.</w:t>
-      </w:r>
-    </w:p>
-    <w:p>
-      <w:pPr>
-        <w:pStyle w:val="ListNumber"/>
-      </w:pPr>
-      <w:r>
-        <w:t>Deploy a Vercel (o Azure tras migración).</w:t>
-      </w:r>
-    </w:p>
-    <w:p>
-      <w:pPr>
-        <w:pStyle w:val="ListNumber"/>
-      </w:pPr>
-      <w:r>
-        <w:t>`node refresh-eds-pages.mjs` para re-previewar todas las URLs dinámicas — EDS re-fetcha del overlay.</w:t>
-      </w:r>
-    </w:p>
-    <w:p>
-      <w:pPr>
-        <w:pStyle w:val="Heading2"/>
-      </w:pPr>
-      <w:r>
-        <w:t>9.4 Tras actualizar datos (data/*.json)</w:t>
-      </w:r>
-    </w:p>
-    <w:p>
-      <w:pPr>
-        <w:pStyle w:val="ListNumber"/>
-      </w:pPr>
-      <w:r>
-        <w:t>Commit + push a main (los workflows de GH Actions ejecutan los generate-* y commitean los JSON resultantes en data/).</w:t>
-      </w:r>
-    </w:p>
-    <w:p>
-      <w:pPr>
-        <w:pStyle w:val="ListNumber"/>
-      </w:pPr>
-      <w:r>
-        <w:t>Vercel/Azure recoge los datos en el siguiente deploy. Si Blob Storage, los datos son visibles inmediatamente sin redeploy.</w:t>
-      </w:r>
-    </w:p>
-    <w:p>
-      <w:pPr>
-        <w:pStyle w:val="ListNumber"/>
-      </w:pPr>
-      <w:r>
-        <w:t>Los bloques fetchean datos en runtime, así que NO hace falta re-publicar páginas.</w:t>
-      </w:r>
-    </w:p>
-    <w:p>
-      <w:pPr>
-        <w:pStyle w:val="Heading2"/>
-      </w:pPr>
-      <w:r>
-        <w:t>9.5 Verificación rápida del estado del sistema</w:t>
-      </w:r>
-    </w:p>
-    <w:p>
-      <w:pPr>
-        <w:pStyle w:val="Code"/>
-        <w:shd w:fill="F4F4F4" w:val="clear"/>
-      </w:pPr>
-      <w:r>
-        <w:t># Health check del overlay</w:t>
-      </w:r>
-    </w:p>
-    <w:p>
-      <w:pPr>
-        <w:pStyle w:val="Code"/>
-        <w:shd w:fill="F4F4F4" w:val="clear"/>
-      </w:pPr>
-      <w:r>
-        <w:t>curl -sI https://asisa-pc.vercel.app/markup/cuadro-medico/p/madrid</w:t>
-      </w:r>
-    </w:p>
-    <w:p>
-      <w:pPr>
-        <w:pStyle w:val="Code"/>
-        <w:shd w:fill="F4F4F4" w:val="clear"/>
-      </w:pPr>
-      <w:r>
-        <w:t># → HTTP 200, x-source: template:provincia</w:t>
-      </w:r>
-    </w:p>
-    <w:p>
-      <w:pPr>
-        <w:pStyle w:val="Code"/>
-        <w:shd w:fill="F4F4F4" w:val="clear"/>
-      </w:pPr>
-      <w:r>
-        <w:t xml:space="preserve"> </w:t>
-      </w:r>
-    </w:p>
-    <w:p>
-      <w:pPr>
-        <w:pStyle w:val="Code"/>
-        <w:shd w:fill="F4F4F4" w:val="clear"/>
-      </w:pPr>
-      <w:r>
-        <w:t># Health check de una API</w:t>
-      </w:r>
-    </w:p>
-    <w:p>
-      <w:pPr>
-        <w:pStyle w:val="Code"/>
-        <w:shd w:fill="F4F4F4" w:val="clear"/>
-      </w:pPr>
-      <w:r>
-        <w:t>curl -s "https://asisa-pc.vercel.app/api/provincias" | jq "length"</w:t>
-      </w:r>
-    </w:p>
-    <w:p>
-      <w:pPr>
-        <w:pStyle w:val="Code"/>
-        <w:shd w:fill="F4F4F4" w:val="clear"/>
-      </w:pPr>
-      <w:r>
-        <w:t># → 52</w:t>
-      </w:r>
-    </w:p>
-    <w:p>
-      <w:pPr>
-        <w:pStyle w:val="Code"/>
-        <w:shd w:fill="F4F4F4" w:val="clear"/>
-      </w:pPr>
-      <w:r>
-        <w:t xml:space="preserve"> </w:t>
-      </w:r>
-    </w:p>
-    <w:p>
-      <w:pPr>
-        <w:pStyle w:val="Code"/>
-        <w:shd w:fill="F4F4F4" w:val="clear"/>
-      </w:pPr>
-      <w:r>
-        <w:t># Status de una URL en EDS</w:t>
-      </w:r>
-    </w:p>
-    <w:p>
-      <w:pPr>
-        <w:pStyle w:val="Code"/>
-        <w:shd w:fill="F4F4F4" w:val="clear"/>
-      </w:pPr>
-      <w:r>
-        <w:t>curl https://admin.hlx.page/status/asisa-softtek/asisa-pc/main/cuadro-medico/p/madrid</w:t>
-      </w:r>
-    </w:p>
-    <w:p>
-      <w:pPr>
-        <w:pStyle w:val="Code"/>
-        <w:shd w:fill="F4F4F4" w:val="clear"/>
-      </w:pPr>
-      <w:r>
-        <w:t># → preview/live status 200, sourceLocation apuntando al overlay</w:t>
-      </w:r>
-    </w:p>
-    <w:p>
-      <w:pPr>
-        <w:pStyle w:val="Code"/>
-        <w:shd w:fill="F4F4F4" w:val="clear"/>
-      </w:pPr>
-      <w:r>
-        <w:t xml:space="preserve"> </w:t>
-      </w:r>
-    </w:p>
-    <w:p>
-      <w:pPr>
-        <w:pStyle w:val="Code"/>
-        <w:shd w:fill="F4F4F4" w:val="clear"/>
-      </w:pPr>
-      <w:r>
-        <w:t># Sitemap de un tipo</w:t>
-      </w:r>
-    </w:p>
-    <w:p>
-      <w:pPr>
-        <w:pStyle w:val="Code"/>
-        <w:shd w:fill="F4F4F4" w:val="clear"/>
-      </w:pPr>
-      <w:r>
-        <w:t>curl --compressed https://main--asisa-pc--asisa-softtek.aem.live/sitemap-cuadro-medico-provincias.xml</w:t>
-      </w:r>
-    </w:p>
-    <w:p>
-      <w:pPr>
-        <w:pStyle w:val="Code"/>
-        <w:shd w:fill="F4F4F4" w:val="clear"/>
-      </w:pPr>
-      <w:r>
-        <w:t># → XML con 52 &lt;url&gt;</w:t>
-      </w:r>
-    </w:p>
-    <w:p>
-      <w:pPr>
-        <w:pStyle w:val="Heading1"/>
-      </w:pPr>
-      <w:r>
-        <w:t>10. Troubleshooting</w:t>
+        <w:t>11.2 Variables de entorno y secretos</w:t>
       </w:r>
     </w:p>
     <w:tbl>
@@ -14173,40 +14186,40 @@
       <w:tr>
         <w:tc>
           <w:tcPr>
-            <w:tcW w:type="dxa" w:w="3168"/>
+            <w:tcW w:type="dxa" w:w="2880"/>
           </w:tcPr>
           <w:p>
             <w:r>
               <w:rPr>
                 <w:b/>
               </w:rPr>
-              <w:t>Síntoma</w:t>
-            </w:r>
-          </w:p>
-        </w:tc>
-        <w:tc>
-          <w:tcPr>
-            <w:tcW w:type="dxa" w:w="2880"/>
+              <w:t>Variable</w:t>
+            </w:r>
+          </w:p>
+        </w:tc>
+        <w:tc>
+          <w:tcPr>
+            <w:tcW w:type="dxa" w:w="3600"/>
           </w:tcPr>
           <w:p>
             <w:r>
               <w:rPr>
                 <w:b/>
               </w:rPr>
-              <w:t>Causa probable</w:t>
-            </w:r>
-          </w:p>
-        </w:tc>
-        <w:tc>
-          <w:tcPr>
-            <w:tcW w:type="dxa" w:w="3312"/>
+              <w:t>Uso</w:t>
+            </w:r>
+          </w:p>
+        </w:tc>
+        <w:tc>
+          <w:tcPr>
+            <w:tcW w:type="dxa" w:w="2880"/>
           </w:tcPr>
           <w:p>
             <w:r>
               <w:rPr>
                 <w:b/>
               </w:rPr>
-              <w:t>Solución</w:t>
+              <w:t>Dónde se configura</w:t>
             </w:r>
           </w:p>
         </w:tc>
@@ -14214,31 +14227,31 @@
       <w:tr>
         <w:tc>
           <w:tcPr>
-            <w:tcW w:type="dxa" w:w="3168"/>
-          </w:tcPr>
-          <w:p>
-            <w:r>
-              <w:t>Página dinámica devuelve 404 desde aem.live</w:t>
-            </w:r>
-          </w:p>
-        </w:tc>
-        <w:tc>
-          <w:tcPr>
             <w:tcW w:type="dxa" w:w="2880"/>
           </w:tcPr>
           <w:p>
             <w:r>
-              <w:t>La URL no ha sido previsualizada/publicada en EDS</w:t>
-            </w:r>
-          </w:p>
-        </w:tc>
-        <w:tc>
-          <w:tcPr>
-            <w:tcW w:type="dxa" w:w="3312"/>
-          </w:tcPr>
-          <w:p>
-            <w:r>
-              <w:t>POST /preview + POST /live para esa URL (o node refresh-eds-pages.mjs)</w:t>
+              <w:t>HLX_ADMIN_API_TOKEN</w:t>
+            </w:r>
+          </w:p>
+        </w:tc>
+        <w:tc>
+          <w:tcPr>
+            <w:tcW w:type="dxa" w:w="3600"/>
+          </w:tcPr>
+          <w:p>
+            <w:r>
+              <w:t>Token admin EDS para POST /preview, /live, /code, /index</w:t>
+            </w:r>
+          </w:p>
+        </w:tc>
+        <w:tc>
+          <w:tcPr>
+            <w:tcW w:type="dxa" w:w="2880"/>
+          </w:tcPr>
+          <w:p>
+            <w:r>
+              <w:t>Local (export) o GitHub Secret</w:t>
             </w:r>
           </w:p>
         </w:tc>
@@ -14246,31 +14259,31 @@
       <w:tr>
         <w:tc>
           <w:tcPr>
-            <w:tcW w:type="dxa" w:w="3168"/>
-          </w:tcPr>
-          <w:p>
-            <w:r>
-              <w:t>Bloque no carga datos ("No se pudieron cargar")</w:t>
-            </w:r>
-          </w:p>
-        </w:tc>
-        <w:tc>
-          <w:tcPr>
             <w:tcW w:type="dxa" w:w="2880"/>
           </w:tcPr>
           <w:p>
             <w:r>
-              <w:t>fetch relativo en lugar de absoluto</w:t>
-            </w:r>
-          </w:p>
-        </w:tc>
-        <w:tc>
-          <w:tcPr>
-            <w:tcW w:type="dxa" w:w="3312"/>
-          </w:tcPr>
-          <w:p>
-            <w:r>
-              <w:t>Cambiar fetch("/api/...") por fetch("https://&lt;overlay&gt;/api/...")</w:t>
+              <w:t>AEM_TOKEN</w:t>
+            </w:r>
+          </w:p>
+        </w:tc>
+        <w:tc>
+          <w:tcPr>
+            <w:tcW w:type="dxa" w:w="3600"/>
+          </w:tcPr>
+          <w:p>
+            <w:r>
+              <w:t>Token de AEM Author para create-aem-pages.mjs</w:t>
+            </w:r>
+          </w:p>
+        </w:tc>
+        <w:tc>
+          <w:tcPr>
+            <w:tcW w:type="dxa" w:w="2880"/>
+          </w:tcPr>
+          <w:p>
+            <w:r>
+              <w:t>Local (export)</w:t>
             </w:r>
           </w:p>
         </w:tc>
@@ -14278,31 +14291,31 @@
       <w:tr>
         <w:tc>
           <w:tcPr>
-            <w:tcW w:type="dxa" w:w="3168"/>
-          </w:tcPr>
-          <w:p>
-            <w:r>
-              <w:t>Página "en blanco" sin estilos</w:t>
-            </w:r>
-          </w:p>
-        </w:tc>
-        <w:tc>
-          <w:tcPr>
             <w:tcW w:type="dxa" w:w="2880"/>
           </w:tcPr>
           <w:p>
             <w:r>
-              <w:t>Falta las clientlibs CSS de ASISA</w:t>
-            </w:r>
-          </w:p>
-        </w:tc>
-        <w:tc>
-          <w:tcPr>
-            <w:tcW w:type="dxa" w:w="3312"/>
-          </w:tcPr>
-          <w:p>
-            <w:r>
-              <w:t>Comprobar que api/markup.js inyecta los &lt;link&gt; a /etc.clientlibs/* y que el rewrite apunta correctamente</w:t>
+              <w:t>SYNC_SECRET</w:t>
+            </w:r>
+          </w:p>
+        </w:tc>
+        <w:tc>
+          <w:tcPr>
+            <w:tcW w:type="dxa" w:w="3600"/>
+          </w:tcPr>
+          <w:p>
+            <w:r>
+              <w:t>Shared secret para api/sync-aem.js</w:t>
+            </w:r>
+          </w:p>
+        </w:tc>
+        <w:tc>
+          <w:tcPr>
+            <w:tcW w:type="dxa" w:w="2880"/>
+          </w:tcPr>
+          <w:p>
+            <w:r>
+              <w:t>Vercel env</w:t>
             </w:r>
           </w:p>
         </w:tc>
@@ -14310,31 +14323,31 @@
       <w:tr>
         <w:tc>
           <w:tcPr>
-            <w:tcW w:type="dxa" w:w="3168"/>
-          </w:tcPr>
-          <w:p>
-            <w:r>
-              <w:t>Cambio en api/markup.js no se ve</w:t>
-            </w:r>
-          </w:p>
-        </w:tc>
-        <w:tc>
-          <w:tcPr>
             <w:tcW w:type="dxa" w:w="2880"/>
           </w:tcPr>
           <w:p>
             <w:r>
-              <w:t>EDS cachea el HTML procesado</w:t>
-            </w:r>
-          </w:p>
-        </w:tc>
-        <w:tc>
-          <w:tcPr>
-            <w:tcW w:type="dxa" w:w="3312"/>
-          </w:tcPr>
-          <w:p>
-            <w:r>
-              <w:t>POST /preview + POST /live para cada URL</w:t>
+              <w:t>FORCE</w:t>
+            </w:r>
+          </w:p>
+        </w:tc>
+        <w:tc>
+          <w:tcPr>
+            <w:tcW w:type="dxa" w:w="3600"/>
+          </w:tcPr>
+          <w:p>
+            <w:r>
+              <w:t>Flag para forzar regeneración en los generate-*.mjs</w:t>
+            </w:r>
+          </w:p>
+        </w:tc>
+        <w:tc>
+          <w:tcPr>
+            <w:tcW w:type="dxa" w:w="2880"/>
+          </w:tcPr>
+          <w:p>
+            <w:r>
+              <w:t>CLI inline o input del workflow</w:t>
             </w:r>
           </w:p>
         </w:tc>
@@ -14342,43 +14355,21 @@
       <w:tr>
         <w:tc>
           <w:tcPr>
-            <w:tcW w:type="dxa" w:w="3168"/>
-          </w:tcPr>
-          <w:p>
-            <w:r>
-              <w:t>POST /config devuelve 401</w:t>
-            </w:r>
-          </w:p>
-        </w:tc>
-        <w:tc>
-          <w:tcPr>
             <w:tcW w:type="dxa" w:w="2880"/>
           </w:tcPr>
           <w:p>
             <w:r>
-              <w:t>Usuario no está en config_admin</w:t>
-            </w:r>
-          </w:p>
-        </w:tc>
-        <w:tc>
-          <w:tcPr>
-            <w:tcW w:type="dxa" w:w="3312"/>
-          </w:tcPr>
-          <w:p>
-            <w:r>
-              <w:t>Usar el token de la cuenta técnica de Adobe</w:t>
-            </w:r>
-          </w:p>
-        </w:tc>
-      </w:tr>
-      <w:tr>
-        <w:tc>
-          <w:tcPr>
-            <w:tcW w:type="dxa" w:w="3168"/>
-          </w:tcPr>
-          <w:p>
-            <w:r>
-              <w:t>/query-index.json devuelve 413</w:t>
+              <w:t>PROVINCE_CODE</w:t>
+            </w:r>
+          </w:p>
+        </w:tc>
+        <w:tc>
+          <w:tcPr>
+            <w:tcW w:type="dxa" w:w="3600"/>
+          </w:tcPr>
+          <w:p>
+            <w:r>
+              <w:t>Restringe el scrape a una provincia</w:t>
             </w:r>
           </w:p>
         </w:tc>
@@ -14388,113 +14379,7 @@
           </w:tcPr>
           <w:p>
             <w:r>
-              <w:t>Más de 6MB (límite de Lambda interno de EDS)</w:t>
-            </w:r>
-          </w:p>
-        </w:tc>
-        <w:tc>
-          <w:tcPr>
-            <w:tcW w:type="dxa" w:w="3312"/>
-          </w:tcPr>
-          <w:p>
-            <w:r>
-              <w:t>helix-query.yaml define 6 índices con excludes para mantener cada query-index.json bajo el límite.</w:t>
-            </w:r>
-          </w:p>
-        </w:tc>
-      </w:tr>
-      <w:tr>
-        <w:tc>
-          <w:tcPr>
-            <w:tcW w:type="dxa" w:w="3168"/>
-          </w:tcPr>
-          <w:p>
-            <w:r>
-              <w:t>Vercel no auto-despliega tras push</w:t>
-            </w:r>
-          </w:p>
-        </w:tc>
-        <w:tc>
-          <w:tcPr>
-            <w:tcW w:type="dxa" w:w="2880"/>
-          </w:tcPr>
-          <w:p>
-            <w:r>
-              <w:t>El conector GitHub-Vercel está desconectado</w:t>
-            </w:r>
-          </w:p>
-        </w:tc>
-        <w:tc>
-          <w:tcPr>
-            <w:tcW w:type="dxa" w:w="3312"/>
-          </w:tcPr>
-          <w:p>
-            <w:r>
-              <w:t>Lanzar manualmente `vercel deploy --prod --archive=tgz`</w:t>
-            </w:r>
-          </w:p>
-        </w:tc>
-      </w:tr>
-      <w:tr>
-        <w:tc>
-          <w:tcPr>
-            <w:tcW w:type="dxa" w:w="3168"/>
-          </w:tcPr>
-          <w:p>
-            <w:r>
-              <w:t>Sitemap viene en bytes binarios</w:t>
-            </w:r>
-          </w:p>
-        </w:tc>
-        <w:tc>
-          <w:tcPr>
-            <w:tcW w:type="dxa" w:w="2880"/>
-          </w:tcPr>
-          <w:p>
-            <w:r>
-              <w:t>Comprimido en Brotli</w:t>
-            </w:r>
-          </w:p>
-        </w:tc>
-        <w:tc>
-          <w:tcPr>
-            <w:tcW w:type="dxa" w:w="3312"/>
-          </w:tcPr>
-          <w:p>
-            <w:r>
-              <w:t>Añadir --compressed al curl</w:t>
-            </w:r>
-          </w:p>
-        </w:tc>
-      </w:tr>
-      <w:tr>
-        <w:tc>
-          <w:tcPr>
-            <w:tcW w:type="dxa" w:w="3168"/>
-          </w:tcPr>
-          <w:p>
-            <w:r>
-              <w:t>POST /preview/sitemap-*.xml devuelve 415</w:t>
-            </w:r>
-          </w:p>
-        </w:tc>
-        <w:tc>
-          <w:tcPr>
-            <w:tcW w:type="dxa" w:w="2880"/>
-          </w:tcPr>
-          <w:p>
-            <w:r>
-              <w:t>El content-bus de EDS rechaza XML por el pipeline de preview</w:t>
-            </w:r>
-          </w:p>
-        </w:tc>
-        <w:tc>
-          <w:tcPr>
-            <w:tcW w:type="dxa" w:w="3312"/>
-          </w:tcPr>
-          <w:p>
-            <w:r>
-              <w:t>No es bloqueante: EDS genera los sitemaps nativamente vía helix-sitemap.yaml sin necesidad de preview/live</w:t>
+              <w:t>CLI inline</w:t>
             </w:r>
           </w:p>
         </w:tc>
@@ -14502,18 +14387,42 @@
     </w:tbl>
     <w:p>
       <w:pPr>
-        <w:pStyle w:val="Heading1"/>
-      </w:pPr>
-      <w:r>
-        <w:t>11. Apéndices</w:t>
-      </w:r>
-    </w:p>
-    <w:p>
-      <w:pPr>
         <w:pStyle w:val="Heading2"/>
       </w:pPr>
       <w:r>
-        <w:t>11.1 URLs y dominios clave</w:t>
+        <w:t>11.3 Docs internas del proyecto</w:t>
+      </w:r>
+    </w:p>
+    <w:p>
+      <w:pPr>
+        <w:pStyle w:val="ListBullet"/>
+      </w:pPr>
+      <w:r>
+        <w:t>docs/byom.md — explicación detallada del setup BYOM, los 3 POSTs de configuración, troubleshooting y permisos.</w:t>
+      </w:r>
+    </w:p>
+    <w:p>
+      <w:pPr>
+        <w:pStyle w:val="ListBullet"/>
+      </w:pPr>
+      <w:r>
+        <w:t>docs/estructura-proyecto.md — referencia fichero por fichero de todo el repo, con URLs en vivo donde inspeccionar cada pieza.</w:t>
+      </w:r>
+    </w:p>
+    <w:p>
+      <w:pPr>
+        <w:pStyle w:val="ListBullet"/>
+      </w:pPr>
+      <w:r>
+        <w:t>docs/traspaso-conocimiento.docx — este documento.</w:t>
+      </w:r>
+    </w:p>
+    <w:p>
+      <w:pPr>
+        <w:pStyle w:val="Heading2"/>
+      </w:pPr>
+      <w:r>
+        <w:t>11.4 Glosario rápido</w:t>
       </w:r>
     </w:p>
     <w:tbl>
@@ -14529,460 +14438,6 @@
       <w:tr>
         <w:tc>
           <w:tcPr>
-            <w:tcW w:type="dxa" w:w="3600"/>
-          </w:tcPr>
-          <w:p>
-            <w:r>
-              <w:rPr>
-                <w:b/>
-              </w:rPr>
-              <w:t>Entorno</w:t>
-            </w:r>
-          </w:p>
-        </w:tc>
-        <w:tc>
-          <w:tcPr>
-            <w:tcW w:type="dxa" w:w="5760"/>
-          </w:tcPr>
-          <w:p>
-            <w:r>
-              <w:rPr>
-                <w:b/>
-              </w:rPr>
-              <w:t>URL</w:t>
-            </w:r>
-          </w:p>
-        </w:tc>
-      </w:tr>
-      <w:tr>
-        <w:tc>
-          <w:tcPr>
-            <w:tcW w:type="dxa" w:w="3600"/>
-          </w:tcPr>
-          <w:p>
-            <w:r>
-              <w:t>EDS Live (público)</w:t>
-            </w:r>
-          </w:p>
-        </w:tc>
-        <w:tc>
-          <w:tcPr>
-            <w:tcW w:type="dxa" w:w="5760"/>
-          </w:tcPr>
-          <w:p>
-            <w:r>
-              <w:t>https://main--asisa-pc--asisa-softtek.aem.live</w:t>
-            </w:r>
-          </w:p>
-        </w:tc>
-      </w:tr>
-      <w:tr>
-        <w:tc>
-          <w:tcPr>
-            <w:tcW w:type="dxa" w:w="3600"/>
-          </w:tcPr>
-          <w:p>
-            <w:r>
-              <w:t>EDS Preview (autenticado)</w:t>
-            </w:r>
-          </w:p>
-        </w:tc>
-        <w:tc>
-          <w:tcPr>
-            <w:tcW w:type="dxa" w:w="5760"/>
-          </w:tcPr>
-          <w:p>
-            <w:r>
-              <w:t>https://main--asisa-pc--asisa-softtek.aem.page</w:t>
-            </w:r>
-          </w:p>
-        </w:tc>
-      </w:tr>
-      <w:tr>
-        <w:tc>
-          <w:tcPr>
-            <w:tcW w:type="dxa" w:w="3600"/>
-          </w:tcPr>
-          <w:p>
-            <w:r>
-              <w:t>Vercel (overlay + APIs)</w:t>
-            </w:r>
-          </w:p>
-        </w:tc>
-        <w:tc>
-          <w:tcPr>
-            <w:tcW w:type="dxa" w:w="5760"/>
-          </w:tcPr>
-          <w:p>
-            <w:r>
-              <w:t>https://asisa-pc.vercel.app</w:t>
-            </w:r>
-          </w:p>
-        </w:tc>
-      </w:tr>
-      <w:tr>
-        <w:tc>
-          <w:tcPr>
-            <w:tcW w:type="dxa" w:w="3600"/>
-          </w:tcPr>
-          <w:p>
-            <w:r>
-              <w:t>AEM Author</w:t>
-            </w:r>
-          </w:p>
-        </w:tc>
-        <w:tc>
-          <w:tcPr>
-            <w:tcW w:type="dxa" w:w="5760"/>
-          </w:tcPr>
-          <w:p>
-            <w:r>
-              <w:t>https://author-p133185-e1320482.adobeaemcloud.com</w:t>
-            </w:r>
-          </w:p>
-        </w:tc>
-      </w:tr>
-      <w:tr>
-        <w:tc>
-          <w:tcPr>
-            <w:tcW w:type="dxa" w:w="3600"/>
-          </w:tcPr>
-          <w:p>
-            <w:r>
-              <w:t>Admin HLX API</w:t>
-            </w:r>
-          </w:p>
-        </w:tc>
-        <w:tc>
-          <w:tcPr>
-            <w:tcW w:type="dxa" w:w="5760"/>
-          </w:tcPr>
-          <w:p>
-            <w:r>
-              <w:t>https://admin.hlx.page</w:t>
-            </w:r>
-          </w:p>
-        </w:tc>
-      </w:tr>
-      <w:tr>
-        <w:tc>
-          <w:tcPr>
-            <w:tcW w:type="dxa" w:w="3600"/>
-          </w:tcPr>
-          <w:p>
-            <w:r>
-              <w:t>GitHub repo</w:t>
-            </w:r>
-          </w:p>
-        </w:tc>
-        <w:tc>
-          <w:tcPr>
-            <w:tcW w:type="dxa" w:w="5760"/>
-          </w:tcPr>
-          <w:p>
-            <w:r>
-              <w:t>https://github.com/asisa-softtek/asisa-pc</w:t>
-            </w:r>
-          </w:p>
-        </w:tc>
-      </w:tr>
-      <w:tr>
-        <w:tc>
-          <w:tcPr>
-            <w:tcW w:type="dxa" w:w="3600"/>
-          </w:tcPr>
-          <w:p>
-            <w:r>
-              <w:t>Producción final (target)</w:t>
-            </w:r>
-          </w:p>
-        </w:tc>
-        <w:tc>
-          <w:tcPr>
-            <w:tcW w:type="dxa" w:w="5760"/>
-          </w:tcPr>
-          <w:p>
-            <w:r>
-              <w:t>https://www.asisa.es</w:t>
-            </w:r>
-          </w:p>
-        </w:tc>
-      </w:tr>
-    </w:tbl>
-    <w:p>
-      <w:pPr>
-        <w:pStyle w:val="Heading2"/>
-      </w:pPr>
-      <w:r>
-        <w:t>11.2 Variables de entorno y secretos</w:t>
-      </w:r>
-    </w:p>
-    <w:tbl>
-      <w:tblPr>
-        <w:tblStyle w:val="LightGrid-Accent1"/>
-        <w:tblW w:type="auto" w:w="0"/>
-        <w:tblLook w:firstColumn="1" w:firstRow="1" w:lastColumn="0" w:lastRow="0" w:noHBand="0" w:noVBand="1" w:val="04A0"/>
-      </w:tblPr>
-      <w:tblGrid>
-        <w:gridCol w:w="2880"/>
-        <w:gridCol w:w="2880"/>
-        <w:gridCol w:w="2880"/>
-      </w:tblGrid>
-      <w:tr>
-        <w:tc>
-          <w:tcPr>
-            <w:tcW w:type="dxa" w:w="2880"/>
-          </w:tcPr>
-          <w:p>
-            <w:r>
-              <w:rPr>
-                <w:b/>
-              </w:rPr>
-              <w:t>Variable</w:t>
-            </w:r>
-          </w:p>
-        </w:tc>
-        <w:tc>
-          <w:tcPr>
-            <w:tcW w:type="dxa" w:w="3600"/>
-          </w:tcPr>
-          <w:p>
-            <w:r>
-              <w:rPr>
-                <w:b/>
-              </w:rPr>
-              <w:t>Uso</w:t>
-            </w:r>
-          </w:p>
-        </w:tc>
-        <w:tc>
-          <w:tcPr>
-            <w:tcW w:type="dxa" w:w="2880"/>
-          </w:tcPr>
-          <w:p>
-            <w:r>
-              <w:rPr>
-                <w:b/>
-              </w:rPr>
-              <w:t>Dónde se configura</w:t>
-            </w:r>
-          </w:p>
-        </w:tc>
-      </w:tr>
-      <w:tr>
-        <w:tc>
-          <w:tcPr>
-            <w:tcW w:type="dxa" w:w="2880"/>
-          </w:tcPr>
-          <w:p>
-            <w:r>
-              <w:t>HLX_ADMIN_API_TOKEN</w:t>
-            </w:r>
-          </w:p>
-        </w:tc>
-        <w:tc>
-          <w:tcPr>
-            <w:tcW w:type="dxa" w:w="3600"/>
-          </w:tcPr>
-          <w:p>
-            <w:r>
-              <w:t>Token admin EDS para POST /preview, /live, /code, /index</w:t>
-            </w:r>
-          </w:p>
-        </w:tc>
-        <w:tc>
-          <w:tcPr>
-            <w:tcW w:type="dxa" w:w="2880"/>
-          </w:tcPr>
-          <w:p>
-            <w:r>
-              <w:t>Local (export) o GitHub Secret</w:t>
-            </w:r>
-          </w:p>
-        </w:tc>
-      </w:tr>
-      <w:tr>
-        <w:tc>
-          <w:tcPr>
-            <w:tcW w:type="dxa" w:w="2880"/>
-          </w:tcPr>
-          <w:p>
-            <w:r>
-              <w:t>AEM_TOKEN</w:t>
-            </w:r>
-          </w:p>
-        </w:tc>
-        <w:tc>
-          <w:tcPr>
-            <w:tcW w:type="dxa" w:w="3600"/>
-          </w:tcPr>
-          <w:p>
-            <w:r>
-              <w:t>Token de AEM Author para create-aem-pages.mjs</w:t>
-            </w:r>
-          </w:p>
-        </w:tc>
-        <w:tc>
-          <w:tcPr>
-            <w:tcW w:type="dxa" w:w="2880"/>
-          </w:tcPr>
-          <w:p>
-            <w:r>
-              <w:t>Local (export)</w:t>
-            </w:r>
-          </w:p>
-        </w:tc>
-      </w:tr>
-      <w:tr>
-        <w:tc>
-          <w:tcPr>
-            <w:tcW w:type="dxa" w:w="2880"/>
-          </w:tcPr>
-          <w:p>
-            <w:r>
-              <w:t>SYNC_SECRET</w:t>
-            </w:r>
-          </w:p>
-        </w:tc>
-        <w:tc>
-          <w:tcPr>
-            <w:tcW w:type="dxa" w:w="3600"/>
-          </w:tcPr>
-          <w:p>
-            <w:r>
-              <w:t>Shared secret para api/sync-aem.js</w:t>
-            </w:r>
-          </w:p>
-        </w:tc>
-        <w:tc>
-          <w:tcPr>
-            <w:tcW w:type="dxa" w:w="2880"/>
-          </w:tcPr>
-          <w:p>
-            <w:r>
-              <w:t>Vercel env / Azure Function App settings</w:t>
-            </w:r>
-          </w:p>
-        </w:tc>
-      </w:tr>
-      <w:tr>
-        <w:tc>
-          <w:tcPr>
-            <w:tcW w:type="dxa" w:w="2880"/>
-          </w:tcPr>
-          <w:p>
-            <w:r>
-              <w:t>FORCE</w:t>
-            </w:r>
-          </w:p>
-        </w:tc>
-        <w:tc>
-          <w:tcPr>
-            <w:tcW w:type="dxa" w:w="3600"/>
-          </w:tcPr>
-          <w:p>
-            <w:r>
-              <w:t>Flag para forzar regeneración en los generate-*.mjs</w:t>
-            </w:r>
-          </w:p>
-        </w:tc>
-        <w:tc>
-          <w:tcPr>
-            <w:tcW w:type="dxa" w:w="2880"/>
-          </w:tcPr>
-          <w:p>
-            <w:r>
-              <w:t>CLI inline o input del workflow</w:t>
-            </w:r>
-          </w:p>
-        </w:tc>
-      </w:tr>
-      <w:tr>
-        <w:tc>
-          <w:tcPr>
-            <w:tcW w:type="dxa" w:w="2880"/>
-          </w:tcPr>
-          <w:p>
-            <w:r>
-              <w:t>PROVINCE_CODE</w:t>
-            </w:r>
-          </w:p>
-        </w:tc>
-        <w:tc>
-          <w:tcPr>
-            <w:tcW w:type="dxa" w:w="3600"/>
-          </w:tcPr>
-          <w:p>
-            <w:r>
-              <w:t>Restringe el scrape a una provincia</w:t>
-            </w:r>
-          </w:p>
-        </w:tc>
-        <w:tc>
-          <w:tcPr>
-            <w:tcW w:type="dxa" w:w="2880"/>
-          </w:tcPr>
-          <w:p>
-            <w:r>
-              <w:t>CLI inline</w:t>
-            </w:r>
-          </w:p>
-        </w:tc>
-      </w:tr>
-    </w:tbl>
-    <w:p>
-      <w:pPr>
-        <w:pStyle w:val="Heading2"/>
-      </w:pPr>
-      <w:r>
-        <w:t>11.3 Docs internas del proyecto</w:t>
-      </w:r>
-    </w:p>
-    <w:p>
-      <w:pPr>
-        <w:pStyle w:val="ListBullet"/>
-      </w:pPr>
-      <w:r>
-        <w:t>docs/byom.md — explicación detallada del setup BYOM, los 3 POSTs de configuración, troubleshooting y permisos.</w:t>
-      </w:r>
-    </w:p>
-    <w:p>
-      <w:pPr>
-        <w:pStyle w:val="ListBullet"/>
-      </w:pPr>
-      <w:r>
-        <w:t>docs/estructura-proyecto.md — referencia fichero por fichero de todo el repo, con URLs en vivo donde inspeccionar cada pieza.</w:t>
-      </w:r>
-    </w:p>
-    <w:p>
-      <w:pPr>
-        <w:pStyle w:val="ListBullet"/>
-      </w:pPr>
-      <w:r>
-        <w:t>docs/traspaso-conocimiento.docx — este documento.</w:t>
-      </w:r>
-    </w:p>
-    <w:p>
-      <w:pPr>
-        <w:pStyle w:val="Heading2"/>
-      </w:pPr>
-      <w:r>
-        <w:t>11.4 Glosario rápido</w:t>
-      </w:r>
-    </w:p>
-    <w:tbl>
-      <w:tblPr>
-        <w:tblStyle w:val="LightGrid-Accent1"/>
-        <w:tblW w:type="auto" w:w="0"/>
-        <w:tblLook w:firstColumn="1" w:firstRow="1" w:lastColumn="0" w:lastRow="0" w:noHBand="0" w:noVBand="1" w:val="04A0"/>
-      </w:tblPr>
-      <w:tblGrid>
-        <w:gridCol w:w="4320"/>
-        <w:gridCol w:w="4320"/>
-      </w:tblGrid>
-      <w:tr>
-        <w:tc>
-          <w:tcPr>
             <w:tcW w:type="dxa" w:w="2880"/>
           </w:tcPr>
           <w:p>
@@ -15069,7 +14524,7 @@
           </w:tcPr>
           <w:p>
             <w:r>
-              <w:t>Servidor que devuelve el HTML para URLs dinámicas. Hoy en Vercel, mañana en Azure.</w:t>
+              <w:t>Servidor que devuelve el HTML para URLs dinámicas. Implementado en Vercel.</w:t>
             </w:r>
           </w:p>
         </w:tc>

</xml_diff>

<commit_message>
docs(handoff): add real example URL next to every path pattern + §12 anexo
The tables and bullet lists that mentioned URL patterns like
/cuadro-medico/p/<slug> had no concrete URL the reader could copy and
paste. Add a real example column next to the pattern in api/markup.js
detail (§3.4.1) and add a new §12 chapter "URLs de ejemplo para
probar" with the full battery: aem.live dynamic pages, sitemaps,
overlay direct URLs (with x-source header reference), JSON APIs,
admin.hlx.page operations, GitHub/Vercel links, AEM Author editor
and a 4-check quick health verification.

Co-Authored-By: Claude Opus 4.7 <noreply@anthropic.com>
</commit_message>
<xml_diff>
--- a/docs/traspaso-conocimiento.docx
+++ b/docs/traspaso-conocimiento.docx
@@ -3341,7 +3341,7 @@
     </w:tbl>
     <w:p>
       <w:r>
-        <w:t>Patrones de path reconocidos y qué genera cada uno:</w:t>
+        <w:t>Patrones de path reconocidos, ejemplo real y qué genera:</w:t>
       </w:r>
     </w:p>
     <w:tbl>
@@ -3351,14 +3351,15 @@
         <w:tblLook w:firstColumn="1" w:firstRow="1" w:lastColumn="0" w:lastRow="0" w:noHBand="0" w:noVBand="1" w:val="04A0"/>
       </w:tblPr>
       <w:tblGrid>
-        <w:gridCol w:w="2880"/>
-        <w:gridCol w:w="2880"/>
-        <w:gridCol w:w="2880"/>
+        <w:gridCol w:w="2160"/>
+        <w:gridCol w:w="2160"/>
+        <w:gridCol w:w="2160"/>
+        <w:gridCol w:w="2160"/>
       </w:tblGrid>
       <w:tr>
         <w:tc>
           <w:tcPr>
-            <w:tcW w:type="dxa" w:w="2592"/>
+            <w:tcW w:type="dxa" w:w="2304"/>
           </w:tcPr>
           <w:p>
             <w:r>
@@ -3378,20 +3379,33 @@
               <w:rPr>
                 <w:b/>
               </w:rPr>
-              <w:t>Función SSR</w:t>
-            </w:r>
-          </w:p>
-        </w:tc>
-        <w:tc>
-          <w:tcPr>
-            <w:tcW w:type="dxa" w:w="4176"/>
+              <w:t>Ejemplo real</w:t>
+            </w:r>
+          </w:p>
+        </w:tc>
+        <w:tc>
+          <w:tcPr>
+            <w:tcW w:type="dxa" w:w="2016"/>
           </w:tcPr>
           <w:p>
             <w:r>
               <w:rPr>
                 <w:b/>
               </w:rPr>
-              <w:t>Lo que emite en el HTML</w:t>
+              <w:t>Función SSR</w:t>
+            </w:r>
+          </w:p>
+        </w:tc>
+        <w:tc>
+          <w:tcPr>
+            <w:tcW w:type="dxa" w:w="2448"/>
+          </w:tcPr>
+          <w:p>
+            <w:r>
+              <w:rPr>
+                <w:b/>
+              </w:rPr>
+              <w:t>Lo que emite</w:t>
             </w:r>
           </w:p>
         </w:tc>
@@ -3399,17 +3413,27 @@
       <w:tr>
         <w:tc>
           <w:tcPr>
+            <w:tcW w:type="dxa" w:w="2304"/>
+          </w:tcPr>
+          <w:p>
+            <w:r>
+              <w:t>/cuadro-medico/p/&lt;slug&gt;</w:t>
+            </w:r>
+          </w:p>
+        </w:tc>
+        <w:tc>
+          <w:tcPr>
             <w:tcW w:type="dxa" w:w="2592"/>
           </w:tcPr>
           <w:p>
             <w:r>
-              <w:t>/cuadro-medico/p/&lt;slug&gt;</w:t>
-            </w:r>
-          </w:p>
-        </w:tc>
-        <w:tc>
-          <w:tcPr>
-            <w:tcW w:type="dxa" w:w="2592"/>
+              <w:t>/cuadro-medico/p/madrid</w:t>
+            </w:r>
+          </w:p>
+        </w:tc>
+        <w:tc>
+          <w:tcPr>
+            <w:tcW w:type="dxa" w:w="2016"/>
           </w:tcPr>
           <w:p>
             <w:r>
@@ -3419,11 +3443,11 @@
         </w:tc>
         <w:tc>
           <w:tcPr>
-            <w:tcW w:type="dxa" w:w="4176"/>
-          </w:tcPr>
-          <w:p>
-            <w:r>
-              <w:t>&lt;title&gt;, meta description, canonical, og tags, H1 "Cuadro Médico de ASISA en X", intro SEO, primeras 10 tarjetas de profesionales (eds-mp-card) con nombre real, especialidad, dirección, teléfono y link a la ficha. Bajo el listado: chips (eds-mp-other-specs) con las otras especialidades disponibles en la provincia.</w:t>
+            <w:tcW w:type="dxa" w:w="2448"/>
+          </w:tcPr>
+          <w:p>
+            <w:r>
+              <w:t>&lt;title&gt;, meta description, canonical, og tags, H1 "Cuadro Médico de ASISA en X", intro SEO, primeras 10 tarjetas (eds-mp-card) con nombre real, especialidad, dirección, teléfono y link a la ficha. Chips de otras especialidades en la provincia.</w:t>
             </w:r>
           </w:p>
         </w:tc>
@@ -3431,17 +3455,27 @@
       <w:tr>
         <w:tc>
           <w:tcPr>
+            <w:tcW w:type="dxa" w:w="2304"/>
+          </w:tcPr>
+          <w:p>
+            <w:r>
+              <w:t>/cuadro-medico/p/&lt;prov&gt;/pe/&lt;spec&gt;</w:t>
+            </w:r>
+          </w:p>
+        </w:tc>
+        <w:tc>
+          <w:tcPr>
             <w:tcW w:type="dxa" w:w="2592"/>
           </w:tcPr>
           <w:p>
             <w:r>
-              <w:t>/cuadro-medico/p/&lt;prov&gt;/pe/&lt;spec&gt;</w:t>
-            </w:r>
-          </w:p>
-        </w:tc>
-        <w:tc>
-          <w:tcPr>
-            <w:tcW w:type="dxa" w:w="2592"/>
+              <w:t>/cuadro-medico/p/madrid/pe/cardiologia</w:t>
+            </w:r>
+          </w:p>
+        </w:tc>
+        <w:tc>
+          <w:tcPr>
+            <w:tcW w:type="dxa" w:w="2016"/>
           </w:tcPr>
           <w:p>
             <w:r>
@@ -3451,11 +3485,11 @@
         </w:tc>
         <w:tc>
           <w:tcPr>
-            <w:tcW w:type="dxa" w:w="4176"/>
-          </w:tcPr>
-          <w:p>
-            <w:r>
-              <w:t>Mismo que arriba pero filtrado por especialidad: H1 "&lt;Spec&gt; en &lt;Provincia&gt;", 10 cards, chips de otras especialidades en la provincia y grid de otras provincias con esa especialidad (cm-otras-prov-card) con count de profesionales.</w:t>
+            <w:tcW w:type="dxa" w:w="2448"/>
+          </w:tcPr>
+          <w:p>
+            <w:r>
+              <w:t>Mismo que arriba filtrado por especialidad. H1 "&lt;Spec&gt; en &lt;Provincia&gt;", 10 cards, chips y grid de otras provincias con esa especialidad (cm-otras-prov-card).</w:t>
             </w:r>
           </w:p>
         </w:tc>
@@ -3463,17 +3497,27 @@
       <w:tr>
         <w:tc>
           <w:tcPr>
+            <w:tcW w:type="dxa" w:w="2304"/>
+          </w:tcPr>
+          <w:p>
+            <w:r>
+              <w:t>/cuadro-medico/e/&lt;slug&gt;</w:t>
+            </w:r>
+          </w:p>
+        </w:tc>
+        <w:tc>
+          <w:tcPr>
             <w:tcW w:type="dxa" w:w="2592"/>
           </w:tcPr>
           <w:p>
             <w:r>
-              <w:t>/cuadro-medico/e/&lt;slug&gt;</w:t>
-            </w:r>
-          </w:p>
-        </w:tc>
-        <w:tc>
-          <w:tcPr>
-            <w:tcW w:type="dxa" w:w="2592"/>
+              <w:t>/cuadro-medico/e/cardiologia</w:t>
+            </w:r>
+          </w:p>
+        </w:tc>
+        <w:tc>
+          <w:tcPr>
+            <w:tcW w:type="dxa" w:w="2016"/>
           </w:tcPr>
           <w:p>
             <w:r>
@@ -3483,7 +3527,7 @@
         </w:tc>
         <w:tc>
           <w:tcPr>
-            <w:tcW w:type="dxa" w:w="4176"/>
+            <w:tcW w:type="dxa" w:w="2448"/>
           </w:tcPr>
           <w:p>
             <w:r>
@@ -3495,17 +3539,27 @@
       <w:tr>
         <w:tc>
           <w:tcPr>
+            <w:tcW w:type="dxa" w:w="2304"/>
+          </w:tcPr>
+          <w:p>
+            <w:r>
+              <w:t>/cuadro-medico/d/&lt;key&gt;</w:t>
+            </w:r>
+          </w:p>
+        </w:tc>
+        <w:tc>
+          <w:tcPr>
             <w:tcW w:type="dxa" w:w="2592"/>
           </w:tcPr>
           <w:p>
             <w:r>
-              <w:t>/cuadro-medico/d/&lt;key&gt;</w:t>
-            </w:r>
-          </w:p>
-        </w:tc>
-        <w:tc>
-          <w:tcPr>
-            <w:tcW w:type="dxa" w:w="2592"/>
+              <w:t>/cuadro-medico/d/werenitzky-jose-282874657</w:t>
+            </w:r>
+          </w:p>
+        </w:tc>
+        <w:tc>
+          <w:tcPr>
+            <w:tcW w:type="dxa" w:w="2016"/>
           </w:tcPr>
           <w:p>
             <w:r>
@@ -3515,11 +3569,11 @@
         </w:tc>
         <w:tc>
           <w:tcPr>
-            <w:tcW w:type="dxa" w:w="4176"/>
-          </w:tcPr>
-          <w:p>
-            <w:r>
-              <w:t>H1 "&lt;Nombre del médico&gt;, &lt;Especialidad&gt;", intro, una card detallada por cada ubicación donde el médico pasa consulta (con link al centro padre), y 2 secciones de chips: otros médicos en la misma provincia + en el mismo centro.</w:t>
+            <w:tcW w:type="dxa" w:w="2448"/>
+          </w:tcPr>
+          <w:p>
+            <w:r>
+              <w:t>H1 "&lt;Nombre&gt;, &lt;Especialidad&gt;", intro, una card por cada ubicación donde el médico pasa consulta (con link al centro padre), y chips de otros médicos en la provincia + en el mismo centro.</w:t>
             </w:r>
           </w:p>
         </w:tc>
@@ -3527,17 +3581,27 @@
       <w:tr>
         <w:tc>
           <w:tcPr>
+            <w:tcW w:type="dxa" w:w="2304"/>
+          </w:tcPr>
+          <w:p>
+            <w:r>
+              <w:t>/cuadro-medico/c/&lt;key&gt;</w:t>
+            </w:r>
+          </w:p>
+        </w:tc>
+        <w:tc>
+          <w:tcPr>
             <w:tcW w:type="dxa" w:w="2592"/>
           </w:tcPr>
           <w:p>
             <w:r>
-              <w:t>/cuadro-medico/c/&lt;key&gt;</w:t>
-            </w:r>
-          </w:p>
-        </w:tc>
-        <w:tc>
-          <w:tcPr>
-            <w:tcW w:type="dxa" w:w="2592"/>
+              <w:t>/cuadro-medico/c/hospital-universitario-hla-moncloa</w:t>
+            </w:r>
+          </w:p>
+        </w:tc>
+        <w:tc>
+          <w:tcPr>
+            <w:tcW w:type="dxa" w:w="2016"/>
           </w:tcPr>
           <w:p>
             <w:r>
@@ -3547,11 +3611,11 @@
         </w:tc>
         <w:tc>
           <w:tcPr>
-            <w:tcW w:type="dxa" w:w="4176"/>
-          </w:tcPr>
-          <w:p>
-            <w:r>
-              <w:t>Breadcrumb, H1 "&lt;Centro&gt; en &lt;Provincia&gt;", intro, card principal del centro, sección con TODAS las especialidades y sus doctores asociados, grid completo de médicos del centro y sección de otros centros similares.</w:t>
+            <w:tcW w:type="dxa" w:w="2448"/>
+          </w:tcPr>
+          <w:p>
+            <w:r>
+              <w:t>Breadcrumb, H1 "&lt;Centro&gt; en &lt;Provincia&gt;", intro, card principal, sección con TODAS las especialidades y sus doctores, grid completo de médicos y sección de otros centros similares.</w:t>
             </w:r>
           </w:p>
         </w:tc>
@@ -3559,6 +3623,16 @@
       <w:tr>
         <w:tc>
           <w:tcPr>
+            <w:tcW w:type="dxa" w:w="2304"/>
+          </w:tcPr>
+          <w:p>
+            <w:r>
+              <w:t>/sitemap.xml</w:t>
+            </w:r>
+          </w:p>
+        </w:tc>
+        <w:tc>
+          <w:tcPr>
             <w:tcW w:type="dxa" w:w="2592"/>
           </w:tcPr>
           <w:p>
@@ -3569,7 +3643,7 @@
         </w:tc>
         <w:tc>
           <w:tcPr>
-            <w:tcW w:type="dxa" w:w="2592"/>
+            <w:tcW w:type="dxa" w:w="2016"/>
           </w:tcPr>
           <w:p>
             <w:r>
@@ -3579,7 +3653,7 @@
         </w:tc>
         <w:tc>
           <w:tcPr>
-            <w:tcW w:type="dxa" w:w="4176"/>
+            <w:tcW w:type="dxa" w:w="2448"/>
           </w:tcPr>
           <w:p>
             <w:r>
@@ -3591,17 +3665,27 @@
       <w:tr>
         <w:tc>
           <w:tcPr>
+            <w:tcW w:type="dxa" w:w="2304"/>
+          </w:tcPr>
+          <w:p>
+            <w:r>
+              <w:t>/sitemap-cuadro-medico-{tipo}.xml</w:t>
+            </w:r>
+          </w:p>
+        </w:tc>
+        <w:tc>
+          <w:tcPr>
             <w:tcW w:type="dxa" w:w="2592"/>
           </w:tcPr>
           <w:p>
             <w:r>
-              <w:t>/sitemap-cuadro-medico-{tipo}.xml</w:t>
-            </w:r>
-          </w:p>
-        </w:tc>
-        <w:tc>
-          <w:tcPr>
-            <w:tcW w:type="dxa" w:w="2592"/>
+              <w:t>/sitemap-cuadro-medico-doctores.xml</w:t>
+            </w:r>
+          </w:p>
+        </w:tc>
+        <w:tc>
+          <w:tcPr>
+            <w:tcW w:type="dxa" w:w="2016"/>
           </w:tcPr>
           <w:p>
             <w:r>
@@ -3611,11 +3695,11 @@
         </w:tc>
         <w:tc>
           <w:tcPr>
-            <w:tcW w:type="dxa" w:w="4176"/>
-          </w:tcPr>
-          <w:p>
-            <w:r>
-              <w:t>Delega en getCuadroMedicoSitemapXml(tipo) de api/sitemap-cuadro-medico.js.</w:t>
+            <w:tcW w:type="dxa" w:w="2448"/>
+          </w:tcPr>
+          <w:p>
+            <w:r>
+              <w:t>Delega en getCuadroMedicoSitemapXml(tipo) de api/sitemap-cuadro-medico.js. Tipos: provincias, provincia-specs, doctores, centros, especialidades.</w:t>
             </w:r>
           </w:p>
         </w:tc>
@@ -3623,17 +3707,27 @@
       <w:tr>
         <w:tc>
           <w:tcPr>
+            <w:tcW w:type="dxa" w:w="2304"/>
+          </w:tcPr>
+          <w:p>
+            <w:r>
+              <w:t>Cualquier otro</w:t>
+            </w:r>
+          </w:p>
+        </w:tc>
+        <w:tc>
+          <w:tcPr>
             <w:tcW w:type="dxa" w:w="2592"/>
           </w:tcPr>
           <w:p>
             <w:r>
-              <w:t>Cualquier otro</w:t>
-            </w:r>
-          </w:p>
-        </w:tc>
-        <w:tc>
-          <w:tcPr>
-            <w:tcW w:type="dxa" w:w="2592"/>
+              <w:t>/foo, /bar</w:t>
+            </w:r>
+          </w:p>
+        </w:tc>
+        <w:tc>
+          <w:tcPr>
+            <w:tcW w:type="dxa" w:w="2016"/>
           </w:tcPr>
           <w:p>
             <w:r>
@@ -3643,7 +3737,7 @@
         </w:tc>
         <w:tc>
           <w:tcPr>
-            <w:tcW w:type="dxa" w:w="4176"/>
+            <w:tcW w:type="dxa" w:w="2448"/>
           </w:tcPr>
           <w:p>
             <w:r>
@@ -16208,6 +16302,1127 @@
         </w:tc>
       </w:tr>
     </w:tbl>
+    <w:p>
+      <w:r>
+        <w:br w:type="page"/>
+      </w:r>
+    </w:p>
+    <w:p>
+      <w:pPr>
+        <w:pStyle w:val="Heading1"/>
+      </w:pPr>
+      <w:r>
+        <w:t>12. URLs de ejemplo para probar</w:t>
+      </w:r>
+    </w:p>
+    <w:p>
+      <w:r>
+        <w:t>Batería de URLs reales con datos confirmados en el catálogo. Útil para QA y para verificación rápida tras cualquier despliegue.</w:t>
+      </w:r>
+    </w:p>
+    <w:p>
+      <w:pPr>
+        <w:pStyle w:val="Heading2"/>
+      </w:pPr>
+      <w:r>
+        <w:t>12.1 Páginas dinámicas en aem.live (lo que ve el usuario)</w:t>
+      </w:r>
+    </w:p>
+    <w:p>
+      <w:r>
+        <w:t>Listado por provincia /cuadro-medico/p/&lt;slug&gt;:</w:t>
+      </w:r>
+    </w:p>
+    <w:p>
+      <w:pPr>
+        <w:pStyle w:val="Code"/>
+        <w:shd w:fill="F4F4F4" w:val="clear"/>
+      </w:pPr>
+      <w:r>
+        <w:t>https://main--asisa-pc--asisa-softtek.aem.live/cuadro-medico/p/madrid</w:t>
+      </w:r>
+    </w:p>
+    <w:p>
+      <w:pPr>
+        <w:pStyle w:val="Code"/>
+        <w:shd w:fill="F4F4F4" w:val="clear"/>
+      </w:pPr>
+      <w:r>
+        <w:t>https://main--asisa-pc--asisa-softtek.aem.live/cuadro-medico/p/barcelona</w:t>
+      </w:r>
+    </w:p>
+    <w:p>
+      <w:pPr>
+        <w:pStyle w:val="Code"/>
+        <w:shd w:fill="F4F4F4" w:val="clear"/>
+      </w:pPr>
+      <w:r>
+        <w:t>https://main--asisa-pc--asisa-softtek.aem.live/cuadro-medico/p/malaga</w:t>
+      </w:r>
+    </w:p>
+    <w:p>
+      <w:pPr>
+        <w:pStyle w:val="Code"/>
+        <w:shd w:fill="F4F4F4" w:val="clear"/>
+      </w:pPr>
+      <w:r>
+        <w:t>https://main--asisa-pc--asisa-softtek.aem.live/cuadro-medico/p/valencia</w:t>
+      </w:r>
+    </w:p>
+    <w:p>
+      <w:pPr>
+        <w:pStyle w:val="Code"/>
+        <w:shd w:fill="F4F4F4" w:val="clear"/>
+      </w:pPr>
+      <w:r>
+        <w:t>https://main--asisa-pc--asisa-softtek.aem.live/cuadro-medico/p/sevilla</w:t>
+      </w:r>
+    </w:p>
+    <w:p>
+      <w:r>
+        <w:t>Provincia + especialidad /cuadro-medico/p/&lt;prov&gt;/pe/&lt;spec&gt;:</w:t>
+      </w:r>
+    </w:p>
+    <w:p>
+      <w:pPr>
+        <w:pStyle w:val="Code"/>
+        <w:shd w:fill="F4F4F4" w:val="clear"/>
+      </w:pPr>
+      <w:r>
+        <w:t>https://main--asisa-pc--asisa-softtek.aem.live/cuadro-medico/p/madrid/pe/cardiologia</w:t>
+      </w:r>
+    </w:p>
+    <w:p>
+      <w:pPr>
+        <w:pStyle w:val="Code"/>
+        <w:shd w:fill="F4F4F4" w:val="clear"/>
+      </w:pPr>
+      <w:r>
+        <w:t>https://main--asisa-pc--asisa-softtek.aem.live/cuadro-medico/p/madrid/pe/dermatologia-medico-quirurgica-y-venereo</w:t>
+      </w:r>
+    </w:p>
+    <w:p>
+      <w:pPr>
+        <w:pStyle w:val="Code"/>
+        <w:shd w:fill="F4F4F4" w:val="clear"/>
+      </w:pPr>
+      <w:r>
+        <w:t>https://main--asisa-pc--asisa-softtek.aem.live/cuadro-medico/p/madrid/pe/pediatria</w:t>
+      </w:r>
+    </w:p>
+    <w:p>
+      <w:pPr>
+        <w:pStyle w:val="Code"/>
+        <w:shd w:fill="F4F4F4" w:val="clear"/>
+      </w:pPr>
+      <w:r>
+        <w:t>https://main--asisa-pc--asisa-softtek.aem.live/cuadro-medico/p/barcelona/pe/oftalmologia</w:t>
+      </w:r>
+    </w:p>
+    <w:p>
+      <w:pPr>
+        <w:pStyle w:val="Code"/>
+        <w:shd w:fill="F4F4F4" w:val="clear"/>
+      </w:pPr>
+      <w:r>
+        <w:t>https://main--asisa-pc--asisa-softtek.aem.live/cuadro-medico/p/malaga/pe/ginecologia-y-obstetricia</w:t>
+      </w:r>
+    </w:p>
+    <w:p>
+      <w:r>
+        <w:t>Especialidad nacional /cuadro-medico/e/&lt;slug&gt;:</w:t>
+      </w:r>
+    </w:p>
+    <w:p>
+      <w:pPr>
+        <w:pStyle w:val="Code"/>
+        <w:shd w:fill="F4F4F4" w:val="clear"/>
+      </w:pPr>
+      <w:r>
+        <w:t>https://main--asisa-pc--asisa-softtek.aem.live/cuadro-medico/e/cardiologia</w:t>
+      </w:r>
+    </w:p>
+    <w:p>
+      <w:pPr>
+        <w:pStyle w:val="Code"/>
+        <w:shd w:fill="F4F4F4" w:val="clear"/>
+      </w:pPr>
+      <w:r>
+        <w:t>https://main--asisa-pc--asisa-softtek.aem.live/cuadro-medico/e/dermatologia-medico-quirurgica-y-venereo</w:t>
+      </w:r>
+    </w:p>
+    <w:p>
+      <w:pPr>
+        <w:pStyle w:val="Code"/>
+        <w:shd w:fill="F4F4F4" w:val="clear"/>
+      </w:pPr>
+      <w:r>
+        <w:t>https://main--asisa-pc--asisa-softtek.aem.live/cuadro-medico/e/oftalmologia</w:t>
+      </w:r>
+    </w:p>
+    <w:p>
+      <w:pPr>
+        <w:pStyle w:val="Code"/>
+        <w:shd w:fill="F4F4F4" w:val="clear"/>
+      </w:pPr>
+      <w:r>
+        <w:t>https://main--asisa-pc--asisa-softtek.aem.live/cuadro-medico/e/pediatria</w:t>
+      </w:r>
+    </w:p>
+    <w:p>
+      <w:pPr>
+        <w:pStyle w:val="Code"/>
+        <w:shd w:fill="F4F4F4" w:val="clear"/>
+      </w:pPr>
+      <w:r>
+        <w:t>https://main--asisa-pc--asisa-softtek.aem.live/cuadro-medico/e/traumatologia-y-cirugia-ortopedica</w:t>
+      </w:r>
+    </w:p>
+    <w:p>
+      <w:r>
+        <w:t>Ficha de centro /cuadro-medico/c/&lt;key&gt;:</w:t>
+      </w:r>
+    </w:p>
+    <w:p>
+      <w:pPr>
+        <w:pStyle w:val="Code"/>
+        <w:shd w:fill="F4F4F4" w:val="clear"/>
+      </w:pPr>
+      <w:r>
+        <w:t># Madrid</w:t>
+      </w:r>
+    </w:p>
+    <w:p>
+      <w:pPr>
+        <w:pStyle w:val="Code"/>
+        <w:shd w:fill="F4F4F4" w:val="clear"/>
+      </w:pPr>
+      <w:r>
+        <w:t>https://main--asisa-pc--asisa-softtek.aem.live/cuadro-medico/c/hospital-quiron-san-jose</w:t>
+      </w:r>
+    </w:p>
+    <w:p>
+      <w:pPr>
+        <w:pStyle w:val="Code"/>
+        <w:shd w:fill="F4F4F4" w:val="clear"/>
+      </w:pPr>
+      <w:r>
+        <w:t>https://main--asisa-pc--asisa-softtek.aem.live/cuadro-medico/c/hospital-universitario-hla-moncloa</w:t>
+      </w:r>
+    </w:p>
+    <w:p>
+      <w:pPr>
+        <w:pStyle w:val="Code"/>
+        <w:shd w:fill="F4F4F4" w:val="clear"/>
+      </w:pPr>
+      <w:r>
+        <w:t>https://main--asisa-pc--asisa-softtek.aem.live/cuadro-medico/c/centro-medico-asisa-caracas</w:t>
+      </w:r>
+    </w:p>
+    <w:p>
+      <w:pPr>
+        <w:pStyle w:val="Code"/>
+        <w:shd w:fill="F4F4F4" w:val="clear"/>
+      </w:pPr>
+      <w:r>
+        <w:t xml:space="preserve"> </w:t>
+      </w:r>
+    </w:p>
+    <w:p>
+      <w:pPr>
+        <w:pStyle w:val="Code"/>
+        <w:shd w:fill="F4F4F4" w:val="clear"/>
+      </w:pPr>
+      <w:r>
+        <w:t># Barcelona</w:t>
+      </w:r>
+    </w:p>
+    <w:p>
+      <w:pPr>
+        <w:pStyle w:val="Code"/>
+        <w:shd w:fill="F4F4F4" w:val="clear"/>
+      </w:pPr>
+      <w:r>
+        <w:t>https://main--asisa-pc--asisa-softtek.aem.live/cuadro-medico/c/hospital-hm-nens</w:t>
+      </w:r>
+    </w:p>
+    <w:p>
+      <w:pPr>
+        <w:pStyle w:val="Code"/>
+        <w:shd w:fill="F4F4F4" w:val="clear"/>
+      </w:pPr>
+      <w:r>
+        <w:t>https://main--asisa-pc--asisa-softtek.aem.live/cuadro-medico/c/creu-groga</w:t>
+      </w:r>
+    </w:p>
+    <w:p>
+      <w:pPr>
+        <w:pStyle w:val="Code"/>
+        <w:shd w:fill="F4F4F4" w:val="clear"/>
+      </w:pPr>
+      <w:r>
+        <w:t xml:space="preserve"> </w:t>
+      </w:r>
+    </w:p>
+    <w:p>
+      <w:pPr>
+        <w:pStyle w:val="Code"/>
+        <w:shd w:fill="F4F4F4" w:val="clear"/>
+      </w:pPr>
+      <w:r>
+        <w:t># Málaga</w:t>
+      </w:r>
+    </w:p>
+    <w:p>
+      <w:pPr>
+        <w:pStyle w:val="Code"/>
+        <w:shd w:fill="F4F4F4" w:val="clear"/>
+      </w:pPr>
+      <w:r>
+        <w:t>https://main--asisa-pc--asisa-softtek.aem.live/cuadro-medico/c/hospital-hla-el-angel</w:t>
+      </w:r>
+    </w:p>
+    <w:p>
+      <w:pPr>
+        <w:pStyle w:val="Code"/>
+        <w:shd w:fill="F4F4F4" w:val="clear"/>
+      </w:pPr>
+      <w:r>
+        <w:t>https://main--asisa-pc--asisa-softtek.aem.live/cuadro-medico/c/clinica-sanisalud</w:t>
+      </w:r>
+    </w:p>
+    <w:p>
+      <w:pPr>
+        <w:pStyle w:val="Code"/>
+        <w:shd w:fill="F4F4F4" w:val="clear"/>
+      </w:pPr>
+      <w:r>
+        <w:t xml:space="preserve"> </w:t>
+      </w:r>
+    </w:p>
+    <w:p>
+      <w:pPr>
+        <w:pStyle w:val="Code"/>
+        <w:shd w:fill="F4F4F4" w:val="clear"/>
+      </w:pPr>
+      <w:r>
+        <w:t># Valencia</w:t>
+      </w:r>
+    </w:p>
+    <w:p>
+      <w:pPr>
+        <w:pStyle w:val="Code"/>
+        <w:shd w:fill="F4F4F4" w:val="clear"/>
+      </w:pPr>
+      <w:r>
+        <w:t>https://main--asisa-pc--asisa-softtek.aem.live/cuadro-medico/c/clinica-manises</w:t>
+      </w:r>
+    </w:p>
+    <w:p>
+      <w:r>
+        <w:t>Ficha de profesional /cuadro-medico/d/&lt;key&gt;:</w:t>
+      </w:r>
+    </w:p>
+    <w:p>
+      <w:pPr>
+        <w:pStyle w:val="Code"/>
+        <w:shd w:fill="F4F4F4" w:val="clear"/>
+      </w:pPr>
+      <w:r>
+        <w:t># Key correcto del índice doctores-index.json</w:t>
+      </w:r>
+    </w:p>
+    <w:p>
+      <w:pPr>
+        <w:pStyle w:val="Code"/>
+        <w:shd w:fill="F4F4F4" w:val="clear"/>
+      </w:pPr>
+      <w:r>
+        <w:t>https://main--asisa-pc--asisa-softtek.aem.live/cuadro-medico/d/werenitzky-jose-282874657</w:t>
+      </w:r>
+    </w:p>
+    <w:p>
+      <w:pPr>
+        <w:pStyle w:val="Code"/>
+        <w:shd w:fill="F4F4F4" w:val="clear"/>
+      </w:pPr>
+      <w:r>
+        <w:t>https://main--asisa-pc--asisa-softtek.aem.live/cuadro-medico/d/carbonell-martinez-antonio-303003327</w:t>
+      </w:r>
+    </w:p>
+    <w:p>
+      <w:pPr>
+        <w:pStyle w:val="Code"/>
+        <w:shd w:fill="F4F4F4" w:val="clear"/>
+      </w:pPr>
+      <w:r>
+        <w:t xml:space="preserve"> </w:t>
+      </w:r>
+    </w:p>
+    <w:p>
+      <w:pPr>
+        <w:pStyle w:val="Code"/>
+        <w:shd w:fill="F4F4F4" w:val="clear"/>
+      </w:pPr>
+      <w:r>
+        <w:t># Key con ID obsoleto — el fallback por slug del nombre lo resuelve</w:t>
+      </w:r>
+    </w:p>
+    <w:p>
+      <w:pPr>
+        <w:pStyle w:val="Code"/>
+        <w:shd w:fill="F4F4F4" w:val="clear"/>
+      </w:pPr>
+      <w:r>
+        <w:t>https://main--asisa-pc--asisa-softtek.aem.live/cuadro-medico/d/carbonell-martinez-antonio-2399368</w:t>
+      </w:r>
+    </w:p>
+    <w:p>
+      <w:pPr>
+        <w:pStyle w:val="Heading2"/>
+      </w:pPr>
+      <w:r>
+        <w:t>12.2 Sitemaps en aem.live</w:t>
+      </w:r>
+    </w:p>
+    <w:p>
+      <w:pPr>
+        <w:pStyle w:val="Code"/>
+        <w:shd w:fill="F4F4F4" w:val="clear"/>
+      </w:pPr>
+      <w:r>
+        <w:t>https://main--asisa-pc--asisa-softtek.aem.live/sitemap.xml</w:t>
+      </w:r>
+    </w:p>
+    <w:p>
+      <w:pPr>
+        <w:pStyle w:val="Code"/>
+        <w:shd w:fill="F4F4F4" w:val="clear"/>
+      </w:pPr>
+      <w:r>
+        <w:t>https://main--asisa-pc--asisa-softtek.aem.live/sitemap-cuadro-medico-provincias.xml</w:t>
+      </w:r>
+    </w:p>
+    <w:p>
+      <w:pPr>
+        <w:pStyle w:val="Code"/>
+        <w:shd w:fill="F4F4F4" w:val="clear"/>
+      </w:pPr>
+      <w:r>
+        <w:t>https://main--asisa-pc--asisa-softtek.aem.live/sitemap-cuadro-medico-provincia-specs.xml</w:t>
+      </w:r>
+    </w:p>
+    <w:p>
+      <w:pPr>
+        <w:pStyle w:val="Code"/>
+        <w:shd w:fill="F4F4F4" w:val="clear"/>
+      </w:pPr>
+      <w:r>
+        <w:t>https://main--asisa-pc--asisa-softtek.aem.live/sitemap-cuadro-medico-doctores.xml</w:t>
+      </w:r>
+    </w:p>
+    <w:p>
+      <w:pPr>
+        <w:pStyle w:val="Code"/>
+        <w:shd w:fill="F4F4F4" w:val="clear"/>
+      </w:pPr>
+      <w:r>
+        <w:t>https://main--asisa-pc--asisa-softtek.aem.live/sitemap-cuadro-medico-centros.xml</w:t>
+      </w:r>
+    </w:p>
+    <w:p>
+      <w:pPr>
+        <w:pStyle w:val="Code"/>
+        <w:shd w:fill="F4F4F4" w:val="clear"/>
+      </w:pPr>
+      <w:r>
+        <w:t>https://main--asisa-pc--asisa-softtek.aem.live/sitemap-cuadro-medico-especialidades.xml</w:t>
+      </w:r>
+    </w:p>
+    <w:p>
+      <w:r>
+        <w:t>Vienen comprimidos en Brotli. Usar curl --compressed para verlos en texto.</w:t>
+      </w:r>
+    </w:p>
+    <w:p>
+      <w:pPr>
+        <w:pStyle w:val="Heading2"/>
+      </w:pPr>
+      <w:r>
+        <w:t>12.3 Overlay Vercel directo (debug rápido sin caché EDS)</w:t>
+      </w:r>
+    </w:p>
+    <w:p>
+      <w:r>
+        <w:t>Saltarse EDS para ver exactamente qué devuelve el overlay:</w:t>
+      </w:r>
+    </w:p>
+    <w:p>
+      <w:pPr>
+        <w:pStyle w:val="Code"/>
+        <w:shd w:fill="F4F4F4" w:val="clear"/>
+      </w:pPr>
+      <w:r>
+        <w:t>https://asisa-pc.vercel.app/markup/cuadro-medico/p/madrid</w:t>
+      </w:r>
+    </w:p>
+    <w:p>
+      <w:pPr>
+        <w:pStyle w:val="Code"/>
+        <w:shd w:fill="F4F4F4" w:val="clear"/>
+      </w:pPr>
+      <w:r>
+        <w:t>https://asisa-pc.vercel.app/markup/cuadro-medico/p/madrid/pe/cardiologia</w:t>
+      </w:r>
+    </w:p>
+    <w:p>
+      <w:pPr>
+        <w:pStyle w:val="Code"/>
+        <w:shd w:fill="F4F4F4" w:val="clear"/>
+      </w:pPr>
+      <w:r>
+        <w:t>https://asisa-pc.vercel.app/markup/cuadro-medico/e/cardiologia</w:t>
+      </w:r>
+    </w:p>
+    <w:p>
+      <w:pPr>
+        <w:pStyle w:val="Code"/>
+        <w:shd w:fill="F4F4F4" w:val="clear"/>
+      </w:pPr>
+      <w:r>
+        <w:t>https://asisa-pc.vercel.app/markup/cuadro-medico/d/werenitzky-jose-282874657</w:t>
+      </w:r>
+    </w:p>
+    <w:p>
+      <w:pPr>
+        <w:pStyle w:val="Code"/>
+        <w:shd w:fill="F4F4F4" w:val="clear"/>
+      </w:pPr>
+      <w:r>
+        <w:t>https://asisa-pc.vercel.app/markup/cuadro-medico/c/hospital-universitario-hla-moncloa</w:t>
+      </w:r>
+    </w:p>
+    <w:p>
+      <w:pPr>
+        <w:pStyle w:val="Code"/>
+        <w:shd w:fill="F4F4F4" w:val="clear"/>
+      </w:pPr>
+      <w:r>
+        <w:t>https://asisa-pc.vercel.app/markup/sitemap.xml</w:t>
+      </w:r>
+    </w:p>
+    <w:p>
+      <w:pPr>
+        <w:pStyle w:val="Code"/>
+        <w:shd w:fill="F4F4F4" w:val="clear"/>
+      </w:pPr>
+      <w:r>
+        <w:t>https://asisa-pc.vercel.app/markup/sitemap-cuadro-medico-doctores.xml</w:t>
+      </w:r>
+    </w:p>
+    <w:p>
+      <w:r>
+        <w:t>El header x-source identifica qué rama del router del overlay procesó la petición: ssr:provincia, ssr:provincia-spec, ssr:especialidad, ssr:doctor, ssr:centro, sitemap:index, sitemap:&lt;tipo&gt;, overlay-pass.</w:t>
+      </w:r>
+    </w:p>
+    <w:p>
+      <w:pPr>
+        <w:pStyle w:val="Heading2"/>
+      </w:pPr>
+      <w:r>
+        <w:t>12.4 APIs JSON directas (lo que consumen los bloques cliente)</w:t>
+      </w:r>
+    </w:p>
+    <w:p>
+      <w:pPr>
+        <w:pStyle w:val="Code"/>
+        <w:shd w:fill="F4F4F4" w:val="clear"/>
+      </w:pPr>
+      <w:r>
+        <w:t># Listados</w:t>
+      </w:r>
+    </w:p>
+    <w:p>
+      <w:pPr>
+        <w:pStyle w:val="Code"/>
+        <w:shd w:fill="F4F4F4" w:val="clear"/>
+      </w:pPr>
+      <w:r>
+        <w:t>https://asisa-pc.vercel.app/api/provincias</w:t>
+      </w:r>
+    </w:p>
+    <w:p>
+      <w:pPr>
+        <w:pStyle w:val="Code"/>
+        <w:shd w:fill="F4F4F4" w:val="clear"/>
+      </w:pPr>
+      <w:r>
+        <w:t>https://asisa-pc.vercel.app/api/provincias?slug=madrid</w:t>
+      </w:r>
+    </w:p>
+    <w:p>
+      <w:pPr>
+        <w:pStyle w:val="Code"/>
+        <w:shd w:fill="F4F4F4" w:val="clear"/>
+      </w:pPr>
+      <w:r>
+        <w:t>https://asisa-pc.vercel.app/api/especialidades</w:t>
+      </w:r>
+    </w:p>
+    <w:p>
+      <w:pPr>
+        <w:pStyle w:val="Code"/>
+        <w:shd w:fill="F4F4F4" w:val="clear"/>
+      </w:pPr>
+      <w:r>
+        <w:t>https://asisa-pc.vercel.app/api/especialidades?slug=cardiologia</w:t>
+      </w:r>
+    </w:p>
+    <w:p>
+      <w:pPr>
+        <w:pStyle w:val="Code"/>
+        <w:shd w:fill="F4F4F4" w:val="clear"/>
+      </w:pPr>
+      <w:r>
+        <w:t xml:space="preserve"> </w:t>
+      </w:r>
+    </w:p>
+    <w:p>
+      <w:pPr>
+        <w:pStyle w:val="Code"/>
+        <w:shd w:fill="F4F4F4" w:val="clear"/>
+      </w:pPr>
+      <w:r>
+        <w:t># Búsqueda paginada</w:t>
+      </w:r>
+    </w:p>
+    <w:p>
+      <w:pPr>
+        <w:pStyle w:val="Code"/>
+        <w:shd w:fill="F4F4F4" w:val="clear"/>
+      </w:pPr>
+      <w:r>
+        <w:t>https://asisa-pc.vercel.app/api/providers?provinceSlug=madrid&amp;specSlug=cardiologia&amp;tab=professionals&amp;page=1&amp;limit=10</w:t>
+      </w:r>
+    </w:p>
+    <w:p>
+      <w:pPr>
+        <w:pStyle w:val="Code"/>
+        <w:shd w:fill="F4F4F4" w:val="clear"/>
+      </w:pPr>
+      <w:r>
+        <w:t>https://asisa-pc.vercel.app/api/providers?provinceSlug=madrid&amp;tab=centers&amp;page=1</w:t>
+      </w:r>
+    </w:p>
+    <w:p>
+      <w:pPr>
+        <w:pStyle w:val="Code"/>
+        <w:shd w:fill="F4F4F4" w:val="clear"/>
+      </w:pPr>
+      <w:r>
+        <w:t>https://asisa-pc.vercel.app/api/providers?specSlug=cardiologia&amp;tab=professionals  # nacional</w:t>
+      </w:r>
+    </w:p>
+    <w:p>
+      <w:pPr>
+        <w:pStyle w:val="Code"/>
+        <w:shd w:fill="F4F4F4" w:val="clear"/>
+      </w:pPr>
+      <w:r>
+        <w:t xml:space="preserve"> </w:t>
+      </w:r>
+    </w:p>
+    <w:p>
+      <w:pPr>
+        <w:pStyle w:val="Code"/>
+        <w:shd w:fill="F4F4F4" w:val="clear"/>
+      </w:pPr>
+      <w:r>
+        <w:t># Fichas</w:t>
+      </w:r>
+    </w:p>
+    <w:p>
+      <w:pPr>
+        <w:pStyle w:val="Code"/>
+        <w:shd w:fill="F4F4F4" w:val="clear"/>
+      </w:pPr>
+      <w:r>
+        <w:t>https://asisa-pc.vercel.app/api/doctor?key=werenitzky-jose-282874657</w:t>
+      </w:r>
+    </w:p>
+    <w:p>
+      <w:pPr>
+        <w:pStyle w:val="Code"/>
+        <w:shd w:fill="F4F4F4" w:val="clear"/>
+      </w:pPr>
+      <w:r>
+        <w:t>https://asisa-pc.vercel.app/api/centro?key=hospital-universitario-hla-moncloa</w:t>
+      </w:r>
+    </w:p>
+    <w:p>
+      <w:pPr>
+        <w:pStyle w:val="Code"/>
+        <w:shd w:fill="F4F4F4" w:val="clear"/>
+      </w:pPr>
+      <w:r>
+        <w:t>https://asisa-pc.vercel.app/api/providers-detail?id=12345</w:t>
+      </w:r>
+    </w:p>
+    <w:p>
+      <w:pPr>
+        <w:pStyle w:val="Code"/>
+        <w:shd w:fill="F4F4F4" w:val="clear"/>
+      </w:pPr>
+      <w:r>
+        <w:t xml:space="preserve"> </w:t>
+      </w:r>
+    </w:p>
+    <w:p>
+      <w:pPr>
+        <w:pStyle w:val="Code"/>
+        <w:shd w:fill="F4F4F4" w:val="clear"/>
+      </w:pPr>
+      <w:r>
+        <w:t># Proxy en vivo a backend ASISA</w:t>
+      </w:r>
+    </w:p>
+    <w:p>
+      <w:pPr>
+        <w:pStyle w:val="Code"/>
+        <w:shd w:fill="F4F4F4" w:val="clear"/>
+      </w:pPr>
+      <w:r>
+        <w:t>https://asisa-pc.vercel.app/api/specialities?provinceCode=28</w:t>
+      </w:r>
+    </w:p>
+    <w:p>
+      <w:pPr>
+        <w:pStyle w:val="Heading2"/>
+      </w:pPr>
+      <w:r>
+        <w:t>12.5 Operación (admin.hlx.page, no necesita token gracias a requireAuth: auto)</w:t>
+      </w:r>
+    </w:p>
+    <w:p>
+      <w:pPr>
+        <w:pStyle w:val="Code"/>
+        <w:shd w:fill="F4F4F4" w:val="clear"/>
+      </w:pPr>
+      <w:r>
+        <w:t># Estado de una URL en EDS</w:t>
+      </w:r>
+    </w:p>
+    <w:p>
+      <w:pPr>
+        <w:pStyle w:val="Code"/>
+        <w:shd w:fill="F4F4F4" w:val="clear"/>
+      </w:pPr>
+      <w:r>
+        <w:t>curl https://admin.hlx.page/status/asisa-softtek/asisa-pc/main/cuadro-medico/p/madrid</w:t>
+      </w:r>
+    </w:p>
+    <w:p>
+      <w:pPr>
+        <w:pStyle w:val="Code"/>
+        <w:shd w:fill="F4F4F4" w:val="clear"/>
+      </w:pPr>
+      <w:r>
+        <w:t xml:space="preserve"> </w:t>
+      </w:r>
+    </w:p>
+    <w:p>
+      <w:pPr>
+        <w:pStyle w:val="Code"/>
+        <w:shd w:fill="F4F4F4" w:val="clear"/>
+      </w:pPr>
+      <w:r>
+        <w:t># Repreviewar y publicar manualmente</w:t>
+      </w:r>
+    </w:p>
+    <w:p>
+      <w:pPr>
+        <w:pStyle w:val="Code"/>
+        <w:shd w:fill="F4F4F4" w:val="clear"/>
+      </w:pPr>
+      <w:r>
+        <w:t>curl -X POST https://admin.hlx.page/preview/asisa-softtek/asisa-pc/main/cuadro-medico/p/madrid</w:t>
+      </w:r>
+    </w:p>
+    <w:p>
+      <w:pPr>
+        <w:pStyle w:val="Code"/>
+        <w:shd w:fill="F4F4F4" w:val="clear"/>
+      </w:pPr>
+      <w:r>
+        <w:t>curl -X POST https://admin.hlx.page/live/asisa-softtek/asisa-pc/main/cuadro-medico/p/madrid</w:t>
+      </w:r>
+    </w:p>
+    <w:p>
+      <w:pPr>
+        <w:pStyle w:val="Code"/>
+        <w:shd w:fill="F4F4F4" w:val="clear"/>
+      </w:pPr>
+      <w:r>
+        <w:t xml:space="preserve"> </w:t>
+      </w:r>
+    </w:p>
+    <w:p>
+      <w:pPr>
+        <w:pStyle w:val="Code"/>
+        <w:shd w:fill="F4F4F4" w:val="clear"/>
+      </w:pPr>
+      <w:r>
+        <w:t># Refrescar code bus (tras tocar JS, CSS, head.html, YAMLs)</w:t>
+      </w:r>
+    </w:p>
+    <w:p>
+      <w:pPr>
+        <w:pStyle w:val="Code"/>
+        <w:shd w:fill="F4F4F4" w:val="clear"/>
+      </w:pPr>
+      <w:r>
+        <w:t>curl -X POST https://admin.hlx.page/code/asisa-softtek/asisa-pc/main</w:t>
+      </w:r>
+    </w:p>
+    <w:p>
+      <w:pPr>
+        <w:pStyle w:val="Code"/>
+        <w:shd w:fill="F4F4F4" w:val="clear"/>
+      </w:pPr>
+      <w:r>
+        <w:t xml:space="preserve"> </w:t>
+      </w:r>
+    </w:p>
+    <w:p>
+      <w:pPr>
+        <w:pStyle w:val="Code"/>
+        <w:shd w:fill="F4F4F4" w:val="clear"/>
+      </w:pPr>
+      <w:r>
+        <w:t># Repoblar query indexes tras cambiar helix-query.yaml</w:t>
+      </w:r>
+    </w:p>
+    <w:p>
+      <w:pPr>
+        <w:pStyle w:val="Code"/>
+        <w:shd w:fill="F4F4F4" w:val="clear"/>
+      </w:pPr>
+      <w:r>
+        <w:t>curl -X POST https://admin.hlx.page/index/asisa-softtek/asisa-pc/main/cuadro-medico/p/madrid</w:t>
+      </w:r>
+    </w:p>
+    <w:p>
+      <w:pPr>
+        <w:pStyle w:val="Code"/>
+        <w:shd w:fill="F4F4F4" w:val="clear"/>
+      </w:pPr>
+      <w:r>
+        <w:t xml:space="preserve"> </w:t>
+      </w:r>
+    </w:p>
+    <w:p>
+      <w:pPr>
+        <w:pStyle w:val="Code"/>
+        <w:shd w:fill="F4F4F4" w:val="clear"/>
+      </w:pPr>
+      <w:r>
+        <w:t># Refresco masivo del catálogo</w:t>
+      </w:r>
+    </w:p>
+    <w:p>
+      <w:pPr>
+        <w:pStyle w:val="Code"/>
+        <w:shd w:fill="F4F4F4" w:val="clear"/>
+      </w:pPr>
+      <w:r>
+        <w:t>node refresh-eds-pages.mjs                       # todo</w:t>
+      </w:r>
+    </w:p>
+    <w:p>
+      <w:pPr>
+        <w:pStyle w:val="Code"/>
+        <w:shd w:fill="F4F4F4" w:val="clear"/>
+      </w:pPr>
+      <w:r>
+        <w:t>node refresh-eds-pages.mjs --province=madrid     # solo una provincia + sus specs</w:t>
+      </w:r>
+    </w:p>
+    <w:p>
+      <w:pPr>
+        <w:pStyle w:val="Code"/>
+        <w:shd w:fill="F4F4F4" w:val="clear"/>
+      </w:pPr>
+      <w:r>
+        <w:t>node refresh-eds-pages.mjs --centros             # solo /c/*</w:t>
+      </w:r>
+    </w:p>
+    <w:p>
+      <w:pPr>
+        <w:pStyle w:val="Code"/>
+        <w:shd w:fill="F4F4F4" w:val="clear"/>
+      </w:pPr>
+      <w:r>
+        <w:t>node refresh-eds-pages.mjs --doctores            # solo /d/*</w:t>
+      </w:r>
+    </w:p>
+    <w:p>
+      <w:pPr>
+        <w:pStyle w:val="Code"/>
+        <w:shd w:fill="F4F4F4" w:val="clear"/>
+      </w:pPr>
+      <w:r>
+        <w:t>node refresh-eds-pages.mjs --sitemaps            # 6 sitemaps</w:t>
+      </w:r>
+    </w:p>
+    <w:p>
+      <w:pPr>
+        <w:pStyle w:val="Code"/>
+        <w:shd w:fill="F4F4F4" w:val="clear"/>
+      </w:pPr>
+      <w:r>
+        <w:t>node refresh-eds-pages.mjs --reindex             # repuebla query-index-*.json</w:t>
+      </w:r>
+    </w:p>
+    <w:p>
+      <w:pPr>
+        <w:pStyle w:val="Heading2"/>
+      </w:pPr>
+      <w:r>
+        <w:t>12.6 GitHub y Vercel</w:t>
+      </w:r>
+    </w:p>
+    <w:p>
+      <w:pPr>
+        <w:pStyle w:val="Code"/>
+        <w:shd w:fill="F4F4F4" w:val="clear"/>
+      </w:pPr>
+      <w:r>
+        <w:t># Repo</w:t>
+      </w:r>
+    </w:p>
+    <w:p>
+      <w:pPr>
+        <w:pStyle w:val="Code"/>
+        <w:shd w:fill="F4F4F4" w:val="clear"/>
+      </w:pPr>
+      <w:r>
+        <w:t>https://github.com/asisa-softtek/asisa-pc</w:t>
+      </w:r>
+    </w:p>
+    <w:p>
+      <w:pPr>
+        <w:pStyle w:val="Code"/>
+        <w:shd w:fill="F4F4F4" w:val="clear"/>
+      </w:pPr>
+      <w:r>
+        <w:t xml:space="preserve"> </w:t>
+      </w:r>
+    </w:p>
+    <w:p>
+      <w:pPr>
+        <w:pStyle w:val="Code"/>
+        <w:shd w:fill="F4F4F4" w:val="clear"/>
+      </w:pPr>
+      <w:r>
+        <w:t># Workflows (Actions)</w:t>
+      </w:r>
+    </w:p>
+    <w:p>
+      <w:pPr>
+        <w:pStyle w:val="Code"/>
+        <w:shd w:fill="F4F4F4" w:val="clear"/>
+      </w:pPr>
+      <w:r>
+        <w:t>https://github.com/asisa-softtek/asisa-pc/actions</w:t>
+      </w:r>
+    </w:p>
+    <w:p>
+      <w:pPr>
+        <w:pStyle w:val="Code"/>
+        <w:shd w:fill="F4F4F4" w:val="clear"/>
+      </w:pPr>
+      <w:r>
+        <w:t xml:space="preserve"> </w:t>
+      </w:r>
+    </w:p>
+    <w:p>
+      <w:pPr>
+        <w:pStyle w:val="Code"/>
+        <w:shd w:fill="F4F4F4" w:val="clear"/>
+      </w:pPr>
+      <w:r>
+        <w:t># Vercel deploy manual</w:t>
+      </w:r>
+    </w:p>
+    <w:p>
+      <w:pPr>
+        <w:pStyle w:val="Code"/>
+        <w:shd w:fill="F4F4F4" w:val="clear"/>
+      </w:pPr>
+      <w:r>
+        <w:t>vercel deploy --prod --yes --archive=tgz</w:t>
+      </w:r>
+    </w:p>
+    <w:p>
+      <w:pPr>
+        <w:pStyle w:val="Heading2"/>
+      </w:pPr>
+      <w:r>
+        <w:t>12.7 AEM Author</w:t>
+      </w:r>
+    </w:p>
+    <w:p>
+      <w:pPr>
+        <w:pStyle w:val="Code"/>
+        <w:shd w:fill="F4F4F4" w:val="clear"/>
+      </w:pPr>
+      <w:r>
+        <w:t># Editor</w:t>
+      </w:r>
+    </w:p>
+    <w:p>
+      <w:pPr>
+        <w:pStyle w:val="Code"/>
+        <w:shd w:fill="F4F4F4" w:val="clear"/>
+      </w:pPr>
+      <w:r>
+        <w:t>https://author-p133185-e1320482.adobeaemcloud.com/editor.html/content/site-pc/cuadro-medico/provincia.html</w:t>
+      </w:r>
+    </w:p>
+    <w:p>
+      <w:pPr>
+        <w:pStyle w:val="Code"/>
+        <w:shd w:fill="F4F4F4" w:val="clear"/>
+      </w:pPr>
+      <w:r>
+        <w:t xml:space="preserve"> </w:t>
+      </w:r>
+    </w:p>
+    <w:p>
+      <w:pPr>
+        <w:pStyle w:val="Code"/>
+        <w:shd w:fill="F4F4F4" w:val="clear"/>
+      </w:pPr>
+      <w:r>
+        <w:t># Path raíz del proyecto en AEM</w:t>
+      </w:r>
+    </w:p>
+    <w:p>
+      <w:pPr>
+        <w:pStyle w:val="Code"/>
+        <w:shd w:fill="F4F4F4" w:val="clear"/>
+      </w:pPr>
+      <w:r>
+        <w:t>/content/site-pc/</w:t>
+      </w:r>
+    </w:p>
+    <w:p>
+      <w:pPr>
+        <w:pStyle w:val="Heading2"/>
+      </w:pPr>
+      <w:r>
+        <w:t>12.8 Verificación rápida "todo funciona" (4 checks)</w:t>
+      </w:r>
+    </w:p>
+    <w:p>
+      <w:pPr>
+        <w:pStyle w:val="Code"/>
+        <w:shd w:fill="F4F4F4" w:val="clear"/>
+      </w:pPr>
+      <w:r>
+        <w:t>1) curl https://asisa-pc.vercel.app/api/provincias | jq length</w:t>
+      </w:r>
+    </w:p>
+    <w:p>
+      <w:pPr>
+        <w:pStyle w:val="Code"/>
+        <w:shd w:fill="F4F4F4" w:val="clear"/>
+      </w:pPr>
+      <w:r>
+        <w:t xml:space="preserve">   → 52</w:t>
+      </w:r>
+    </w:p>
+    <w:p>
+      <w:pPr>
+        <w:pStyle w:val="Code"/>
+        <w:shd w:fill="F4F4F4" w:val="clear"/>
+      </w:pPr>
+      <w:r>
+        <w:t xml:space="preserve"> </w:t>
+      </w:r>
+    </w:p>
+    <w:p>
+      <w:pPr>
+        <w:pStyle w:val="Code"/>
+        <w:shd w:fill="F4F4F4" w:val="clear"/>
+      </w:pPr>
+      <w:r>
+        <w:t>2) curl https://asisa-pc.vercel.app/markup/cuadro-medico/p/madrid -I</w:t>
+      </w:r>
+    </w:p>
+    <w:p>
+      <w:pPr>
+        <w:pStyle w:val="Code"/>
+        <w:shd w:fill="F4F4F4" w:val="clear"/>
+      </w:pPr>
+      <w:r>
+        <w:t xml:space="preserve">   → HTTP 200, x-source: ssr:provincia</w:t>
+      </w:r>
+    </w:p>
+    <w:p>
+      <w:pPr>
+        <w:pStyle w:val="Code"/>
+        <w:shd w:fill="F4F4F4" w:val="clear"/>
+      </w:pPr>
+      <w:r>
+        <w:t xml:space="preserve"> </w:t>
+      </w:r>
+    </w:p>
+    <w:p>
+      <w:pPr>
+        <w:pStyle w:val="Code"/>
+        <w:shd w:fill="F4F4F4" w:val="clear"/>
+      </w:pPr>
+      <w:r>
+        <w:t>3) curl https://main--asisa-pc--asisa-softtek.aem.live/cuadro-medico/p/madrid -I</w:t>
+      </w:r>
+    </w:p>
+    <w:p>
+      <w:pPr>
+        <w:pStyle w:val="Code"/>
+        <w:shd w:fill="F4F4F4" w:val="clear"/>
+      </w:pPr>
+      <w:r>
+        <w:t xml:space="preserve">   → HTTP 200, content-type: text/html</w:t>
+      </w:r>
+    </w:p>
+    <w:p>
+      <w:pPr>
+        <w:pStyle w:val="Code"/>
+        <w:shd w:fill="F4F4F4" w:val="clear"/>
+      </w:pPr>
+      <w:r>
+        <w:t xml:space="preserve"> </w:t>
+      </w:r>
+    </w:p>
+    <w:p>
+      <w:pPr>
+        <w:pStyle w:val="Code"/>
+        <w:shd w:fill="F4F4F4" w:val="clear"/>
+      </w:pPr>
+      <w:r>
+        <w:t>4) curl https://admin.hlx.page/status/asisa-softtek/asisa-pc/main/cuadro-medico/p/madrid</w:t>
+      </w:r>
+    </w:p>
+    <w:p>
+      <w:pPr>
+        <w:pStyle w:val="Code"/>
+        <w:shd w:fill="F4F4F4" w:val="clear"/>
+      </w:pPr>
+      <w:r>
+        <w:t xml:space="preserve">   → preview/live status 200, sourceLocation con markup:.../api/markup...</w:t>
+      </w:r>
+    </w:p>
     <w:sectPr>
       <w:pgSz w:w="12240" w:h="15840"/>
       <w:pgMar w:top="1440" w:right="1800" w:bottom="1440" w:left="1800" w:header="720" w:footer="720" w:gutter="0"/>

</xml_diff>

<commit_message>
docs(handoff): real-data examples for every endpoint, script and data file
Inject concrete curl examples + sample JSON responses for each of the
11 api/*.js endpoints (providers, doctor, centro, provincias,
especialidades, providers-detail, etc.), real index entries for
doctores-index.json and centros-index.json, and copy-paste-ready
invocations with expected output for the 5 .mjs scripts (generate-*,
create-aem-pages, refresh-eds-pages).

Co-Authored-By: Claude Opus 4.7 <noreply@anthropic.com>
</commit_message>
<xml_diff>
--- a/docs/traspaso-conocimiento.docx
+++ b/docs/traspaso-conocimiento.docx
@@ -3858,6 +3858,110 @@
     <w:p>
       <w:r>
         <w:t>Tolerancia a URLs obsoletas: fetchDoctor() y fetchCentro() implementan un fallback por slug del nombre. Si llega un key como "carbonell-martinez-antonio-2399368" que no existe en el índice (porque el ID cambió en la última regen), se busca un key que coincida en el prefijo del slug ("carbonell-martinez-antonio-*") y se sirve la entrada actual. Esto evita que URLs publicadas en EDS hace tiempo den 404 si el catálogo se ha regenerado.</w:t>
+      </w:r>
+    </w:p>
+    <w:p>
+      <w:r>
+        <w:t>Ejemplos de petición:</w:t>
+      </w:r>
+    </w:p>
+    <w:p>
+      <w:pPr>
+        <w:pStyle w:val="Code"/>
+        <w:shd w:fill="F4F4F4" w:val="clear"/>
+      </w:pPr>
+      <w:r>
+        <w:t># Provincia listing</w:t>
+      </w:r>
+    </w:p>
+    <w:p>
+      <w:pPr>
+        <w:pStyle w:val="Code"/>
+        <w:shd w:fill="F4F4F4" w:val="clear"/>
+      </w:pPr>
+      <w:r>
+        <w:t>curl "https://asisa-pc.vercel.app/markup/cuadro-medico/p/madrid" -I</w:t>
+      </w:r>
+    </w:p>
+    <w:p>
+      <w:pPr>
+        <w:pStyle w:val="Code"/>
+        <w:shd w:fill="F4F4F4" w:val="clear"/>
+      </w:pPr>
+      <w:r>
+        <w:t>#   → HTTP 200, content-type: text/html, x-source: ssr:provincia</w:t>
+      </w:r>
+    </w:p>
+    <w:p>
+      <w:pPr>
+        <w:pStyle w:val="Code"/>
+        <w:shd w:fill="F4F4F4" w:val="clear"/>
+      </w:pPr>
+      <w:r>
+        <w:t xml:space="preserve"> </w:t>
+      </w:r>
+    </w:p>
+    <w:p>
+      <w:pPr>
+        <w:pStyle w:val="Code"/>
+        <w:shd w:fill="F4F4F4" w:val="clear"/>
+      </w:pPr>
+      <w:r>
+        <w:t># Ficha doctor con key obsoleto (se resuelve por fallback)</w:t>
+      </w:r>
+    </w:p>
+    <w:p>
+      <w:pPr>
+        <w:pStyle w:val="Code"/>
+        <w:shd w:fill="F4F4F4" w:val="clear"/>
+      </w:pPr>
+      <w:r>
+        <w:t>curl "https://asisa-pc.vercel.app/markup/cuadro-medico/d/carbonell-martinez-antonio-2399368" -I</w:t>
+      </w:r>
+    </w:p>
+    <w:p>
+      <w:pPr>
+        <w:pStyle w:val="Code"/>
+        <w:shd w:fill="F4F4F4" w:val="clear"/>
+      </w:pPr>
+      <w:r>
+        <w:t>#   → HTTP 200, x-source: ssr:doctor</w:t>
+      </w:r>
+    </w:p>
+    <w:p>
+      <w:pPr>
+        <w:pStyle w:val="Code"/>
+        <w:shd w:fill="F4F4F4" w:val="clear"/>
+      </w:pPr>
+      <w:r>
+        <w:t xml:space="preserve"> </w:t>
+      </w:r>
+    </w:p>
+    <w:p>
+      <w:pPr>
+        <w:pStyle w:val="Code"/>
+        <w:shd w:fill="F4F4F4" w:val="clear"/>
+      </w:pPr>
+      <w:r>
+        <w:t># Path no reconocido → 404 que EDS interpreta como "pasa al source de AEM"</w:t>
+      </w:r>
+    </w:p>
+    <w:p>
+      <w:pPr>
+        <w:pStyle w:val="Code"/>
+        <w:shd w:fill="F4F4F4" w:val="clear"/>
+      </w:pPr>
+      <w:r>
+        <w:t>curl "https://asisa-pc.vercel.app/markup/no-existe" -I</w:t>
+      </w:r>
+    </w:p>
+    <w:p>
+      <w:pPr>
+        <w:pStyle w:val="Code"/>
+        <w:shd w:fill="F4F4F4" w:val="clear"/>
+      </w:pPr>
+      <w:r>
+        <w:t>#   → HTTP 404, x-source: overlay-pass</w:t>
       </w:r>
     </w:p>
     <w:p>
@@ -4650,6 +4754,344 @@
       </w:r>
     </w:p>
     <w:p>
+      <w:r>
+        <w:t>Ejemplo de petición y respuesta real:</w:t>
+      </w:r>
+    </w:p>
+    <w:p>
+      <w:pPr>
+        <w:pStyle w:val="Code"/>
+        <w:shd w:fill="F4F4F4" w:val="clear"/>
+      </w:pPr>
+      <w:r>
+        <w:t>curl "https://asisa-pc.vercel.app/api/providers?provinceSlug=madrid&amp;specSlug=cardiologia&amp;tab=professionals&amp;page=1&amp;limit=1"</w:t>
+      </w:r>
+    </w:p>
+    <w:p>
+      <w:pPr>
+        <w:pStyle w:val="Code"/>
+        <w:shd w:fill="F4F4F4" w:val="clear"/>
+      </w:pPr>
+      <w:r>
+        <w:t xml:space="preserve"> </w:t>
+      </w:r>
+    </w:p>
+    <w:p>
+      <w:pPr>
+        <w:pStyle w:val="Code"/>
+        <w:shd w:fill="F4F4F4" w:val="clear"/>
+      </w:pPr>
+      <w:r>
+        <w:t>{</w:t>
+      </w:r>
+    </w:p>
+    <w:p>
+      <w:pPr>
+        <w:pStyle w:val="Code"/>
+        <w:shd w:fill="F4F4F4" w:val="clear"/>
+      </w:pPr>
+      <w:r>
+        <w:t xml:space="preserve">  "provinceSlug": "madrid",</w:t>
+      </w:r>
+    </w:p>
+    <w:p>
+      <w:pPr>
+        <w:pStyle w:val="Code"/>
+        <w:shd w:fill="F4F4F4" w:val="clear"/>
+      </w:pPr>
+      <w:r>
+        <w:t xml:space="preserve">  "specSlug": "cardiologia",</w:t>
+      </w:r>
+    </w:p>
+    <w:p>
+      <w:pPr>
+        <w:pStyle w:val="Code"/>
+        <w:shd w:fill="F4F4F4" w:val="clear"/>
+      </w:pPr>
+      <w:r>
+        <w:t xml:space="preserve">  "tab": "professionals",</w:t>
+      </w:r>
+    </w:p>
+    <w:p>
+      <w:pPr>
+        <w:pStyle w:val="Code"/>
+        <w:shd w:fill="F4F4F4" w:val="clear"/>
+      </w:pPr>
+      <w:r>
+        <w:t xml:space="preserve">  "page": 1,</w:t>
+      </w:r>
+    </w:p>
+    <w:p>
+      <w:pPr>
+        <w:pStyle w:val="Code"/>
+        <w:shd w:fill="F4F4F4" w:val="clear"/>
+      </w:pPr>
+      <w:r>
+        <w:t xml:space="preserve">  "limit": 1,</w:t>
+      </w:r>
+    </w:p>
+    <w:p>
+      <w:pPr>
+        <w:pStyle w:val="Code"/>
+        <w:shd w:fill="F4F4F4" w:val="clear"/>
+      </w:pPr>
+      <w:r>
+        <w:t xml:space="preserve">  "total": 30,</w:t>
+      </w:r>
+    </w:p>
+    <w:p>
+      <w:pPr>
+        <w:pStyle w:val="Code"/>
+        <w:shd w:fill="F4F4F4" w:val="clear"/>
+      </w:pPr>
+      <w:r>
+        <w:t xml:space="preserve">  "totalPages": 30,</w:t>
+      </w:r>
+    </w:p>
+    <w:p>
+      <w:pPr>
+        <w:pStyle w:val="Code"/>
+        <w:shd w:fill="F4F4F4" w:val="clear"/>
+      </w:pPr>
+      <w:r>
+        <w:t xml:space="preserve">  "totalProfessionals": 30,</w:t>
+      </w:r>
+    </w:p>
+    <w:p>
+      <w:pPr>
+        <w:pStyle w:val="Code"/>
+        <w:shd w:fill="F4F4F4" w:val="clear"/>
+      </w:pPr>
+      <w:r>
+        <w:t xml:space="preserve">  "totalCenters": 50,</w:t>
+      </w:r>
+    </w:p>
+    <w:p>
+      <w:pPr>
+        <w:pStyle w:val="Code"/>
+        <w:shd w:fill="F4F4F4" w:val="clear"/>
+      </w:pPr>
+      <w:r>
+        <w:t xml:space="preserve">  "results": [</w:t>
+      </w:r>
+    </w:p>
+    <w:p>
+      <w:pPr>
+        <w:pStyle w:val="Code"/>
+        <w:shd w:fill="F4F4F4" w:val="clear"/>
+      </w:pPr>
+      <w:r>
+        <w:t xml:space="preserve">    {</w:t>
+      </w:r>
+    </w:p>
+    <w:p>
+      <w:pPr>
+        <w:pStyle w:val="Code"/>
+        <w:shd w:fill="F4F4F4" w:val="clear"/>
+      </w:pPr>
+      <w:r>
+        <w:t xml:space="preserve">      "name": "FRAILE MALMIERCA, EMILIO",</w:t>
+      </w:r>
+    </w:p>
+    <w:p>
+      <w:pPr>
+        <w:pStyle w:val="Code"/>
+        <w:shd w:fill="F4F4F4" w:val="clear"/>
+      </w:pPr>
+      <w:r>
+        <w:t xml:space="preserve">      "speciality": "CARDIOLOGÍA",</w:t>
+      </w:r>
+    </w:p>
+    <w:p>
+      <w:pPr>
+        <w:pStyle w:val="Code"/>
+        <w:shd w:fill="F4F4F4" w:val="clear"/>
+      </w:pPr>
+      <w:r>
+        <w:t xml:space="preserve">      "providerType": 1,</w:t>
+      </w:r>
+    </w:p>
+    <w:p>
+      <w:pPr>
+        <w:pStyle w:val="Code"/>
+        <w:shd w:fill="F4F4F4" w:val="clear"/>
+      </w:pPr>
+      <w:r>
+        <w:t xml:space="preserve">      "doctorType": 1,</w:t>
+      </w:r>
+    </w:p>
+    <w:p>
+      <w:pPr>
+        <w:pStyle w:val="Code"/>
+        <w:shd w:fill="F4F4F4" w:val="clear"/>
+      </w:pPr>
+      <w:r>
+        <w:t xml:space="preserve">      "businessGroup": true,</w:t>
+      </w:r>
+    </w:p>
+    <w:p>
+      <w:pPr>
+        <w:pStyle w:val="Code"/>
+        <w:shd w:fill="F4F4F4" w:val="clear"/>
+      </w:pPr>
+      <w:r>
+        <w:t xml:space="preserve">      "parentDescription": "HOSPITAL UNIVERSITARIO HLA MONCLOA",</w:t>
+      </w:r>
+    </w:p>
+    <w:p>
+      <w:pPr>
+        <w:pStyle w:val="Code"/>
+        <w:shd w:fill="F4F4F4" w:val="clear"/>
+      </w:pPr>
+      <w:r>
+        <w:t xml:space="preserve">      "address": "AVENIDA VALLADOLID 83",</w:t>
+      </w:r>
+    </w:p>
+    <w:p>
+      <w:pPr>
+        <w:pStyle w:val="Code"/>
+        <w:shd w:fill="F4F4F4" w:val="clear"/>
+      </w:pPr>
+      <w:r>
+        <w:t xml:space="preserve">      "postalCode": "28008",</w:t>
+      </w:r>
+    </w:p>
+    <w:p>
+      <w:pPr>
+        <w:pStyle w:val="Code"/>
+        <w:shd w:fill="F4F4F4" w:val="clear"/>
+      </w:pPr>
+      <w:r>
+        <w:t xml:space="preserve">      "city": "MADRID",</w:t>
+      </w:r>
+    </w:p>
+    <w:p>
+      <w:pPr>
+        <w:pStyle w:val="Code"/>
+        <w:shd w:fill="F4F4F4" w:val="clear"/>
+      </w:pPr>
+      <w:r>
+        <w:t xml:space="preserve">      "phone": "917581196",</w:t>
+      </w:r>
+    </w:p>
+    <w:p>
+      <w:pPr>
+        <w:pStyle w:val="Code"/>
+        <w:shd w:fill="F4F4F4" w:val="clear"/>
+      </w:pPr>
+      <w:r>
+        <w:t xml:space="preserve">      "lat": 40.433166,</w:t>
+      </w:r>
+    </w:p>
+    <w:p>
+      <w:pPr>
+        <w:pStyle w:val="Code"/>
+        <w:shd w:fill="F4F4F4" w:val="clear"/>
+      </w:pPr>
+      <w:r>
+        <w:t xml:space="preserve">      "lon": -3.7337846,</w:t>
+      </w:r>
+    </w:p>
+    <w:p>
+      <w:pPr>
+        <w:pStyle w:val="Code"/>
+        <w:shd w:fill="F4F4F4" w:val="clear"/>
+      </w:pPr>
+      <w:r>
+        <w:t xml:space="preserve">      "onlineAppointment": true,</w:t>
+      </w:r>
+    </w:p>
+    <w:p>
+      <w:pPr>
+        <w:pStyle w:val="Code"/>
+        <w:shd w:fill="F4F4F4" w:val="clear"/>
+      </w:pPr>
+      <w:r>
+        <w:t xml:space="preserve">      "videoConsultation": false,</w:t>
+      </w:r>
+    </w:p>
+    <w:p>
+      <w:pPr>
+        <w:pStyle w:val="Code"/>
+        <w:shd w:fill="F4F4F4" w:val="clear"/>
+      </w:pPr>
+      <w:r>
+        <w:t xml:space="preserve">      "ePrescription": true,</w:t>
+      </w:r>
+    </w:p>
+    <w:p>
+      <w:pPr>
+        <w:pStyle w:val="Code"/>
+        <w:shd w:fill="F4F4F4" w:val="clear"/>
+      </w:pPr>
+      <w:r>
+        <w:t xml:space="preserve">      "languages": [],</w:t>
+      </w:r>
+    </w:p>
+    <w:p>
+      <w:pPr>
+        <w:pStyle w:val="Code"/>
+        <w:shd w:fill="F4F4F4" w:val="clear"/>
+      </w:pPr>
+      <w:r>
+        <w:t xml:space="preserve">      "collegiateCode": 453706204,</w:t>
+      </w:r>
+    </w:p>
+    <w:p>
+      <w:pPr>
+        <w:pStyle w:val="Code"/>
+        <w:shd w:fill="F4F4F4" w:val="clear"/>
+      </w:pPr>
+      <w:r>
+        <w:t xml:space="preserve">      "providerLocalicationCode": 1496101,</w:t>
+      </w:r>
+    </w:p>
+    <w:p>
+      <w:pPr>
+        <w:pStyle w:val="Code"/>
+        <w:shd w:fill="F4F4F4" w:val="clear"/>
+      </w:pPr>
+      <w:r>
+        <w:t xml:space="preserve">      "providerCode": 3839140,</w:t>
+      </w:r>
+    </w:p>
+    <w:p>
+      <w:pPr>
+        <w:pStyle w:val="Code"/>
+        <w:shd w:fill="F4F4F4" w:val="clear"/>
+      </w:pPr>
+      <w:r>
+        <w:t xml:space="preserve">      "detailUrl": "/cuadro-medico/d/fraile-malmierca-emilio-453706204"</w:t>
+      </w:r>
+    </w:p>
+    <w:p>
+      <w:pPr>
+        <w:pStyle w:val="Code"/>
+        <w:shd w:fill="F4F4F4" w:val="clear"/>
+      </w:pPr>
+      <w:r>
+        <w:t xml:space="preserve">    }</w:t>
+      </w:r>
+    </w:p>
+    <w:p>
+      <w:pPr>
+        <w:pStyle w:val="Code"/>
+        <w:shd w:fill="F4F4F4" w:val="clear"/>
+      </w:pPr>
+      <w:r>
+        <w:t xml:space="preserve">  ]</w:t>
+      </w:r>
+    </w:p>
+    <w:p>
+      <w:pPr>
+        <w:pStyle w:val="Code"/>
+        <w:shd w:fill="F4F4F4" w:val="clear"/>
+      </w:pPr>
+      <w:r>
+        <w:t>}</w:t>
+      </w:r>
+    </w:p>
+    <w:p>
       <w:pPr>
         <w:pStyle w:val="Heading4"/>
       </w:pPr>
@@ -5014,6 +5456,263 @@
       </w:r>
     </w:p>
     <w:p>
+      <w:r>
+        <w:t>Ejemplo:</w:t>
+      </w:r>
+    </w:p>
+    <w:p>
+      <w:pPr>
+        <w:pStyle w:val="Code"/>
+        <w:shd w:fill="F4F4F4" w:val="clear"/>
+      </w:pPr>
+      <w:r>
+        <w:t>curl "https://asisa-pc.vercel.app/api/doctor?key=werenitzky-jose-282874657"</w:t>
+      </w:r>
+    </w:p>
+    <w:p>
+      <w:pPr>
+        <w:pStyle w:val="Code"/>
+        <w:shd w:fill="F4F4F4" w:val="clear"/>
+      </w:pPr>
+      <w:r>
+        <w:t xml:space="preserve"> </w:t>
+      </w:r>
+    </w:p>
+    <w:p>
+      <w:pPr>
+        <w:pStyle w:val="Code"/>
+        <w:shd w:fill="F4F4F4" w:val="clear"/>
+      </w:pPr>
+      <w:r>
+        <w:t>{</w:t>
+      </w:r>
+    </w:p>
+    <w:p>
+      <w:pPr>
+        <w:pStyle w:val="Code"/>
+        <w:shd w:fill="F4F4F4" w:val="clear"/>
+      </w:pPr>
+      <w:r>
+        <w:t xml:space="preserve">  "key": "werenitzky-jose-282874657",</w:t>
+      </w:r>
+    </w:p>
+    <w:p>
+      <w:pPr>
+        <w:pStyle w:val="Code"/>
+        <w:shd w:fill="F4F4F4" w:val="clear"/>
+      </w:pPr>
+      <w:r>
+        <w:t xml:space="preserve">  "name": "WERENITZKY , JOSE",</w:t>
+      </w:r>
+    </w:p>
+    <w:p>
+      <w:pPr>
+        <w:pStyle w:val="Code"/>
+        <w:shd w:fill="F4F4F4" w:val="clear"/>
+      </w:pPr>
+      <w:r>
+        <w:t xml:space="preserve">  "collegiateCode": 282874657,</w:t>
+      </w:r>
+    </w:p>
+    <w:p>
+      <w:pPr>
+        <w:pStyle w:val="Code"/>
+        <w:shd w:fill="F4F4F4" w:val="clear"/>
+      </w:pPr>
+      <w:r>
+        <w:t xml:space="preserve">  "languages": [],</w:t>
+      </w:r>
+    </w:p>
+    <w:p>
+      <w:pPr>
+        <w:pStyle w:val="Code"/>
+        <w:shd w:fill="F4F4F4" w:val="clear"/>
+      </w:pPr>
+      <w:r>
+        <w:t xml:space="preserve">  "specialities": ["CARDIOLOGÍA"],</w:t>
+      </w:r>
+    </w:p>
+    <w:p>
+      <w:pPr>
+        <w:pStyle w:val="Code"/>
+        <w:shd w:fill="F4F4F4" w:val="clear"/>
+      </w:pPr>
+      <w:r>
+        <w:t xml:space="preserve">  "specSlug": "cardiologia",</w:t>
+      </w:r>
+    </w:p>
+    <w:p>
+      <w:pPr>
+        <w:pStyle w:val="Code"/>
+        <w:shd w:fill="F4F4F4" w:val="clear"/>
+      </w:pPr>
+      <w:r>
+        <w:t xml:space="preserve">  "provinceSlug": "madrid",</w:t>
+      </w:r>
+    </w:p>
+    <w:p>
+      <w:pPr>
+        <w:pStyle w:val="Code"/>
+        <w:shd w:fill="F4F4F4" w:val="clear"/>
+      </w:pPr>
+      <w:r>
+        <w:t xml:space="preserve">  "parentDescription": "HOSPITAL UNIVERSITARIO HLA MONCLOA",</w:t>
+      </w:r>
+    </w:p>
+    <w:p>
+      <w:pPr>
+        <w:pStyle w:val="Code"/>
+        <w:shd w:fill="F4F4F4" w:val="clear"/>
+      </w:pPr>
+      <w:r>
+        <w:t xml:space="preserve">  "address": "AVENIDA VALLADOLID 83",</w:t>
+      </w:r>
+    </w:p>
+    <w:p>
+      <w:pPr>
+        <w:pStyle w:val="Code"/>
+        <w:shd w:fill="F4F4F4" w:val="clear"/>
+      </w:pPr>
+      <w:r>
+        <w:t xml:space="preserve">  "postalCode": "28008",</w:t>
+      </w:r>
+    </w:p>
+    <w:p>
+      <w:pPr>
+        <w:pStyle w:val="Code"/>
+        <w:shd w:fill="F4F4F4" w:val="clear"/>
+      </w:pPr>
+      <w:r>
+        <w:t xml:space="preserve">  "city": "MADRID",</w:t>
+      </w:r>
+    </w:p>
+    <w:p>
+      <w:pPr>
+        <w:pStyle w:val="Code"/>
+        <w:shd w:fill="F4F4F4" w:val="clear"/>
+      </w:pPr>
+      <w:r>
+        <w:t xml:space="preserve">  "provinceCode": "28",</w:t>
+      </w:r>
+    </w:p>
+    <w:p>
+      <w:pPr>
+        <w:pStyle w:val="Code"/>
+        <w:shd w:fill="F4F4F4" w:val="clear"/>
+      </w:pPr>
+      <w:r>
+        <w:t xml:space="preserve">  "phone": "917581196",</w:t>
+      </w:r>
+    </w:p>
+    <w:p>
+      <w:pPr>
+        <w:pStyle w:val="Code"/>
+        <w:shd w:fill="F4F4F4" w:val="clear"/>
+      </w:pPr>
+      <w:r>
+        <w:t xml:space="preserve">  "lat": 40.433166,</w:t>
+      </w:r>
+    </w:p>
+    <w:p>
+      <w:pPr>
+        <w:pStyle w:val="Code"/>
+        <w:shd w:fill="F4F4F4" w:val="clear"/>
+      </w:pPr>
+      <w:r>
+        <w:t xml:space="preserve">  "lon": -3.7337846,</w:t>
+      </w:r>
+    </w:p>
+    <w:p>
+      <w:pPr>
+        <w:pStyle w:val="Code"/>
+        <w:shd w:fill="F4F4F4" w:val="clear"/>
+      </w:pPr>
+      <w:r>
+        <w:t xml:space="preserve">  "onlineAppointment": true,</w:t>
+      </w:r>
+    </w:p>
+    <w:p>
+      <w:pPr>
+        <w:pStyle w:val="Code"/>
+        <w:shd w:fill="F4F4F4" w:val="clear"/>
+      </w:pPr>
+      <w:r>
+        <w:t xml:space="preserve">  "videoConsultation": false,</w:t>
+      </w:r>
+    </w:p>
+    <w:p>
+      <w:pPr>
+        <w:pStyle w:val="Code"/>
+        <w:shd w:fill="F4F4F4" w:val="clear"/>
+      </w:pPr>
+      <w:r>
+        <w:t xml:space="preserve">  "ePrescription": true,</w:t>
+      </w:r>
+    </w:p>
+    <w:p>
+      <w:pPr>
+        <w:pStyle w:val="Code"/>
+        <w:shd w:fill="F4F4F4" w:val="clear"/>
+      </w:pPr>
+      <w:r>
+        <w:t xml:space="preserve">  "businessGroup": true,</w:t>
+      </w:r>
+    </w:p>
+    <w:p>
+      <w:pPr>
+        <w:pStyle w:val="Code"/>
+        <w:shd w:fill="F4F4F4" w:val="clear"/>
+      </w:pPr>
+      <w:r>
+        <w:t xml:space="preserve">  "tuotempo": { "presential": true, "online": true, ... },</w:t>
+      </w:r>
+    </w:p>
+    <w:p>
+      <w:pPr>
+        <w:pStyle w:val="Code"/>
+        <w:shd w:fill="F4F4F4" w:val="clear"/>
+      </w:pPr>
+      <w:r>
+        <w:t xml:space="preserve">  "locations": [</w:t>
+      </w:r>
+    </w:p>
+    <w:p>
+      <w:pPr>
+        <w:pStyle w:val="Code"/>
+        <w:shd w:fill="F4F4F4" w:val="clear"/>
+      </w:pPr>
+      <w:r>
+        <w:t xml:space="preserve">    { "providerCode": 3839140, "providerLocalicationCode": 1496101,</w:t>
+      </w:r>
+    </w:p>
+    <w:p>
+      <w:pPr>
+        <w:pStyle w:val="Code"/>
+        <w:shd w:fill="F4F4F4" w:val="clear"/>
+      </w:pPr>
+      <w:r>
+        <w:t xml:space="preserve">      "speciality": "CARDIOLOGÍA", ... }</w:t>
+      </w:r>
+    </w:p>
+    <w:p>
+      <w:pPr>
+        <w:pStyle w:val="Code"/>
+        <w:shd w:fill="F4F4F4" w:val="clear"/>
+      </w:pPr>
+      <w:r>
+        <w:t xml:space="preserve">  ]</w:t>
+      </w:r>
+    </w:p>
+    <w:p>
+      <w:pPr>
+        <w:pStyle w:val="Code"/>
+        <w:shd w:fill="F4F4F4" w:val="clear"/>
+      </w:pPr>
+      <w:r>
+        <w:t>}</w:t>
+      </w:r>
+    </w:p>
+    <w:p>
       <w:pPr>
         <w:pStyle w:val="Heading4"/>
       </w:pPr>
@@ -5314,6 +6013,398 @@
       </w:r>
     </w:p>
     <w:p>
+      <w:r>
+        <w:t>Ejemplo (resumido — la respuesta real son ~90 KB de JSON):</w:t>
+      </w:r>
+    </w:p>
+    <w:p>
+      <w:pPr>
+        <w:pStyle w:val="Code"/>
+        <w:shd w:fill="F4F4F4" w:val="clear"/>
+      </w:pPr>
+      <w:r>
+        <w:t>curl "https://asisa-pc.vercel.app/api/centro?key=hospital-universitario-hla-moncloa"</w:t>
+      </w:r>
+    </w:p>
+    <w:p>
+      <w:pPr>
+        <w:pStyle w:val="Code"/>
+        <w:shd w:fill="F4F4F4" w:val="clear"/>
+      </w:pPr>
+      <w:r>
+        <w:t xml:space="preserve"> </w:t>
+      </w:r>
+    </w:p>
+    <w:p>
+      <w:pPr>
+        <w:pStyle w:val="Code"/>
+        <w:shd w:fill="F4F4F4" w:val="clear"/>
+      </w:pPr>
+      <w:r>
+        <w:t>{</w:t>
+      </w:r>
+    </w:p>
+    <w:p>
+      <w:pPr>
+        <w:pStyle w:val="Code"/>
+        <w:shd w:fill="F4F4F4" w:val="clear"/>
+      </w:pPr>
+      <w:r>
+        <w:t xml:space="preserve">  "key": "hospital-universitario-hla-moncloa",</w:t>
+      </w:r>
+    </w:p>
+    <w:p>
+      <w:pPr>
+        <w:pStyle w:val="Code"/>
+        <w:shd w:fill="F4F4F4" w:val="clear"/>
+      </w:pPr>
+      <w:r>
+        <w:t xml:space="preserve">  "providerLocalicationCode": 1496101,</w:t>
+      </w:r>
+    </w:p>
+    <w:p>
+      <w:pPr>
+        <w:pStyle w:val="Code"/>
+        <w:shd w:fill="F4F4F4" w:val="clear"/>
+      </w:pPr>
+      <w:r>
+        <w:t xml:space="preserve">  "name": "HOSPITAL UNIVERSITARIO HLA MONCLOA",</w:t>
+      </w:r>
+    </w:p>
+    <w:p>
+      <w:pPr>
+        <w:pStyle w:val="Code"/>
+        <w:shd w:fill="F4F4F4" w:val="clear"/>
+      </w:pPr>
+      <w:r>
+        <w:t xml:space="preserve">  "address": "AVENIDA VALLADOLID 83",</w:t>
+      </w:r>
+    </w:p>
+    <w:p>
+      <w:pPr>
+        <w:pStyle w:val="Code"/>
+        <w:shd w:fill="F4F4F4" w:val="clear"/>
+      </w:pPr>
+      <w:r>
+        <w:t xml:space="preserve">  "postalCode": "28008",</w:t>
+      </w:r>
+    </w:p>
+    <w:p>
+      <w:pPr>
+        <w:pStyle w:val="Code"/>
+        <w:shd w:fill="F4F4F4" w:val="clear"/>
+      </w:pPr>
+      <w:r>
+        <w:t xml:space="preserve">  "city": "MADRID",</w:t>
+      </w:r>
+    </w:p>
+    <w:p>
+      <w:pPr>
+        <w:pStyle w:val="Code"/>
+        <w:shd w:fill="F4F4F4" w:val="clear"/>
+      </w:pPr>
+      <w:r>
+        <w:t xml:space="preserve">  "provinceCode": "28",</w:t>
+      </w:r>
+    </w:p>
+    <w:p>
+      <w:pPr>
+        <w:pStyle w:val="Code"/>
+        <w:shd w:fill="F4F4F4" w:val="clear"/>
+      </w:pPr>
+      <w:r>
+        <w:t xml:space="preserve">  "provinceSlug": "madrid",</w:t>
+      </w:r>
+    </w:p>
+    <w:p>
+      <w:pPr>
+        <w:pStyle w:val="Code"/>
+        <w:shd w:fill="F4F4F4" w:val="clear"/>
+      </w:pPr>
+      <w:r>
+        <w:t xml:space="preserve">  "phone": "917581196",</w:t>
+      </w:r>
+    </w:p>
+    <w:p>
+      <w:pPr>
+        <w:pStyle w:val="Code"/>
+        <w:shd w:fill="F4F4F4" w:val="clear"/>
+      </w:pPr>
+      <w:r>
+        <w:t xml:space="preserve">  "lat": 40.433166,</w:t>
+      </w:r>
+    </w:p>
+    <w:p>
+      <w:pPr>
+        <w:pStyle w:val="Code"/>
+        <w:shd w:fill="F4F4F4" w:val="clear"/>
+      </w:pPr>
+      <w:r>
+        <w:t xml:space="preserve">  "lon": -3.7337846,</w:t>
+      </w:r>
+    </w:p>
+    <w:p>
+      <w:pPr>
+        <w:pStyle w:val="Code"/>
+        <w:shd w:fill="F4F4F4" w:val="clear"/>
+      </w:pPr>
+      <w:r>
+        <w:t xml:space="preserve">  "businessGroup": true,</w:t>
+      </w:r>
+    </w:p>
+    <w:p>
+      <w:pPr>
+        <w:pStyle w:val="Code"/>
+        <w:shd w:fill="F4F4F4" w:val="clear"/>
+      </w:pPr>
+      <w:r>
+        <w:t xml:space="preserve">  "specialities": [          // 36 entradas</w:t>
+      </w:r>
+    </w:p>
+    <w:p>
+      <w:pPr>
+        <w:pStyle w:val="Code"/>
+        <w:shd w:fill="F4F4F4" w:val="clear"/>
+      </w:pPr>
+      <w:r>
+        <w:t xml:space="preserve">    {</w:t>
+      </w:r>
+    </w:p>
+    <w:p>
+      <w:pPr>
+        <w:pStyle w:val="Code"/>
+        <w:shd w:fill="F4F4F4" w:val="clear"/>
+      </w:pPr>
+      <w:r>
+        <w:t xml:space="preserve">      "speciality": "ALERGOLOGÍA",</w:t>
+      </w:r>
+    </w:p>
+    <w:p>
+      <w:pPr>
+        <w:pStyle w:val="Code"/>
+        <w:shd w:fill="F4F4F4" w:val="clear"/>
+      </w:pPr>
+      <w:r>
+        <w:t xml:space="preserve">      "specSlug": "alergologia",</w:t>
+      </w:r>
+    </w:p>
+    <w:p>
+      <w:pPr>
+        <w:pStyle w:val="Code"/>
+        <w:shd w:fill="F4F4F4" w:val="clear"/>
+      </w:pPr>
+      <w:r>
+        <w:t xml:space="preserve">      "phone": "917581196",</w:t>
+      </w:r>
+    </w:p>
+    <w:p>
+      <w:pPr>
+        <w:pStyle w:val="Code"/>
+        <w:shd w:fill="F4F4F4" w:val="clear"/>
+      </w:pPr>
+      <w:r>
+        <w:t xml:space="preserve">      "onlineAppointment": true,</w:t>
+      </w:r>
+    </w:p>
+    <w:p>
+      <w:pPr>
+        <w:pStyle w:val="Code"/>
+        <w:shd w:fill="F4F4F4" w:val="clear"/>
+      </w:pPr>
+      <w:r>
+        <w:t xml:space="preserve">      "subSpecialities": [],</w:t>
+      </w:r>
+    </w:p>
+    <w:p>
+      <w:pPr>
+        <w:pStyle w:val="Code"/>
+        <w:shd w:fill="F4F4F4" w:val="clear"/>
+      </w:pPr>
+      <w:r>
+        <w:t xml:space="preserve">      "doctors": [</w:t>
+      </w:r>
+    </w:p>
+    <w:p>
+      <w:pPr>
+        <w:pStyle w:val="Code"/>
+        <w:shd w:fill="F4F4F4" w:val="clear"/>
+      </w:pPr>
+      <w:r>
+        <w:t xml:space="preserve">        { "key": "delgado-gonzalez-almudena-282875256",</w:t>
+      </w:r>
+    </w:p>
+    <w:p>
+      <w:pPr>
+        <w:pStyle w:val="Code"/>
+        <w:shd w:fill="F4F4F4" w:val="clear"/>
+      </w:pPr>
+      <w:r>
+        <w:t xml:space="preserve">          "name": "DELGADO GONZALEZ, ALMUDENA", "subSpeciality": "" }</w:t>
+      </w:r>
+    </w:p>
+    <w:p>
+      <w:pPr>
+        <w:pStyle w:val="Code"/>
+        <w:shd w:fill="F4F4F4" w:val="clear"/>
+      </w:pPr>
+      <w:r>
+        <w:t xml:space="preserve">      ]</w:t>
+      </w:r>
+    </w:p>
+    <w:p>
+      <w:pPr>
+        <w:pStyle w:val="Code"/>
+        <w:shd w:fill="F4F4F4" w:val="clear"/>
+      </w:pPr>
+      <w:r>
+        <w:t xml:space="preserve">    },</w:t>
+      </w:r>
+    </w:p>
+    <w:p>
+      <w:pPr>
+        <w:pStyle w:val="Code"/>
+        <w:shd w:fill="F4F4F4" w:val="clear"/>
+      </w:pPr>
+      <w:r>
+        <w:t xml:space="preserve">    ...</w:t>
+      </w:r>
+    </w:p>
+    <w:p>
+      <w:pPr>
+        <w:pStyle w:val="Code"/>
+        <w:shd w:fill="F4F4F4" w:val="clear"/>
+      </w:pPr>
+      <w:r>
+        <w:t xml:space="preserve">  ],</w:t>
+      </w:r>
+    </w:p>
+    <w:p>
+      <w:pPr>
+        <w:pStyle w:val="Code"/>
+        <w:shd w:fill="F4F4F4" w:val="clear"/>
+      </w:pPr>
+      <w:r>
+        <w:t xml:space="preserve">  "doctors": [               // 215 entradas</w:t>
+      </w:r>
+    </w:p>
+    <w:p>
+      <w:pPr>
+        <w:pStyle w:val="Code"/>
+        <w:shd w:fill="F4F4F4" w:val="clear"/>
+      </w:pPr>
+      <w:r>
+        <w:t xml:space="preserve">    { "key": "alaez-uson-concepcion-282852412",</w:t>
+      </w:r>
+    </w:p>
+    <w:p>
+      <w:pPr>
+        <w:pStyle w:val="Code"/>
+        <w:shd w:fill="F4F4F4" w:val="clear"/>
+      </w:pPr>
+      <w:r>
+        <w:t xml:space="preserve">      "name": "ALAEZ USON, CONCEPCION",</w:t>
+      </w:r>
+    </w:p>
+    <w:p>
+      <w:pPr>
+        <w:pStyle w:val="Code"/>
+        <w:shd w:fill="F4F4F4" w:val="clear"/>
+      </w:pPr>
+      <w:r>
+        <w:t xml:space="preserve">      "speciality": "HEMATOLOGÍA Y HEMOTERAPIA", "gender": "H" },</w:t>
+      </w:r>
+    </w:p>
+    <w:p>
+      <w:pPr>
+        <w:pStyle w:val="Code"/>
+        <w:shd w:fill="F4F4F4" w:val="clear"/>
+      </w:pPr>
+      <w:r>
+        <w:t xml:space="preserve">    ...</w:t>
+      </w:r>
+    </w:p>
+    <w:p>
+      <w:pPr>
+        <w:pStyle w:val="Code"/>
+        <w:shd w:fill="F4F4F4" w:val="clear"/>
+      </w:pPr>
+      <w:r>
+        <w:t xml:space="preserve">  ],</w:t>
+      </w:r>
+    </w:p>
+    <w:p>
+      <w:pPr>
+        <w:pStyle w:val="Code"/>
+        <w:shd w:fill="F4F4F4" w:val="clear"/>
+      </w:pPr>
+      <w:r>
+        <w:t xml:space="preserve">  "otherCentros": [          // 4 entradas</w:t>
+      </w:r>
+    </w:p>
+    <w:p>
+      <w:pPr>
+        <w:pStyle w:val="Code"/>
+        <w:shd w:fill="F4F4F4" w:val="clear"/>
+      </w:pPr>
+      <w:r>
+        <w:t xml:space="preserve">    { "key": "hospital-quiron-san-camilo",</w:t>
+      </w:r>
+    </w:p>
+    <w:p>
+      <w:pPr>
+        <w:pStyle w:val="Code"/>
+        <w:shd w:fill="F4F4F4" w:val="clear"/>
+      </w:pPr>
+      <w:r>
+        <w:t xml:space="preserve">      "name": "HOSPITAL QUIRON SAN CAMILO",</w:t>
+      </w:r>
+    </w:p>
+    <w:p>
+      <w:pPr>
+        <w:pStyle w:val="Code"/>
+        <w:shd w:fill="F4F4F4" w:val="clear"/>
+      </w:pPr>
+      <w:r>
+        <w:t xml:space="preserve">      "specialities": ["CARDIOLOGÍA","..."], "specialitiesMore": 12 },</w:t>
+      </w:r>
+    </w:p>
+    <w:p>
+      <w:pPr>
+        <w:pStyle w:val="Code"/>
+        <w:shd w:fill="F4F4F4" w:val="clear"/>
+      </w:pPr>
+      <w:r>
+        <w:t xml:space="preserve">    ...</w:t>
+      </w:r>
+    </w:p>
+    <w:p>
+      <w:pPr>
+        <w:pStyle w:val="Code"/>
+        <w:shd w:fill="F4F4F4" w:val="clear"/>
+      </w:pPr>
+      <w:r>
+        <w:t xml:space="preserve">  ],</w:t>
+      </w:r>
+    </w:p>
+    <w:p>
+      <w:pPr>
+        <w:pStyle w:val="Code"/>
+        <w:shd w:fill="F4F4F4" w:val="clear"/>
+      </w:pPr>
+      <w:r>
+        <w:t xml:space="preserve">  "description": "Centro médico del cuadro de ASISA en MADRID..."</w:t>
+      </w:r>
+    </w:p>
+    <w:p>
+      <w:pPr>
+        <w:pStyle w:val="Code"/>
+        <w:shd w:fill="F4F4F4" w:val="clear"/>
+      </w:pPr>
+      <w:r>
+        <w:t>}</w:t>
+      </w:r>
+    </w:p>
+    <w:p>
       <w:pPr>
         <w:pStyle w:val="Heading4"/>
       </w:pPr>
@@ -5338,52 +6429,169 @@
     </w:p>
     <w:p>
       <w:r>
-        <w:t>Shape sin slug:</w:t>
-      </w:r>
-    </w:p>
-    <w:p>
-      <w:pPr>
-        <w:pStyle w:val="Code"/>
-        <w:shd w:fill="F4F4F4" w:val="clear"/>
-      </w:pPr>
-      <w:r>
-        <w:t>[</w:t>
-      </w:r>
-    </w:p>
-    <w:p>
-      <w:pPr>
-        <w:pStyle w:val="Code"/>
-        <w:shd w:fill="F4F4F4" w:val="clear"/>
-      </w:pPr>
-      <w:r>
-        <w:t xml:space="preserve">  { "name": "MADRID", "displayName": "Madrid", "slug": "madrid",</w:t>
-      </w:r>
-    </w:p>
-    <w:p>
-      <w:pPr>
-        <w:pStyle w:val="Code"/>
-        <w:shd w:fill="F4F4F4" w:val="clear"/>
-      </w:pPr>
-      <w:r>
-        <w:t xml:space="preserve">    "provinceCode": "28" },</w:t>
-      </w:r>
-    </w:p>
-    <w:p>
-      <w:pPr>
-        <w:pStyle w:val="Code"/>
-        <w:shd w:fill="F4F4F4" w:val="clear"/>
-      </w:pPr>
-      <w:r>
-        <w:t xml:space="preserve">  …</w:t>
-      </w:r>
-    </w:p>
-    <w:p>
-      <w:pPr>
-        <w:pStyle w:val="Code"/>
-        <w:shd w:fill="F4F4F4" w:val="clear"/>
-      </w:pPr>
-      <w:r>
-        <w:t>]</w:t>
+        <w:t>Ejemplos:</w:t>
+      </w:r>
+    </w:p>
+    <w:p>
+      <w:pPr>
+        <w:pStyle w:val="Code"/>
+        <w:shd w:fill="F4F4F4" w:val="clear"/>
+      </w:pPr>
+      <w:r>
+        <w:t>curl "https://asisa-pc.vercel.app/api/provincias" | jq ".[0]"</w:t>
+      </w:r>
+    </w:p>
+    <w:p>
+      <w:pPr>
+        <w:pStyle w:val="Code"/>
+        <w:shd w:fill="F4F4F4" w:val="clear"/>
+      </w:pPr>
+      <w:r>
+        <w:t xml:space="preserve"> </w:t>
+      </w:r>
+    </w:p>
+    <w:p>
+      <w:pPr>
+        <w:pStyle w:val="Code"/>
+        <w:shd w:fill="F4F4F4" w:val="clear"/>
+      </w:pPr>
+      <w:r>
+        <w:t>{</w:t>
+      </w:r>
+    </w:p>
+    <w:p>
+      <w:pPr>
+        <w:pStyle w:val="Code"/>
+        <w:shd w:fill="F4F4F4" w:val="clear"/>
+      </w:pPr>
+      <w:r>
+        <w:t xml:space="preserve">  "name": "ÁLAVA",</w:t>
+      </w:r>
+    </w:p>
+    <w:p>
+      <w:pPr>
+        <w:pStyle w:val="Code"/>
+        <w:shd w:fill="F4F4F4" w:val="clear"/>
+      </w:pPr>
+      <w:r>
+        <w:t xml:space="preserve">  "displayName": "Álava",</w:t>
+      </w:r>
+    </w:p>
+    <w:p>
+      <w:pPr>
+        <w:pStyle w:val="Code"/>
+        <w:shd w:fill="F4F4F4" w:val="clear"/>
+      </w:pPr>
+      <w:r>
+        <w:t xml:space="preserve">  "slug": "alava",</w:t>
+      </w:r>
+    </w:p>
+    <w:p>
+      <w:pPr>
+        <w:pStyle w:val="Code"/>
+        <w:shd w:fill="F4F4F4" w:val="clear"/>
+      </w:pPr>
+      <w:r>
+        <w:t xml:space="preserve">  "provinceCode": "1"</w:t>
+      </w:r>
+    </w:p>
+    <w:p>
+      <w:pPr>
+        <w:pStyle w:val="Code"/>
+        <w:shd w:fill="F4F4F4" w:val="clear"/>
+      </w:pPr>
+      <w:r>
+        <w:t>}</w:t>
+      </w:r>
+    </w:p>
+    <w:p>
+      <w:pPr>
+        <w:pStyle w:val="Code"/>
+        <w:shd w:fill="F4F4F4" w:val="clear"/>
+      </w:pPr>
+      <w:r>
+        <w:t xml:space="preserve"> </w:t>
+      </w:r>
+    </w:p>
+    <w:p>
+      <w:pPr>
+        <w:pStyle w:val="Code"/>
+        <w:shd w:fill="F4F4F4" w:val="clear"/>
+      </w:pPr>
+      <w:r>
+        <w:t>curl "https://asisa-pc.vercel.app/api/provincias?slug=madrid"</w:t>
+      </w:r>
+    </w:p>
+    <w:p>
+      <w:pPr>
+        <w:pStyle w:val="Code"/>
+        <w:shd w:fill="F4F4F4" w:val="clear"/>
+      </w:pPr>
+      <w:r>
+        <w:t xml:space="preserve"> </w:t>
+      </w:r>
+    </w:p>
+    <w:p>
+      <w:pPr>
+        <w:pStyle w:val="Code"/>
+        <w:shd w:fill="F4F4F4" w:val="clear"/>
+      </w:pPr>
+      <w:r>
+        <w:t>{</w:t>
+      </w:r>
+    </w:p>
+    <w:p>
+      <w:pPr>
+        <w:pStyle w:val="Code"/>
+        <w:shd w:fill="F4F4F4" w:val="clear"/>
+      </w:pPr>
+      <w:r>
+        <w:t xml:space="preserve">  "slug": "madrid",</w:t>
+      </w:r>
+    </w:p>
+    <w:p>
+      <w:pPr>
+        <w:pStyle w:val="Code"/>
+        <w:shd w:fill="F4F4F4" w:val="clear"/>
+      </w:pPr>
+      <w:r>
+        <w:t xml:space="preserve">  "displayName": "Madrid",</w:t>
+      </w:r>
+    </w:p>
+    <w:p>
+      <w:pPr>
+        <w:pStyle w:val="Code"/>
+        <w:shd w:fill="F4F4F4" w:val="clear"/>
+      </w:pPr>
+      <w:r>
+        <w:t xml:space="preserve">  "provinceCode": "28",</w:t>
+      </w:r>
+    </w:p>
+    <w:p>
+      <w:pPr>
+        <w:pStyle w:val="Code"/>
+        <w:shd w:fill="F4F4F4" w:val="clear"/>
+      </w:pPr>
+      <w:r>
+        <w:t xml:space="preserve">  "especialidades": ["alergologia", "alergologia-infantil",</w:t>
+      </w:r>
+    </w:p>
+    <w:p>
+      <w:pPr>
+        <w:pStyle w:val="Code"/>
+        <w:shd w:fill="F4F4F4" w:val="clear"/>
+      </w:pPr>
+      <w:r>
+        <w:t xml:space="preserve">    "analisis-clinicos", "anatomia-patologica", ...]</w:t>
+      </w:r>
+    </w:p>
+    <w:p>
+      <w:pPr>
+        <w:pStyle w:val="Code"/>
+        <w:shd w:fill="F4F4F4" w:val="clear"/>
+      </w:pPr>
+      <w:r>
+        <w:t>}</w:t>
       </w:r>
     </w:p>
     <w:p>
@@ -5421,93 +6629,25 @@
     </w:p>
     <w:p>
       <w:r>
-        <w:t>Shape sin slug:</w:t>
-      </w:r>
-    </w:p>
-    <w:p>
-      <w:pPr>
-        <w:pStyle w:val="Code"/>
-        <w:shd w:fill="F4F4F4" w:val="clear"/>
-      </w:pPr>
-      <w:r>
-        <w:t>[</w:t>
-      </w:r>
-    </w:p>
-    <w:p>
-      <w:pPr>
-        <w:pStyle w:val="Code"/>
-        <w:shd w:fill="F4F4F4" w:val="clear"/>
-      </w:pPr>
-      <w:r>
-        <w:t xml:space="preserve">  { "slug": "cardiologia", "name": "Cardiología",</w:t>
-      </w:r>
-    </w:p>
-    <w:p>
-      <w:pPr>
-        <w:pStyle w:val="Code"/>
-        <w:shd w:fill="F4F4F4" w:val="clear"/>
-      </w:pPr>
-      <w:r>
-        <w:t xml:space="preserve">    "nameApi": "CARDIOLOGÍA",</w:t>
-      </w:r>
-    </w:p>
-    <w:p>
-      <w:pPr>
-        <w:pStyle w:val="Code"/>
-        <w:shd w:fill="F4F4F4" w:val="clear"/>
-      </w:pPr>
-      <w:r>
-        <w:t xml:space="preserve">    "professionalPlural": "Cardiólogos",</w:t>
-      </w:r>
-    </w:p>
-    <w:p>
-      <w:pPr>
-        <w:pStyle w:val="Code"/>
-        <w:shd w:fill="F4F4F4" w:val="clear"/>
-      </w:pPr>
-      <w:r>
-        <w:t xml:space="preserve">    "professionalPluralLower": "cardiólogos",</w:t>
-      </w:r>
-    </w:p>
-    <w:p>
-      <w:pPr>
-        <w:pStyle w:val="Code"/>
-        <w:shd w:fill="F4F4F4" w:val="clear"/>
-      </w:pPr>
-      <w:r>
-        <w:t xml:space="preserve">    "kind": "specialty" | "service" | "technique",</w:t>
-      </w:r>
-    </w:p>
-    <w:p>
-      <w:pPr>
-        <w:pStyle w:val="Code"/>
-        <w:shd w:fill="F4F4F4" w:val="clear"/>
-      </w:pPr>
-      <w:r>
-        <w:t xml:space="preserve">    "specialityCode": 9 },</w:t>
-      </w:r>
-    </w:p>
-    <w:p>
-      <w:pPr>
-        <w:pStyle w:val="Code"/>
-        <w:shd w:fill="F4F4F4" w:val="clear"/>
-      </w:pPr>
-      <w:r>
-        <w:t xml:space="preserve">  …</w:t>
-      </w:r>
-    </w:p>
-    <w:p>
-      <w:pPr>
-        <w:pStyle w:val="Code"/>
-        <w:shd w:fill="F4F4F4" w:val="clear"/>
-      </w:pPr>
-      <w:r>
-        <w:t>]</w:t>
-      </w:r>
-    </w:p>
-    <w:p>
-      <w:r>
-        <w:t>Shape con slug: meta + array provincias[]:</w:t>
+        <w:t>Ejemplos:</w:t>
+      </w:r>
+    </w:p>
+    <w:p>
+      <w:pPr>
+        <w:pStyle w:val="Code"/>
+        <w:shd w:fill="F4F4F4" w:val="clear"/>
+      </w:pPr>
+      <w:r>
+        <w:t>curl "https://asisa-pc.vercel.app/api/especialidades" | jq ".[0]"</w:t>
+      </w:r>
+    </w:p>
+    <w:p>
+      <w:pPr>
+        <w:pStyle w:val="Code"/>
+        <w:shd w:fill="F4F4F4" w:val="clear"/>
+      </w:pPr>
+      <w:r>
+        <w:t xml:space="preserve"> </w:t>
       </w:r>
     </w:p>
     <w:p>
@@ -5525,7 +6665,142 @@
         <w:shd w:fill="F4F4F4" w:val="clear"/>
       </w:pPr>
       <w:r>
-        <w:t xml:space="preserve">  "slug": "cardiologia", "name": "Cardiología", "kind": "specialty",</w:t>
+        <w:t xml:space="preserve">  "slug": "alergologia",</w:t>
+      </w:r>
+    </w:p>
+    <w:p>
+      <w:pPr>
+        <w:pStyle w:val="Code"/>
+        <w:shd w:fill="F4F4F4" w:val="clear"/>
+      </w:pPr>
+      <w:r>
+        <w:t xml:space="preserve">  "name": "Alergología",</w:t>
+      </w:r>
+    </w:p>
+    <w:p>
+      <w:pPr>
+        <w:pStyle w:val="Code"/>
+        <w:shd w:fill="F4F4F4" w:val="clear"/>
+      </w:pPr>
+      <w:r>
+        <w:t xml:space="preserve">  "nameApi": "ALERGOLOGÍA",</w:t>
+      </w:r>
+    </w:p>
+    <w:p>
+      <w:pPr>
+        <w:pStyle w:val="Code"/>
+        <w:shd w:fill="F4F4F4" w:val="clear"/>
+      </w:pPr>
+      <w:r>
+        <w:t xml:space="preserve">  "professionalPlural": "Alergólogos",</w:t>
+      </w:r>
+    </w:p>
+    <w:p>
+      <w:pPr>
+        <w:pStyle w:val="Code"/>
+        <w:shd w:fill="F4F4F4" w:val="clear"/>
+      </w:pPr>
+      <w:r>
+        <w:t xml:space="preserve">  "professionalPluralLower": "alergólogos",</w:t>
+      </w:r>
+    </w:p>
+    <w:p>
+      <w:pPr>
+        <w:pStyle w:val="Code"/>
+        <w:shd w:fill="F4F4F4" w:val="clear"/>
+      </w:pPr>
+      <w:r>
+        <w:t xml:space="preserve">  "kind": "specialty",</w:t>
+      </w:r>
+    </w:p>
+    <w:p>
+      <w:pPr>
+        <w:pStyle w:val="Code"/>
+        <w:shd w:fill="F4F4F4" w:val="clear"/>
+      </w:pPr>
+      <w:r>
+        <w:t xml:space="preserve">  "specialityCode": 1</w:t>
+      </w:r>
+    </w:p>
+    <w:p>
+      <w:pPr>
+        <w:pStyle w:val="Code"/>
+        <w:shd w:fill="F4F4F4" w:val="clear"/>
+      </w:pPr>
+      <w:r>
+        <w:t>}</w:t>
+      </w:r>
+    </w:p>
+    <w:p>
+      <w:pPr>
+        <w:pStyle w:val="Code"/>
+        <w:shd w:fill="F4F4F4" w:val="clear"/>
+      </w:pPr>
+      <w:r>
+        <w:t xml:space="preserve"> </w:t>
+      </w:r>
+    </w:p>
+    <w:p>
+      <w:pPr>
+        <w:pStyle w:val="Code"/>
+        <w:shd w:fill="F4F4F4" w:val="clear"/>
+      </w:pPr>
+      <w:r>
+        <w:t>curl "https://asisa-pc.vercel.app/api/especialidades?slug=cardiologia"</w:t>
+      </w:r>
+    </w:p>
+    <w:p>
+      <w:pPr>
+        <w:pStyle w:val="Code"/>
+        <w:shd w:fill="F4F4F4" w:val="clear"/>
+      </w:pPr>
+      <w:r>
+        <w:t xml:space="preserve"> </w:t>
+      </w:r>
+    </w:p>
+    <w:p>
+      <w:pPr>
+        <w:pStyle w:val="Code"/>
+        <w:shd w:fill="F4F4F4" w:val="clear"/>
+      </w:pPr>
+      <w:r>
+        <w:t>{</w:t>
+      </w:r>
+    </w:p>
+    <w:p>
+      <w:pPr>
+        <w:pStyle w:val="Code"/>
+        <w:shd w:fill="F4F4F4" w:val="clear"/>
+      </w:pPr>
+      <w:r>
+        <w:t xml:space="preserve">  "slug": "cardiologia",</w:t>
+      </w:r>
+    </w:p>
+    <w:p>
+      <w:pPr>
+        <w:pStyle w:val="Code"/>
+        <w:shd w:fill="F4F4F4" w:val="clear"/>
+      </w:pPr>
+      <w:r>
+        <w:t xml:space="preserve">  "name": "Cardiología",</w:t>
+      </w:r>
+    </w:p>
+    <w:p>
+      <w:pPr>
+        <w:pStyle w:val="Code"/>
+        <w:shd w:fill="F4F4F4" w:val="clear"/>
+      </w:pPr>
+      <w:r>
+        <w:t xml:space="preserve">  "nameApi": "CARDIOLOGÍA",</w:t>
+      </w:r>
+    </w:p>
+    <w:p>
+      <w:pPr>
+        <w:pStyle w:val="Code"/>
+        <w:shd w:fill="F4F4F4" w:val="clear"/>
+      </w:pPr>
+      <w:r>
+        <w:t xml:space="preserve">  "kind": "specialty",</w:t>
       </w:r>
     </w:p>
     <w:p>
@@ -5552,7 +6827,25 @@
         <w:shd w:fill="F4F4F4" w:val="clear"/>
       </w:pPr>
       <w:r>
-        <w:t xml:space="preserve">    …  // ordenado por count desc</w:t>
+        <w:t xml:space="preserve">    { "slug": "barcelona", "displayName": "Barcelona", "count": 218 },</w:t>
+      </w:r>
+    </w:p>
+    <w:p>
+      <w:pPr>
+        <w:pStyle w:val="Code"/>
+        <w:shd w:fill="F4F4F4" w:val="clear"/>
+      </w:pPr>
+      <w:r>
+        <w:t xml:space="preserve">    { "slug": "valencia", "displayName": "Valencia", "count": 102 },</w:t>
+      </w:r>
+    </w:p>
+    <w:p>
+      <w:pPr>
+        <w:pStyle w:val="Code"/>
+        <w:shd w:fill="F4F4F4" w:val="clear"/>
+      </w:pPr>
+      <w:r>
+        <w:t xml:space="preserve">    …  // ordenado por count desc, hasta 50 provincias</w:t>
       </w:r>
     </w:p>
     <w:p>
@@ -5604,6 +6897,128 @@
     <w:p>
       <w:r>
         <w:t>Consumido por: usado como fallback / enriquecimiento desde otros endpoints; también accesible directo desde el frontend si se necesita una sola ubicación.</w:t>
+      </w:r>
+    </w:p>
+    <w:p>
+      <w:r>
+        <w:t>Ejemplo:</w:t>
+      </w:r>
+    </w:p>
+    <w:p>
+      <w:pPr>
+        <w:pStyle w:val="Code"/>
+        <w:shd w:fill="F4F4F4" w:val="clear"/>
+      </w:pPr>
+      <w:r>
+        <w:t>curl "https://asisa-pc.vercel.app/api/providers-detail?id=1496101"</w:t>
+      </w:r>
+    </w:p>
+    <w:p>
+      <w:pPr>
+        <w:pStyle w:val="Code"/>
+        <w:shd w:fill="F4F4F4" w:val="clear"/>
+      </w:pPr>
+      <w:r>
+        <w:t xml:space="preserve"> </w:t>
+      </w:r>
+    </w:p>
+    <w:p>
+      <w:pPr>
+        <w:pStyle w:val="Code"/>
+        <w:shd w:fill="F4F4F4" w:val="clear"/>
+      </w:pPr>
+      <w:r>
+        <w:t>{</w:t>
+      </w:r>
+    </w:p>
+    <w:p>
+      <w:pPr>
+        <w:pStyle w:val="Code"/>
+        <w:shd w:fill="F4F4F4" w:val="clear"/>
+      </w:pPr>
+      <w:r>
+        <w:t xml:space="preserve">  "providerLocalicationCode": 1496101,</w:t>
+      </w:r>
+    </w:p>
+    <w:p>
+      <w:pPr>
+        <w:pStyle w:val="Code"/>
+        <w:shd w:fill="F4F4F4" w:val="clear"/>
+      </w:pPr>
+      <w:r>
+        <w:t xml:space="preserve">  "providerCode": 3839140,</w:t>
+      </w:r>
+    </w:p>
+    <w:p>
+      <w:pPr>
+        <w:pStyle w:val="Code"/>
+        <w:shd w:fill="F4F4F4" w:val="clear"/>
+      </w:pPr>
+      <w:r>
+        <w:t xml:space="preserve">  "name": "HOSPITAL UNIVERSITARIO HLA MONCLOA",</w:t>
+      </w:r>
+    </w:p>
+    <w:p>
+      <w:pPr>
+        <w:pStyle w:val="Code"/>
+        <w:shd w:fill="F4F4F4" w:val="clear"/>
+      </w:pPr>
+      <w:r>
+        <w:t xml:space="preserve">  "specialities": ["ALERGOLOGÍA", "CARDIOLOGÍA",</w:t>
+      </w:r>
+    </w:p>
+    <w:p>
+      <w:pPr>
+        <w:pStyle w:val="Code"/>
+        <w:shd w:fill="F4F4F4" w:val="clear"/>
+      </w:pPr>
+      <w:r>
+        <w:t xml:space="preserve">    "DERMATOLOGÍA MÉDICO-QUIRÚRGICA Y VENÉREO", ...],</w:t>
+      </w:r>
+    </w:p>
+    <w:p>
+      <w:pPr>
+        <w:pStyle w:val="Code"/>
+        <w:shd w:fill="F4F4F4" w:val="clear"/>
+      </w:pPr>
+      <w:r>
+        <w:t xml:space="preserve">  "address": "AVENIDA VALLADOLID 83",</w:t>
+      </w:r>
+    </w:p>
+    <w:p>
+      <w:pPr>
+        <w:pStyle w:val="Code"/>
+        <w:shd w:fill="F4F4F4" w:val="clear"/>
+      </w:pPr>
+      <w:r>
+        <w:t xml:space="preserve">  "city": "MADRID",</w:t>
+      </w:r>
+    </w:p>
+    <w:p>
+      <w:pPr>
+        <w:pStyle w:val="Code"/>
+        <w:shd w:fill="F4F4F4" w:val="clear"/>
+      </w:pPr>
+      <w:r>
+        <w:t xml:space="preserve">  "phone": "917581196",</w:t>
+      </w:r>
+    </w:p>
+    <w:p>
+      <w:pPr>
+        <w:pStyle w:val="Code"/>
+        <w:shd w:fill="F4F4F4" w:val="clear"/>
+      </w:pPr>
+      <w:r>
+        <w:t xml:space="preserve">  "languages": []</w:t>
+      </w:r>
+    </w:p>
+    <w:p>
+      <w:pPr>
+        <w:pStyle w:val="Code"/>
+        <w:shd w:fill="F4F4F4" w:val="clear"/>
+      </w:pPr>
+      <w:r>
+        <w:t>}</w:t>
       </w:r>
     </w:p>
     <w:p>
@@ -11377,6 +12792,191 @@
       </w:r>
     </w:p>
     <w:p>
+      <w:r>
+        <w:t>Ejemplo de entrada real:</w:t>
+      </w:r>
+    </w:p>
+    <w:p>
+      <w:pPr>
+        <w:pStyle w:val="Code"/>
+        <w:shd w:fill="F4F4F4" w:val="clear"/>
+      </w:pPr>
+      <w:r>
+        <w:t>jq '.["garcia-balda-ainhoa-152854071"]' data/cuadro-medico/doctores-index.json</w:t>
+      </w:r>
+    </w:p>
+    <w:p>
+      <w:pPr>
+        <w:pStyle w:val="Code"/>
+        <w:shd w:fill="F4F4F4" w:val="clear"/>
+      </w:pPr>
+      <w:r>
+        <w:t xml:space="preserve"> </w:t>
+      </w:r>
+    </w:p>
+    <w:p>
+      <w:pPr>
+        <w:pStyle w:val="Code"/>
+        <w:shd w:fill="F4F4F4" w:val="clear"/>
+      </w:pPr>
+      <w:r>
+        <w:t>{</w:t>
+      </w:r>
+    </w:p>
+    <w:p>
+      <w:pPr>
+        <w:pStyle w:val="Code"/>
+        <w:shd w:fill="F4F4F4" w:val="clear"/>
+      </w:pPr>
+      <w:r>
+        <w:t xml:space="preserve">  "collegiateCode": 152854071,</w:t>
+      </w:r>
+    </w:p>
+    <w:p>
+      <w:pPr>
+        <w:pStyle w:val="Code"/>
+        <w:shd w:fill="F4F4F4" w:val="clear"/>
+      </w:pPr>
+      <w:r>
+        <w:t xml:space="preserve">  "name": "GARCIA BALDA, AINHOA",</w:t>
+      </w:r>
+    </w:p>
+    <w:p>
+      <w:pPr>
+        <w:pStyle w:val="Code"/>
+        <w:shd w:fill="F4F4F4" w:val="clear"/>
+      </w:pPr>
+      <w:r>
+        <w:t xml:space="preserve">  "locations": [</w:t>
+      </w:r>
+    </w:p>
+    <w:p>
+      <w:pPr>
+        <w:pStyle w:val="Code"/>
+        <w:shd w:fill="F4F4F4" w:val="clear"/>
+      </w:pPr>
+      <w:r>
+        <w:t xml:space="preserve">    {</w:t>
+      </w:r>
+    </w:p>
+    <w:p>
+      <w:pPr>
+        <w:pStyle w:val="Code"/>
+        <w:shd w:fill="F4F4F4" w:val="clear"/>
+      </w:pPr>
+      <w:r>
+        <w:t xml:space="preserve">      "providerCode": 3822571,</w:t>
+      </w:r>
+    </w:p>
+    <w:p>
+      <w:pPr>
+        <w:pStyle w:val="Code"/>
+        <w:shd w:fill="F4F4F4" w:val="clear"/>
+      </w:pPr>
+      <w:r>
+        <w:t xml:space="preserve">      "providerLocalicationCode": 1480942,</w:t>
+      </w:r>
+    </w:p>
+    <w:p>
+      <w:pPr>
+        <w:pStyle w:val="Code"/>
+        <w:shd w:fill="F4F4F4" w:val="clear"/>
+      </w:pPr>
+      <w:r>
+        <w:t xml:space="preserve">      "specSlug": "alergologia-infantil",</w:t>
+      </w:r>
+    </w:p>
+    <w:p>
+      <w:pPr>
+        <w:pStyle w:val="Code"/>
+        <w:shd w:fill="F4F4F4" w:val="clear"/>
+      </w:pPr>
+      <w:r>
+        <w:t xml:space="preserve">      "provinceSlug": "a-coruna"</w:t>
+      </w:r>
+    </w:p>
+    <w:p>
+      <w:pPr>
+        <w:pStyle w:val="Code"/>
+        <w:shd w:fill="F4F4F4" w:val="clear"/>
+      </w:pPr>
+      <w:r>
+        <w:t xml:space="preserve">    },</w:t>
+      </w:r>
+    </w:p>
+    <w:p>
+      <w:pPr>
+        <w:pStyle w:val="Code"/>
+        <w:shd w:fill="F4F4F4" w:val="clear"/>
+      </w:pPr>
+      <w:r>
+        <w:t xml:space="preserve">    {</w:t>
+      </w:r>
+    </w:p>
+    <w:p>
+      <w:pPr>
+        <w:pStyle w:val="Code"/>
+        <w:shd w:fill="F4F4F4" w:val="clear"/>
+      </w:pPr>
+      <w:r>
+        <w:t xml:space="preserve">      "providerCode": 3822571,</w:t>
+      </w:r>
+    </w:p>
+    <w:p>
+      <w:pPr>
+        <w:pStyle w:val="Code"/>
+        <w:shd w:fill="F4F4F4" w:val="clear"/>
+      </w:pPr>
+      <w:r>
+        <w:t xml:space="preserve">      "providerLocalicationCode": 1480942,</w:t>
+      </w:r>
+    </w:p>
+    <w:p>
+      <w:pPr>
+        <w:pStyle w:val="Code"/>
+        <w:shd w:fill="F4F4F4" w:val="clear"/>
+      </w:pPr>
+      <w:r>
+        <w:t xml:space="preserve">      "specSlug": "alergologia",</w:t>
+      </w:r>
+    </w:p>
+    <w:p>
+      <w:pPr>
+        <w:pStyle w:val="Code"/>
+        <w:shd w:fill="F4F4F4" w:val="clear"/>
+      </w:pPr>
+      <w:r>
+        <w:t xml:space="preserve">      "provinceSlug": "a-coruna"</w:t>
+      </w:r>
+    </w:p>
+    <w:p>
+      <w:pPr>
+        <w:pStyle w:val="Code"/>
+        <w:shd w:fill="F4F4F4" w:val="clear"/>
+      </w:pPr>
+      <w:r>
+        <w:t xml:space="preserve">    }</w:t>
+      </w:r>
+    </w:p>
+    <w:p>
+      <w:pPr>
+        <w:pStyle w:val="Code"/>
+        <w:shd w:fill="F4F4F4" w:val="clear"/>
+      </w:pPr>
+      <w:r>
+        <w:t xml:space="preserve">  ]</w:t>
+      </w:r>
+    </w:p>
+    <w:p>
+      <w:pPr>
+        <w:pStyle w:val="Code"/>
+        <w:shd w:fill="F4F4F4" w:val="clear"/>
+      </w:pPr>
+      <w:r>
+        <w:t>}</w:t>
+      </w:r>
+    </w:p>
+    <w:p>
       <w:pPr>
         <w:pStyle w:val="Heading3"/>
       </w:pPr>
@@ -11464,6 +13064,74 @@
     <w:p>
       <w:r>
         <w:t>Generador: generate-cuadro-medico-specs.mjs. Consumido por: api/centro.js + create-aem-pages.mjs + refresh-eds-pages.mjs --centros.</w:t>
+      </w:r>
+    </w:p>
+    <w:p>
+      <w:r>
+        <w:t>Ejemplo de entrada real:</w:t>
+      </w:r>
+    </w:p>
+    <w:p>
+      <w:pPr>
+        <w:pStyle w:val="Code"/>
+        <w:shd w:fill="F4F4F4" w:val="clear"/>
+      </w:pPr>
+      <w:r>
+        <w:t>jq '.["hospital-universitario-hla-moncloa"]' data/cuadro-medico/centros-index.json</w:t>
+      </w:r>
+    </w:p>
+    <w:p>
+      <w:pPr>
+        <w:pStyle w:val="Code"/>
+        <w:shd w:fill="F4F4F4" w:val="clear"/>
+      </w:pPr>
+      <w:r>
+        <w:t xml:space="preserve"> </w:t>
+      </w:r>
+    </w:p>
+    <w:p>
+      <w:pPr>
+        <w:pStyle w:val="Code"/>
+        <w:shd w:fill="F4F4F4" w:val="clear"/>
+      </w:pPr>
+      <w:r>
+        <w:t>{</w:t>
+      </w:r>
+    </w:p>
+    <w:p>
+      <w:pPr>
+        <w:pStyle w:val="Code"/>
+        <w:shd w:fill="F4F4F4" w:val="clear"/>
+      </w:pPr>
+      <w:r>
+        <w:t xml:space="preserve">  "providerLocalicationCode": 1496101,</w:t>
+      </w:r>
+    </w:p>
+    <w:p>
+      <w:pPr>
+        <w:pStyle w:val="Code"/>
+        <w:shd w:fill="F4F4F4" w:val="clear"/>
+      </w:pPr>
+      <w:r>
+        <w:t xml:space="preserve">  "name": "HOSPITAL UNIVERSITARIO HLA MONCLOA",</w:t>
+      </w:r>
+    </w:p>
+    <w:p>
+      <w:pPr>
+        <w:pStyle w:val="Code"/>
+        <w:shd w:fill="F4F4F4" w:val="clear"/>
+      </w:pPr>
+      <w:r>
+        <w:t xml:space="preserve">  "provinceSlug": "madrid"</w:t>
+      </w:r>
+    </w:p>
+    <w:p>
+      <w:pPr>
+        <w:pStyle w:val="Code"/>
+        <w:shd w:fill="F4F4F4" w:val="clear"/>
+      </w:pPr>
+      <w:r>
+        <w:t>}</w:t>
       </w:r>
     </w:p>
     <w:p>
@@ -13407,6 +15075,128 @@
       </w:r>
     </w:p>
     <w:p>
+      <w:r>
+        <w:t>Ejemplos de invocación:</w:t>
+      </w:r>
+    </w:p>
+    <w:p>
+      <w:pPr>
+        <w:pStyle w:val="Code"/>
+        <w:shd w:fill="F4F4F4" w:val="clear"/>
+      </w:pPr>
+      <w:r>
+        <w:t># Regeneración completa (~50 min, respeta caché del repo)</w:t>
+      </w:r>
+    </w:p>
+    <w:p>
+      <w:pPr>
+        <w:pStyle w:val="Code"/>
+        <w:shd w:fill="F4F4F4" w:val="clear"/>
+      </w:pPr>
+      <w:r>
+        <w:t>node generate-providers-data.mjs</w:t>
+      </w:r>
+    </w:p>
+    <w:p>
+      <w:pPr>
+        <w:pStyle w:val="Code"/>
+        <w:shd w:fill="F4F4F4" w:val="clear"/>
+      </w:pPr>
+      <w:r>
+        <w:t xml:space="preserve"> </w:t>
+      </w:r>
+    </w:p>
+    <w:p>
+      <w:pPr>
+        <w:pStyle w:val="Code"/>
+        <w:shd w:fill="F4F4F4" w:val="clear"/>
+      </w:pPr>
+      <w:r>
+        <w:t># Forzar redownload aunque exista caché en repo</w:t>
+      </w:r>
+    </w:p>
+    <w:p>
+      <w:pPr>
+        <w:pStyle w:val="Code"/>
+        <w:shd w:fill="F4F4F4" w:val="clear"/>
+      </w:pPr>
+      <w:r>
+        <w:t>FORCE=true node generate-providers-data.mjs</w:t>
+      </w:r>
+    </w:p>
+    <w:p>
+      <w:pPr>
+        <w:pStyle w:val="Code"/>
+        <w:shd w:fill="F4F4F4" w:val="clear"/>
+      </w:pPr>
+      <w:r>
+        <w:t xml:space="preserve"> </w:t>
+      </w:r>
+    </w:p>
+    <w:p>
+      <w:pPr>
+        <w:pStyle w:val="Code"/>
+        <w:shd w:fill="F4F4F4" w:val="clear"/>
+      </w:pPr>
+      <w:r>
+        <w:t># Solo Madrid (debug rápido, ~3 min)</w:t>
+      </w:r>
+    </w:p>
+    <w:p>
+      <w:pPr>
+        <w:pStyle w:val="Code"/>
+        <w:shd w:fill="F4F4F4" w:val="clear"/>
+      </w:pPr>
+      <w:r>
+        <w:t>PROVINCE_CODE=28 node generate-providers-data.mjs</w:t>
+      </w:r>
+    </w:p>
+    <w:p>
+      <w:pPr>
+        <w:pStyle w:val="Code"/>
+        <w:shd w:fill="F4F4F4" w:val="clear"/>
+      </w:pPr>
+      <w:r>
+        <w:t xml:space="preserve"> </w:t>
+      </w:r>
+    </w:p>
+    <w:p>
+      <w:pPr>
+        <w:pStyle w:val="Code"/>
+        <w:shd w:fill="F4F4F4" w:val="clear"/>
+      </w:pPr>
+      <w:r>
+        <w:t># Output típico:</w:t>
+      </w:r>
+    </w:p>
+    <w:p>
+      <w:pPr>
+        <w:pStyle w:val="Code"/>
+        <w:shd w:fill="F4F4F4" w:val="clear"/>
+      </w:pPr>
+      <w:r>
+        <w:t>#   ✓ madrid · alergologia: 47 providers</w:t>
+      </w:r>
+    </w:p>
+    <w:p>
+      <w:pPr>
+        <w:pStyle w:val="Code"/>
+        <w:shd w:fill="F4F4F4" w:val="clear"/>
+      </w:pPr>
+      <w:r>
+        <w:t>#   ✓ madrid · cardiologia: 381 providers</w:t>
+      </w:r>
+    </w:p>
+    <w:p>
+      <w:pPr>
+        <w:pStyle w:val="Code"/>
+        <w:shd w:fill="F4F4F4" w:val="clear"/>
+      </w:pPr>
+      <w:r>
+        <w:t>#   ✗ [TIMEOUT] barcelona · psicologia (continúa)</w:t>
+      </w:r>
+    </w:p>
+    <w:p>
       <w:pPr>
         <w:pStyle w:val="Heading3"/>
       </w:pPr>
@@ -13481,6 +15271,101 @@
       </w:r>
     </w:p>
     <w:p>
+      <w:r>
+        <w:t>Ejemplos:</w:t>
+      </w:r>
+    </w:p>
+    <w:p>
+      <w:pPr>
+        <w:pStyle w:val="Code"/>
+        <w:shd w:fill="F4F4F4" w:val="clear"/>
+      </w:pPr>
+      <w:r>
+        <w:t># Modo normal (respeta caché de provider-details/)</w:t>
+      </w:r>
+    </w:p>
+    <w:p>
+      <w:pPr>
+        <w:pStyle w:val="Code"/>
+        <w:shd w:fill="F4F4F4" w:val="clear"/>
+      </w:pPr>
+      <w:r>
+        <w:t>node generate-provider-details.mjs</w:t>
+      </w:r>
+    </w:p>
+    <w:p>
+      <w:pPr>
+        <w:pStyle w:val="Code"/>
+        <w:shd w:fill="F4F4F4" w:val="clear"/>
+      </w:pPr>
+      <w:r>
+        <w:t>#   → reutiliza 30.000+ ficheros existentes; descarga solo los nuevos</w:t>
+      </w:r>
+    </w:p>
+    <w:p>
+      <w:pPr>
+        <w:pStyle w:val="Code"/>
+        <w:shd w:fill="F4F4F4" w:val="clear"/>
+      </w:pPr>
+      <w:r>
+        <w:t xml:space="preserve"> </w:t>
+      </w:r>
+    </w:p>
+    <w:p>
+      <w:pPr>
+        <w:pStyle w:val="Code"/>
+        <w:shd w:fill="F4F4F4" w:val="clear"/>
+      </w:pPr>
+      <w:r>
+        <w:t># Forzar redownload completo (~3 horas, ~33k requests)</w:t>
+      </w:r>
+    </w:p>
+    <w:p>
+      <w:pPr>
+        <w:pStyle w:val="Code"/>
+        <w:shd w:fill="F4F4F4" w:val="clear"/>
+      </w:pPr>
+      <w:r>
+        <w:t>FORCE=true node generate-provider-details.mjs</w:t>
+      </w:r>
+    </w:p>
+    <w:p>
+      <w:pPr>
+        <w:pStyle w:val="Code"/>
+        <w:shd w:fill="F4F4F4" w:val="clear"/>
+      </w:pPr>
+      <w:r>
+        <w:t xml:space="preserve"> </w:t>
+      </w:r>
+    </w:p>
+    <w:p>
+      <w:pPr>
+        <w:pStyle w:val="Code"/>
+        <w:shd w:fill="F4F4F4" w:val="clear"/>
+      </w:pPr>
+      <w:r>
+        <w:t># Output típico:</w:t>
+      </w:r>
+    </w:p>
+    <w:p>
+      <w:pPr>
+        <w:pStyle w:val="Code"/>
+        <w:shd w:fill="F4F4F4" w:val="clear"/>
+      </w:pPr>
+      <w:r>
+        <w:t>#   procesando (10/33058): 1234567 [werenitzky-jose-282874657]</w:t>
+      </w:r>
+    </w:p>
+    <w:p>
+      <w:pPr>
+        <w:pStyle w:val="Code"/>
+        <w:shd w:fill="F4F4F4" w:val="clear"/>
+      </w:pPr>
+      <w:r>
+        <w:t>#   ✓ cached: 28145 · descargados: 4500 · errores: 413</w:t>
+      </w:r>
+    </w:p>
+    <w:p>
       <w:pPr>
         <w:pStyle w:val="Heading3"/>
       </w:pPr>
@@ -13583,6 +15468,110 @@
       </w:r>
     </w:p>
     <w:p>
+      <w:r>
+        <w:t>Ejemplos:</w:t>
+      </w:r>
+    </w:p>
+    <w:p>
+      <w:pPr>
+        <w:pStyle w:val="Code"/>
+        <w:shd w:fill="F4F4F4" w:val="clear"/>
+      </w:pPr>
+      <w:r>
+        <w:t># Genera todos los índices (~2 min, sin red)</w:t>
+      </w:r>
+    </w:p>
+    <w:p>
+      <w:pPr>
+        <w:pStyle w:val="Code"/>
+        <w:shd w:fill="F4F4F4" w:val="clear"/>
+      </w:pPr>
+      <w:r>
+        <w:t>node generate-cuadro-medico-specs.mjs</w:t>
+      </w:r>
+    </w:p>
+    <w:p>
+      <w:pPr>
+        <w:pStyle w:val="Code"/>
+        <w:shd w:fill="F4F4F4" w:val="clear"/>
+      </w:pPr>
+      <w:r>
+        <w:t xml:space="preserve"> </w:t>
+      </w:r>
+    </w:p>
+    <w:p>
+      <w:pPr>
+        <w:pStyle w:val="Code"/>
+        <w:shd w:fill="F4F4F4" w:val="clear"/>
+      </w:pPr>
+      <w:r>
+        <w:t># Solo para una provincia</w:t>
+      </w:r>
+    </w:p>
+    <w:p>
+      <w:pPr>
+        <w:pStyle w:val="Code"/>
+        <w:shd w:fill="F4F4F4" w:val="clear"/>
+      </w:pPr>
+      <w:r>
+        <w:t>PROVINCE_SLUG=madrid node generate-cuadro-medico-specs.mjs</w:t>
+      </w:r>
+    </w:p>
+    <w:p>
+      <w:pPr>
+        <w:pStyle w:val="Code"/>
+        <w:shd w:fill="F4F4F4" w:val="clear"/>
+      </w:pPr>
+      <w:r>
+        <w:t xml:space="preserve"> </w:t>
+      </w:r>
+    </w:p>
+    <w:p>
+      <w:pPr>
+        <w:pStyle w:val="Code"/>
+        <w:shd w:fill="F4F4F4" w:val="clear"/>
+      </w:pPr>
+      <w:r>
+        <w:t># Output:</w:t>
+      </w:r>
+    </w:p>
+    <w:p>
+      <w:pPr>
+        <w:pStyle w:val="Code"/>
+        <w:shd w:fill="F4F4F4" w:val="clear"/>
+      </w:pPr>
+      <w:r>
+        <w:t>#   ✓ provincia: 52 procesadas</w:t>
+      </w:r>
+    </w:p>
+    <w:p>
+      <w:pPr>
+        <w:pStyle w:val="Code"/>
+        <w:shd w:fill="F4F4F4" w:val="clear"/>
+      </w:pPr>
+      <w:r>
+        <w:t>#   ✓ especialidades: 181 procesadas</w:t>
+      </w:r>
+    </w:p>
+    <w:p>
+      <w:pPr>
+        <w:pStyle w:val="Code"/>
+        <w:shd w:fill="F4F4F4" w:val="clear"/>
+      </w:pPr>
+      <w:r>
+        <w:t>#   ✓ doctores-index.json: 20567 entries</w:t>
+      </w:r>
+    </w:p>
+    <w:p>
+      <w:pPr>
+        <w:pStyle w:val="Code"/>
+        <w:shd w:fill="F4F4F4" w:val="clear"/>
+      </w:pPr>
+      <w:r>
+        <w:t>#   ✓ centros-index.json: 6505 entries</w:t>
+      </w:r>
+    </w:p>
+    <w:p>
       <w:pPr>
         <w:pStyle w:val="Heading3"/>
       </w:pPr>
@@ -13784,6 +15773,155 @@
       </w:r>
     </w:p>
     <w:p>
+      <w:r>
+        <w:t>Ejemplos:</w:t>
+      </w:r>
+    </w:p>
+    <w:p>
+      <w:pPr>
+        <w:pStyle w:val="Code"/>
+        <w:shd w:fill="F4F4F4" w:val="clear"/>
+      </w:pPr>
+      <w:r>
+        <w:t>export AEM_TOKEN="login:eyJhbGciOi..."  # obtener desde devtools/cookies</w:t>
+      </w:r>
+    </w:p>
+    <w:p>
+      <w:pPr>
+        <w:pStyle w:val="Code"/>
+        <w:shd w:fill="F4F4F4" w:val="clear"/>
+      </w:pPr>
+      <w:r>
+        <w:t xml:space="preserve"> </w:t>
+      </w:r>
+    </w:p>
+    <w:p>
+      <w:pPr>
+        <w:pStyle w:val="Code"/>
+        <w:shd w:fill="F4F4F4" w:val="clear"/>
+      </w:pPr>
+      <w:r>
+        <w:t># Crear/publicar TODAS las páginas (provincias + specs + doctores +</w:t>
+      </w:r>
+    </w:p>
+    <w:p>
+      <w:pPr>
+        <w:pStyle w:val="Code"/>
+        <w:shd w:fill="F4F4F4" w:val="clear"/>
+      </w:pPr>
+      <w:r>
+        <w:t># centros + especialidades). Tarda ~6-8 horas con concurrencia 5.</w:t>
+      </w:r>
+    </w:p>
+    <w:p>
+      <w:pPr>
+        <w:pStyle w:val="Code"/>
+        <w:shd w:fill="F4F4F4" w:val="clear"/>
+      </w:pPr>
+      <w:r>
+        <w:t>node create-aem-pages.mjs --all</w:t>
+      </w:r>
+    </w:p>
+    <w:p>
+      <w:pPr>
+        <w:pStyle w:val="Code"/>
+        <w:shd w:fill="F4F4F4" w:val="clear"/>
+      </w:pPr>
+      <w:r>
+        <w:t xml:space="preserve"> </w:t>
+      </w:r>
+    </w:p>
+    <w:p>
+      <w:pPr>
+        <w:pStyle w:val="Code"/>
+        <w:shd w:fill="F4F4F4" w:val="clear"/>
+      </w:pPr>
+      <w:r>
+        <w:t># Solo provincias + provincia+spec (52 + ~3.250 páginas)</w:t>
+      </w:r>
+    </w:p>
+    <w:p>
+      <w:pPr>
+        <w:pStyle w:val="Code"/>
+        <w:shd w:fill="F4F4F4" w:val="clear"/>
+      </w:pPr>
+      <w:r>
+        <w:t>node create-aem-pages.mjs --provincias</w:t>
+      </w:r>
+    </w:p>
+    <w:p>
+      <w:pPr>
+        <w:pStyle w:val="Code"/>
+        <w:shd w:fill="F4F4F4" w:val="clear"/>
+      </w:pPr>
+      <w:r>
+        <w:t xml:space="preserve"> </w:t>
+      </w:r>
+    </w:p>
+    <w:p>
+      <w:pPr>
+        <w:pStyle w:val="Code"/>
+        <w:shd w:fill="F4F4F4" w:val="clear"/>
+      </w:pPr>
+      <w:r>
+        <w:t># Solo doctores (~20.500 páginas)</w:t>
+      </w:r>
+    </w:p>
+    <w:p>
+      <w:pPr>
+        <w:pStyle w:val="Code"/>
+        <w:shd w:fill="F4F4F4" w:val="clear"/>
+      </w:pPr>
+      <w:r>
+        <w:t>node create-aem-pages.mjs --doctores</w:t>
+      </w:r>
+    </w:p>
+    <w:p>
+      <w:pPr>
+        <w:pStyle w:val="Code"/>
+        <w:shd w:fill="F4F4F4" w:val="clear"/>
+      </w:pPr>
+      <w:r>
+        <w:t xml:space="preserve"> </w:t>
+      </w:r>
+    </w:p>
+    <w:p>
+      <w:pPr>
+        <w:pStyle w:val="Code"/>
+        <w:shd w:fill="F4F4F4" w:val="clear"/>
+      </w:pPr>
+      <w:r>
+        <w:t># Output:</w:t>
+      </w:r>
+    </w:p>
+    <w:p>
+      <w:pPr>
+        <w:pStyle w:val="Code"/>
+        <w:shd w:fill="F4F4F4" w:val="clear"/>
+      </w:pPr>
+      <w:r>
+        <w:t>#   OK /cuadro-medico/p/madrid</w:t>
+      </w:r>
+    </w:p>
+    <w:p>
+      <w:pPr>
+        <w:pStyle w:val="Code"/>
+        <w:shd w:fill="F4F4F4" w:val="clear"/>
+      </w:pPr>
+      <w:r>
+        <w:t>#   OK /cuadro-medico/p/barcelona</w:t>
+      </w:r>
+    </w:p>
+    <w:p>
+      <w:pPr>
+        <w:pStyle w:val="Code"/>
+        <w:shd w:fill="F4F4F4" w:val="clear"/>
+      </w:pPr>
+      <w:r>
+        <w:t>#   FAIL copy /content/site-pc/cuadro-medico/d/&lt;slug&gt; (OAK lock)</w:t>
+      </w:r>
+    </w:p>
+    <w:p>
       <w:pPr>
         <w:pStyle w:val="Heading3"/>
       </w:pPr>
@@ -13984,6 +16122,209 @@
       </w:pPr>
       <w:r>
         <w:t>--reindex (todo): ~40 min.</w:t>
+      </w:r>
+    </w:p>
+    <w:p>
+      <w:r>
+        <w:t>Ejemplos:</w:t>
+      </w:r>
+    </w:p>
+    <w:p>
+      <w:pPr>
+        <w:pStyle w:val="Code"/>
+        <w:shd w:fill="F4F4F4" w:val="clear"/>
+      </w:pPr>
+      <w:r>
+        <w:t># Refresco completo (todos los tipos + code + sitemaps), ~40-45 min</w:t>
+      </w:r>
+    </w:p>
+    <w:p>
+      <w:pPr>
+        <w:pStyle w:val="Code"/>
+        <w:shd w:fill="F4F4F4" w:val="clear"/>
+      </w:pPr>
+      <w:r>
+        <w:t>node refresh-eds-pages.mjs</w:t>
+      </w:r>
+    </w:p>
+    <w:p>
+      <w:pPr>
+        <w:pStyle w:val="Code"/>
+        <w:shd w:fill="F4F4F4" w:val="clear"/>
+      </w:pPr>
+      <w:r>
+        <w:t xml:space="preserve"> </w:t>
+      </w:r>
+    </w:p>
+    <w:p>
+      <w:pPr>
+        <w:pStyle w:val="Code"/>
+        <w:shd w:fill="F4F4F4" w:val="clear"/>
+      </w:pPr>
+      <w:r>
+        <w:t># Solo el bus de código (tras commitear cambios en blocks/, scripts/,</w:t>
+      </w:r>
+    </w:p>
+    <w:p>
+      <w:pPr>
+        <w:pStyle w:val="Code"/>
+        <w:shd w:fill="F4F4F4" w:val="clear"/>
+      </w:pPr>
+      <w:r>
+        <w:t># styles/, head.html, helix-*.yaml)</w:t>
+      </w:r>
+    </w:p>
+    <w:p>
+      <w:pPr>
+        <w:pStyle w:val="Code"/>
+        <w:shd w:fill="F4F4F4" w:val="clear"/>
+      </w:pPr>
+      <w:r>
+        <w:t>node refresh-eds-pages.mjs --code</w:t>
+      </w:r>
+    </w:p>
+    <w:p>
+      <w:pPr>
+        <w:pStyle w:val="Code"/>
+        <w:shd w:fill="F4F4F4" w:val="clear"/>
+      </w:pPr>
+      <w:r>
+        <w:t xml:space="preserve"> </w:t>
+      </w:r>
+    </w:p>
+    <w:p>
+      <w:pPr>
+        <w:pStyle w:val="Code"/>
+        <w:shd w:fill="F4F4F4" w:val="clear"/>
+      </w:pPr>
+      <w:r>
+        <w:t># Solo una provincia + sus combos provincia+especialidad</w:t>
+      </w:r>
+    </w:p>
+    <w:p>
+      <w:pPr>
+        <w:pStyle w:val="Code"/>
+        <w:shd w:fill="F4F4F4" w:val="clear"/>
+      </w:pPr>
+      <w:r>
+        <w:t>node refresh-eds-pages.mjs --province=madrid</w:t>
+      </w:r>
+    </w:p>
+    <w:p>
+      <w:pPr>
+        <w:pStyle w:val="Code"/>
+        <w:shd w:fill="F4F4F4" w:val="clear"/>
+      </w:pPr>
+      <w:r>
+        <w:t xml:space="preserve"> </w:t>
+      </w:r>
+    </w:p>
+    <w:p>
+      <w:pPr>
+        <w:pStyle w:val="Code"/>
+        <w:shd w:fill="F4F4F4" w:val="clear"/>
+      </w:pPr>
+      <w:r>
+        <w:t># Solo los 6 sitemaps</w:t>
+      </w:r>
+    </w:p>
+    <w:p>
+      <w:pPr>
+        <w:pStyle w:val="Code"/>
+        <w:shd w:fill="F4F4F4" w:val="clear"/>
+      </w:pPr>
+      <w:r>
+        <w:t>node refresh-eds-pages.mjs --sitemaps</w:t>
+      </w:r>
+    </w:p>
+    <w:p>
+      <w:pPr>
+        <w:pStyle w:val="Code"/>
+        <w:shd w:fill="F4F4F4" w:val="clear"/>
+      </w:pPr>
+      <w:r>
+        <w:t xml:space="preserve"> </w:t>
+      </w:r>
+    </w:p>
+    <w:p>
+      <w:pPr>
+        <w:pStyle w:val="Code"/>
+        <w:shd w:fill="F4F4F4" w:val="clear"/>
+      </w:pPr>
+      <w:r>
+        <w:t># Repoblar query-indexes tras cambiar helix-query.yaml</w:t>
+      </w:r>
+    </w:p>
+    <w:p>
+      <w:pPr>
+        <w:pStyle w:val="Code"/>
+        <w:shd w:fill="F4F4F4" w:val="clear"/>
+      </w:pPr>
+      <w:r>
+        <w:t>node refresh-eds-pages.mjs --reindex</w:t>
+      </w:r>
+    </w:p>
+    <w:p>
+      <w:pPr>
+        <w:pStyle w:val="Code"/>
+        <w:shd w:fill="F4F4F4" w:val="clear"/>
+      </w:pPr>
+      <w:r>
+        <w:t xml:space="preserve"> </w:t>
+      </w:r>
+    </w:p>
+    <w:p>
+      <w:pPr>
+        <w:pStyle w:val="Code"/>
+        <w:shd w:fill="F4F4F4" w:val="clear"/>
+      </w:pPr>
+      <w:r>
+        <w:t># Output:</w:t>
+      </w:r>
+    </w:p>
+    <w:p>
+      <w:pPr>
+        <w:pStyle w:val="Code"/>
+        <w:shd w:fill="F4F4F4" w:val="clear"/>
+      </w:pPr>
+      <w:r>
+        <w:t>#   refresh code: 200</w:t>
+      </w:r>
+    </w:p>
+    <w:p>
+      <w:pPr>
+        <w:pStyle w:val="Code"/>
+        <w:shd w:fill="F4F4F4" w:val="clear"/>
+      </w:pPr>
+      <w:r>
+        <w:t>#   refreshing 52 provincias...</w:t>
+      </w:r>
+    </w:p>
+    <w:p>
+      <w:pPr>
+        <w:pStyle w:val="Code"/>
+        <w:shd w:fill="F4F4F4" w:val="clear"/>
+      </w:pPr>
+      <w:r>
+        <w:t>#   preview /cuadro-medico/p/a-coruna: 200, live: 200</w:t>
+      </w:r>
+    </w:p>
+    <w:p>
+      <w:pPr>
+        <w:pStyle w:val="Code"/>
+        <w:shd w:fill="F4F4F4" w:val="clear"/>
+      </w:pPr>
+      <w:r>
+        <w:t>#   preview /cuadro-medico/p/alava: 200, live: 200</w:t>
+      </w:r>
+    </w:p>
+    <w:p>
+      <w:pPr>
+        <w:pStyle w:val="Code"/>
+        <w:shd w:fill="F4F4F4" w:val="clear"/>
+      </w:pPr>
+      <w:r>
+        <w:t>#   ...</w:t>
       </w:r>
     </w:p>
     <w:p>

</xml_diff>

<commit_message>
chore(cleanup): drop models/, boilerplate docs, customize README
More boilerplate removed (round 3):

- models/ (9 files: _button.json, _image.json, _page.json, _section.json,
  _text.json, _title.json, _component-definition.json,
  _component-filters.json, _component-models.json) — vestigial. The
  root component-*.json files have everything inlined; they don't
  reference models/ via $ref. Removed wholesale.
- CONTRIBUTING.md — Adobe Project Helix boilerplate, not relevant.
- CODE_OF_CONDUCT.md — Adobe boilerplate, not relevant.

LICENSE kept (Apache 2.0 compliance — code derives from the aem-
boilerplate).

README.md rewritten from the placeholder "Your Project's Title..."
to a real project README: stack, environments, doc pointers, and
quick-reference operation commands.

Doc generator updated to drop the models/_*.json mention from §3.3.

Co-Authored-By: Claude Opus 4.7 <noreply@anthropic.com>
</commit_message>
<xml_diff>
--- a/docs/traspaso-conocimiento.docx
+++ b/docs/traspaso-conocimiento.docx
@@ -2685,28 +2685,6 @@
           <w:p>
             <w:r>
               <w:t>Esquema de campos editables por componente.</w:t>
-            </w:r>
-          </w:p>
-        </w:tc>
-      </w:tr>
-      <w:tr>
-        <w:tc>
-          <w:tcPr>
-            <w:tcW w:type="dxa" w:w="2880"/>
-          </w:tcPr>
-          <w:p>
-            <w:r>
-              <w:t>models/_*.json</w:t>
-            </w:r>
-          </w:p>
-        </w:tc>
-        <w:tc>
-          <w:tcPr>
-            <w:tcW w:type="dxa" w:w="6480"/>
-          </w:tcPr>
-          <w:p>
-            <w:r>
-              <w:t>Fragmentos modulares de las definiciones globales.</w:t>
             </w:r>
           </w:p>
         </w:tc>

</xml_diff>